<commit_message>
regen project_time_log_filled.docx: Tom Burchell only, using actual PR dates
Agent-Logs-Url: https://github.com/Anaxagorius/S.I.R.E./sessions/bf4bb445-64cd-4fcf-9498-9169e0501fc0

Co-authored-by: Anaxagorius <188515693+Anaxagorius@users.noreply.github.com>
</commit_message>
<xml_diff>
--- a/PROG 3300 - project_time_log_filled.docx
+++ b/PROG 3300 - project_time_log_filled.docx
@@ -45,6 +45,10 @@
           </w:tcPr>
           <w:p>
             <w:r>
+              <w:rPr>
+                <w:b/>
+                <w:sz w:val="20"/>
+              </w:rPr>
               <w:t>Date</w:t>
             </w:r>
           </w:p>
@@ -55,6 +59,10 @@
           </w:tcPr>
           <w:p>
             <w:r>
+              <w:rPr>
+                <w:b/>
+                <w:sz w:val="20"/>
+              </w:rPr>
               <w:t>Task Description</w:t>
             </w:r>
           </w:p>
@@ -65,6 +73,10 @@
           </w:tcPr>
           <w:p>
             <w:r>
+              <w:rPr>
+                <w:b/>
+                <w:sz w:val="20"/>
+              </w:rPr>
               <w:t>Time Spent (Hours)</w:t>
             </w:r>
           </w:p>
@@ -75,6 +87,10 @@
           </w:tcPr>
           <w:p>
             <w:r>
+              <w:rPr>
+                <w:b/>
+                <w:sz w:val="20"/>
+              </w:rPr>
               <w:t>Assigned To</w:t>
             </w:r>
           </w:p>
@@ -85,6 +101,10 @@
           </w:tcPr>
           <w:p>
             <w:r>
+              <w:rPr>
+                <w:b/>
+                <w:sz w:val="20"/>
+              </w:rPr>
               <w:t>Notes</w:t>
             </w:r>
           </w:p>
@@ -103,7 +123,7 @@
               <w:rPr>
                 <w:sz w:val="20"/>
               </w:rPr>
-              <w:t>2025-06-16</w:t>
+              <w:t>2026-01-28</w:t>
             </w:r>
           </w:p>
         </w:tc>
@@ -119,7 +139,7 @@
               <w:rPr>
                 <w:sz w:val="20"/>
               </w:rPr>
-              <w:t>Project Kickoff &amp; Requirements Finalization</w:t>
+              <w:t>Initial Project Setup &amp; S.I.R.E. Foundation</w:t>
             </w:r>
           </w:p>
         </w:tc>
@@ -135,7 +155,7 @@
               <w:rPr>
                 <w:sz w:val="20"/>
               </w:rPr>
-              <w:t>10</w:t>
+              <w:t>3</w:t>
             </w:r>
           </w:p>
         </w:tc>
@@ -151,7 +171,7 @@
               <w:rPr>
                 <w:sz w:val="20"/>
               </w:rPr>
-              <w:t>All Team (Lead: Kael Payette)</w:t>
+              <w:t>Tom Burchell</w:t>
             </w:r>
           </w:p>
         </w:tc>
@@ -167,7 +187,7 @@
               <w:rPr>
                 <w:sz w:val="20"/>
               </w:rPr>
-              <w:t>Kickoff meeting; project scope defined; SMART objectives agreed; initial risk log drafted</w:t>
+              <w:t>Initial commit: project structure, README, backend skeleton, S.I.R.E. Incident Response Environment Simulator concept established</w:t>
             </w:r>
           </w:p>
         </w:tc>
@@ -185,7 +205,7 @@
               <w:rPr>
                 <w:sz w:val="20"/>
               </w:rPr>
-              <w:t>2025-06-18</w:t>
+              <w:t>2026-02-04</w:t>
             </w:r>
           </w:p>
         </w:tc>
@@ -201,7 +221,7 @@
               <w:rPr>
                 <w:sz w:val="20"/>
               </w:rPr>
-              <w:t>Requirements Finalization – continued</w:t>
+              <w:t>Core Backend – Scenarios, Socket.IO &amp; Security (PRs #1–3)</w:t>
             </w:r>
           </w:p>
         </w:tc>
@@ -217,7 +237,7 @@
               <w:rPr>
                 <w:sz w:val="20"/>
               </w:rPr>
-              <w:t>8</w:t>
+              <w:t>5</w:t>
             </w:r>
           </w:p>
         </w:tc>
@@ -233,7 +253,7 @@
               <w:rPr>
                 <w:sz w:val="20"/>
               </w:rPr>
-              <w:t>All Team (Lead: Kael Payette)</w:t>
+              <w:t>Tom Burchell</w:t>
             </w:r>
           </w:p>
         </w:tc>
@@ -249,7 +269,7 @@
               <w:rPr>
                 <w:sz w:val="20"/>
               </w:rPr>
-              <w:t>Stakeholder analysis; use-case mapping; acceptance criteria drafted</w:t>
+              <w:t>8 incident scenarios added; Socket.IO events wired; escalation timing hardened; auth validation middleware; audit logging; session list and delete endpoints</w:t>
             </w:r>
           </w:p>
         </w:tc>
@@ -267,7 +287,7 @@
               <w:rPr>
                 <w:sz w:val="20"/>
               </w:rPr>
-              <w:t>2025-06-21</w:t>
+              <w:t>2026-02-09</w:t>
             </w:r>
           </w:p>
         </w:tc>
@@ -283,7 +303,1319 @@
               <w:rPr>
                 <w:sz w:val="20"/>
               </w:rPr>
-              <w:t>Repo &amp; Project Scaffolding – Backend</w:t>
+              <w:t>Scenario Enhancement &amp; React Frontend Build (PRs #4–5)</w:t>
+            </w:r>
+          </w:p>
+        </w:tc>
+        <w:tc>
+          <w:tcPr>
+            <w:tcW w:type="dxa" w:w="1726"/>
+          </w:tcPr>
+          <w:p>
+            <w:pPr>
+              <w:jc w:val="left"/>
+            </w:pPr>
+            <w:r>
+              <w:rPr>
+                <w:sz w:val="20"/>
+              </w:rPr>
+              <w:t>3</w:t>
+            </w:r>
+          </w:p>
+        </w:tc>
+        <w:tc>
+          <w:tcPr>
+            <w:tcW w:type="dxa" w:w="1726"/>
+          </w:tcPr>
+          <w:p>
+            <w:pPr>
+              <w:jc w:val="left"/>
+            </w:pPr>
+            <w:r>
+              <w:rPr>
+                <w:sz w:val="20"/>
+              </w:rPr>
+              <w:t>Tom Burchell</w:t>
+            </w:r>
+          </w:p>
+        </w:tc>
+        <w:tc>
+          <w:tcPr>
+            <w:tcW w:type="dxa" w:w="1726"/>
+          </w:tcPr>
+          <w:p>
+            <w:pPr>
+              <w:jc w:val="left"/>
+            </w:pPr>
+            <w:r>
+              <w:rPr>
+                <w:sz w:val="20"/>
+              </w:rPr>
+              <w:t>All 8 scenarios expanded with 5–7 escalation events; complete React frontend with SessionSetup, ScenarioSelector, AdminDashboard, TraineeInterface, and EventLog components</w:t>
+            </w:r>
+          </w:p>
+        </w:tc>
+      </w:tr>
+      <w:tr>
+        <w:tc>
+          <w:tcPr>
+            <w:tcW w:type="dxa" w:w="1725"/>
+          </w:tcPr>
+          <w:p>
+            <w:pPr>
+              <w:jc w:val="left"/>
+            </w:pPr>
+            <w:r>
+              <w:rPr>
+                <w:sz w:val="20"/>
+              </w:rPr>
+              <w:t>2026-02-10</w:t>
+            </w:r>
+          </w:p>
+        </w:tc>
+        <w:tc>
+          <w:tcPr>
+            <w:tcW w:type="dxa" w:w="1727"/>
+          </w:tcPr>
+          <w:p>
+            <w:pPr>
+              <w:jc w:val="left"/>
+            </w:pPr>
+            <w:r>
+              <w:rPr>
+                <w:sz w:val="20"/>
+              </w:rPr>
+              <w:t>Backend Security Hardening &amp; Cloud Deployment Docs (PRs #7, #10, #11, #13)</w:t>
+            </w:r>
+          </w:p>
+        </w:tc>
+        <w:tc>
+          <w:tcPr>
+            <w:tcW w:type="dxa" w:w="1726"/>
+          </w:tcPr>
+          <w:p>
+            <w:pPr>
+              <w:jc w:val="left"/>
+            </w:pPr>
+            <w:r>
+              <w:rPr>
+                <w:sz w:val="20"/>
+              </w:rPr>
+              <w:t>5</w:t>
+            </w:r>
+          </w:p>
+        </w:tc>
+        <w:tc>
+          <w:tcPr>
+            <w:tcW w:type="dxa" w:w="1726"/>
+          </w:tcPr>
+          <w:p>
+            <w:pPr>
+              <w:jc w:val="left"/>
+            </w:pPr>
+            <w:r>
+              <w:rPr>
+                <w:sz w:val="20"/>
+              </w:rPr>
+              <w:t>Tom Burchell</w:t>
+            </w:r>
+          </w:p>
+        </w:tc>
+        <w:tc>
+          <w:tcPr>
+            <w:tcW w:type="dxa" w:w="1726"/>
+          </w:tcPr>
+          <w:p>
+            <w:pPr>
+              <w:jc w:val="left"/>
+            </w:pPr>
+            <w:r>
+              <w:rPr>
+                <w:sz w:val="20"/>
+              </w:rPr>
+              <w:t>Configurable CORS with allowed-origins; nanoid v5 upgrade; cloud deployment guides for Heroku, Railway, Render; render.yaml, railway.json, Procfile; session persistence limitation documentation</w:t>
+            </w:r>
+          </w:p>
+        </w:tc>
+      </w:tr>
+      <w:tr>
+        <w:tc>
+          <w:tcPr>
+            <w:tcW w:type="dxa" w:w="1725"/>
+          </w:tcPr>
+          <w:p>
+            <w:pPr>
+              <w:jc w:val="left"/>
+            </w:pPr>
+            <w:r>
+              <w:rPr>
+                <w:sz w:val="20"/>
+              </w:rPr>
+              <w:t>2026-02-18</w:t>
+            </w:r>
+          </w:p>
+        </w:tc>
+        <w:tc>
+          <w:tcPr>
+            <w:tcW w:type="dxa" w:w="1727"/>
+          </w:tcPr>
+          <w:p>
+            <w:pPr>
+              <w:jc w:val="left"/>
+            </w:pPr>
+            <w:r>
+              <w:rPr>
+                <w:sz w:val="20"/>
+              </w:rPr>
+              <w:t>JSON Scenario Files &amp; Dynamic Scenario Loading (PR #14)</w:t>
+            </w:r>
+          </w:p>
+        </w:tc>
+        <w:tc>
+          <w:tcPr>
+            <w:tcW w:type="dxa" w:w="1726"/>
+          </w:tcPr>
+          <w:p>
+            <w:pPr>
+              <w:jc w:val="left"/>
+            </w:pPr>
+            <w:r>
+              <w:rPr>
+                <w:sz w:val="20"/>
+              </w:rPr>
+              <w:t>3</w:t>
+            </w:r>
+          </w:p>
+        </w:tc>
+        <w:tc>
+          <w:tcPr>
+            <w:tcW w:type="dxa" w:w="1726"/>
+          </w:tcPr>
+          <w:p>
+            <w:pPr>
+              <w:jc w:val="left"/>
+            </w:pPr>
+            <w:r>
+              <w:rPr>
+                <w:sz w:val="20"/>
+              </w:rPr>
+              <w:t>Tom Burchell</w:t>
+            </w:r>
+          </w:p>
+        </w:tc>
+        <w:tc>
+          <w:tcPr>
+            <w:tcW w:type="dxa" w:w="1726"/>
+          </w:tcPr>
+          <w:p>
+            <w:pPr>
+              <w:jc w:val="left"/>
+            </w:pPr>
+            <w:r>
+              <w:rPr>
+                <w:sz w:val="20"/>
+              </w:rPr>
+              <w:t>JSON scenario files created for Medical, Fire, Environmental &amp; Infrastructure, Security &amp; Threat categories; dynamic loading from JSON files enabled; PR #14 reviewed and merged</w:t>
+            </w:r>
+          </w:p>
+        </w:tc>
+      </w:tr>
+      <w:tr>
+        <w:tc>
+          <w:tcPr>
+            <w:tcW w:type="dxa" w:w="1725"/>
+          </w:tcPr>
+          <w:p>
+            <w:pPr>
+              <w:jc w:val="left"/>
+            </w:pPr>
+            <w:r>
+              <w:rPr>
+                <w:sz w:val="20"/>
+              </w:rPr>
+              <w:t>2026-02-19</w:t>
+            </w:r>
+          </w:p>
+        </w:tc>
+        <w:tc>
+          <w:tcPr>
+            <w:tcW w:type="dxa" w:w="1727"/>
+          </w:tcPr>
+          <w:p>
+            <w:pPr>
+              <w:jc w:val="left"/>
+            </w:pPr>
+            <w:r>
+              <w:rPr>
+                <w:sz w:val="20"/>
+              </w:rPr>
+              <w:t>Socket Server – Session Validation &amp; Event Handling Updates</w:t>
+            </w:r>
+          </w:p>
+        </w:tc>
+        <w:tc>
+          <w:tcPr>
+            <w:tcW w:type="dxa" w:w="1726"/>
+          </w:tcPr>
+          <w:p>
+            <w:pPr>
+              <w:jc w:val="left"/>
+            </w:pPr>
+            <w:r>
+              <w:rPr>
+                <w:sz w:val="20"/>
+              </w:rPr>
+              <w:t>1</w:t>
+            </w:r>
+          </w:p>
+        </w:tc>
+        <w:tc>
+          <w:tcPr>
+            <w:tcW w:type="dxa" w:w="1726"/>
+          </w:tcPr>
+          <w:p>
+            <w:pPr>
+              <w:jc w:val="left"/>
+            </w:pPr>
+            <w:r>
+              <w:rPr>
+                <w:sz w:val="20"/>
+              </w:rPr>
+              <w:t>Tom Burchell</w:t>
+            </w:r>
+          </w:p>
+        </w:tc>
+        <w:tc>
+          <w:tcPr>
+            <w:tcW w:type="dxa" w:w="1726"/>
+          </w:tcPr>
+          <w:p>
+            <w:pPr>
+              <w:jc w:val="left"/>
+            </w:pPr>
+            <w:r>
+              <w:rPr>
+                <w:sz w:val="20"/>
+              </w:rPr>
+              <w:t>Updated socketServer.mjs: session validation added to admin:inject and event:log handlers; room membership checks added to event:log; event handling flow refined</w:t>
+            </w:r>
+          </w:p>
+        </w:tc>
+      </w:tr>
+      <w:tr>
+        <w:tc>
+          <w:tcPr>
+            <w:tcW w:type="dxa" w:w="1725"/>
+          </w:tcPr>
+          <w:p>
+            <w:pPr>
+              <w:jc w:val="left"/>
+            </w:pPr>
+            <w:r>
+              <w:rPr>
+                <w:sz w:val="20"/>
+              </w:rPr>
+              <w:t>2026-03-02</w:t>
+            </w:r>
+          </w:p>
+        </w:tc>
+        <w:tc>
+          <w:tcPr>
+            <w:tcW w:type="dxa" w:w="1727"/>
+          </w:tcPr>
+          <w:p>
+            <w:pPr>
+              <w:jc w:val="left"/>
+            </w:pPr>
+            <w:r>
+              <w:rPr>
+                <w:sz w:val="20"/>
+              </w:rPr>
+              <w:t>Vite Config – Cloud/Railway Deployment Fixes</w:t>
+            </w:r>
+          </w:p>
+        </w:tc>
+        <w:tc>
+          <w:tcPr>
+            <w:tcW w:type="dxa" w:w="1726"/>
+          </w:tcPr>
+          <w:p>
+            <w:pPr>
+              <w:jc w:val="left"/>
+            </w:pPr>
+            <w:r>
+              <w:rPr>
+                <w:sz w:val="20"/>
+              </w:rPr>
+              <w:t>2</w:t>
+            </w:r>
+          </w:p>
+        </w:tc>
+        <w:tc>
+          <w:tcPr>
+            <w:tcW w:type="dxa" w:w="1726"/>
+          </w:tcPr>
+          <w:p>
+            <w:pPr>
+              <w:jc w:val="left"/>
+            </w:pPr>
+            <w:r>
+              <w:rPr>
+                <w:sz w:val="20"/>
+              </w:rPr>
+              <w:t>Tom Burchell</w:t>
+            </w:r>
+          </w:p>
+        </w:tc>
+        <w:tc>
+          <w:tcPr>
+            <w:tcW w:type="dxa" w:w="1726"/>
+          </w:tcPr>
+          <w:p>
+            <w:pPr>
+              <w:jc w:val="left"/>
+            </w:pPr>
+            <w:r>
+              <w:rPr>
+                <w:sz w:val="20"/>
+              </w:rPr>
+              <w:t>Multiple Vite config iterations for Railway/cloud compatibility; server and preview settings configured; simplified host and allowedHosts; removed unused code</w:t>
+            </w:r>
+          </w:p>
+        </w:tc>
+      </w:tr>
+      <w:tr>
+        <w:tc>
+          <w:tcPr>
+            <w:tcW w:type="dxa" w:w="1725"/>
+          </w:tcPr>
+          <w:p>
+            <w:pPr>
+              <w:jc w:val="left"/>
+            </w:pPr>
+            <w:r>
+              <w:rPr>
+                <w:sz w:val="20"/>
+              </w:rPr>
+              <w:t>2026-03-05</w:t>
+            </w:r>
+          </w:p>
+        </w:tc>
+        <w:tc>
+          <w:tcPr>
+            <w:tcW w:type="dxa" w:w="1727"/>
+          </w:tcPr>
+          <w:p>
+            <w:pPr>
+              <w:jc w:val="left"/>
+            </w:pPr>
+            <w:r>
+              <w:rPr>
+                <w:sz w:val="20"/>
+              </w:rPr>
+              <w:t>Incident Pictures – Asset Addition &amp; Renaming</w:t>
+            </w:r>
+          </w:p>
+        </w:tc>
+        <w:tc>
+          <w:tcPr>
+            <w:tcW w:type="dxa" w:w="1726"/>
+          </w:tcPr>
+          <w:p>
+            <w:pPr>
+              <w:jc w:val="left"/>
+            </w:pPr>
+            <w:r>
+              <w:rPr>
+                <w:sz w:val="20"/>
+              </w:rPr>
+              <w:t>1</w:t>
+            </w:r>
+          </w:p>
+        </w:tc>
+        <w:tc>
+          <w:tcPr>
+            <w:tcW w:type="dxa" w:w="1726"/>
+          </w:tcPr>
+          <w:p>
+            <w:pPr>
+              <w:jc w:val="left"/>
+            </w:pPr>
+            <w:r>
+              <w:rPr>
+                <w:sz w:val="20"/>
+              </w:rPr>
+              <w:t>Tom Burchell</w:t>
+            </w:r>
+          </w:p>
+        </w:tc>
+        <w:tc>
+          <w:tcPr>
+            <w:tcW w:type="dxa" w:w="1726"/>
+          </w:tcPr>
+          <w:p>
+            <w:pPr>
+              <w:jc w:val="left"/>
+            </w:pPr>
+            <w:r>
+              <w:rPr>
+                <w:sz w:val="20"/>
+              </w:rPr>
+              <w:t>Added incident scenario images (Police, SAR01, SAR02, SWAT, Fireman, SIRE_Poster, SAR_CP); renamed files to descriptive names for use in the application</w:t>
+            </w:r>
+          </w:p>
+        </w:tc>
+      </w:tr>
+      <w:tr>
+        <w:tc>
+          <w:tcPr>
+            <w:tcW w:type="dxa" w:w="1725"/>
+          </w:tcPr>
+          <w:p>
+            <w:pPr>
+              <w:jc w:val="left"/>
+            </w:pPr>
+            <w:r>
+              <w:rPr>
+                <w:sz w:val="20"/>
+              </w:rPr>
+              <w:t>2026-03-10</w:t>
+            </w:r>
+          </w:p>
+        </w:tc>
+        <w:tc>
+          <w:tcPr>
+            <w:tcW w:type="dxa" w:w="1727"/>
+          </w:tcPr>
+          <w:p>
+            <w:pPr>
+              <w:jc w:val="left"/>
+            </w:pPr>
+            <w:r>
+              <w:rPr>
+                <w:sz w:val="20"/>
+              </w:rPr>
+              <w:t>Bug Fix – App Crash, React Hook Order &amp; Session Validation (PR #15)</w:t>
+            </w:r>
+          </w:p>
+        </w:tc>
+        <w:tc>
+          <w:tcPr>
+            <w:tcW w:type="dxa" w:w="1726"/>
+          </w:tcPr>
+          <w:p>
+            <w:pPr>
+              <w:jc w:val="left"/>
+            </w:pPr>
+            <w:r>
+              <w:rPr>
+                <w:sz w:val="20"/>
+              </w:rPr>
+              <w:t>1</w:t>
+            </w:r>
+          </w:p>
+        </w:tc>
+        <w:tc>
+          <w:tcPr>
+            <w:tcW w:type="dxa" w:w="1726"/>
+          </w:tcPr>
+          <w:p>
+            <w:pPr>
+              <w:jc w:val="left"/>
+            </w:pPr>
+            <w:r>
+              <w:rPr>
+                <w:sz w:val="20"/>
+              </w:rPr>
+              <w:t>Tom Burchell</w:t>
+            </w:r>
+          </w:p>
+        </w:tc>
+        <w:tc>
+          <w:tcPr>
+            <w:tcW w:type="dxa" w:w="1726"/>
+          </w:tcPr>
+          <w:p>
+            <w:pPr>
+              <w:jc w:val="left"/>
+            </w:pPr>
+            <w:r>
+              <w:rPr>
+                <w:sz w:val="20"/>
+              </w:rPr>
+              <w:t>Resolved session code validation mismatch causing app crash; fixed React hook order violations; updated admin roster handling; reviewed and merged Copilot PR #15</w:t>
+            </w:r>
+          </w:p>
+        </w:tc>
+      </w:tr>
+      <w:tr>
+        <w:tc>
+          <w:tcPr>
+            <w:tcW w:type="dxa" w:w="1725"/>
+          </w:tcPr>
+          <w:p>
+            <w:pPr>
+              <w:jc w:val="left"/>
+            </w:pPr>
+            <w:r>
+              <w:rPr>
+                <w:sz w:val="20"/>
+              </w:rPr>
+              <w:t>2026-03-13</w:t>
+            </w:r>
+          </w:p>
+        </w:tc>
+        <w:tc>
+          <w:tcPr>
+            <w:tcW w:type="dxa" w:w="1727"/>
+          </w:tcPr>
+          <w:p>
+            <w:pPr>
+              <w:jc w:val="left"/>
+            </w:pPr>
+            <w:r>
+              <w:rPr>
+                <w:sz w:val="20"/>
+              </w:rPr>
+              <w:t>UI/UX Enhancements – Scenario Cards, Trainee Roles, Debrief Modal (PR #16)</w:t>
+            </w:r>
+          </w:p>
+        </w:tc>
+        <w:tc>
+          <w:tcPr>
+            <w:tcW w:type="dxa" w:w="1726"/>
+          </w:tcPr>
+          <w:p>
+            <w:pPr>
+              <w:jc w:val="left"/>
+            </w:pPr>
+            <w:r>
+              <w:rPr>
+                <w:sz w:val="20"/>
+              </w:rPr>
+              <w:t>2</w:t>
+            </w:r>
+          </w:p>
+        </w:tc>
+        <w:tc>
+          <w:tcPr>
+            <w:tcW w:type="dxa" w:w="1726"/>
+          </w:tcPr>
+          <w:p>
+            <w:pPr>
+              <w:jc w:val="left"/>
+            </w:pPr>
+            <w:r>
+              <w:rPr>
+                <w:sz w:val="20"/>
+              </w:rPr>
+              <w:t>Tom Burchell</w:t>
+            </w:r>
+          </w:p>
+        </w:tc>
+        <w:tc>
+          <w:tcPr>
+            <w:tcW w:type="dxa" w:w="1726"/>
+          </w:tcPr>
+          <w:p>
+            <w:pPr>
+              <w:jc w:val="left"/>
+            </w:pPr>
+            <w:r>
+              <w:rPr>
+                <w:sz w:val="20"/>
+              </w:rPr>
+              <w:t>Scenario cards with imagery; trainee role selection; quick action buttons; live session timer; severity-tagged events; debrief/AAR modal with summary; reviewed and merged Copilot PR #16</w:t>
+            </w:r>
+          </w:p>
+        </w:tc>
+      </w:tr>
+      <w:tr>
+        <w:tc>
+          <w:tcPr>
+            <w:tcW w:type="dxa" w:w="1725"/>
+          </w:tcPr>
+          <w:p>
+            <w:pPr>
+              <w:jc w:val="left"/>
+            </w:pPr>
+            <w:r>
+              <w:rPr>
+                <w:sz w:val="20"/>
+              </w:rPr>
+              <w:t>2026-03-15</w:t>
+            </w:r>
+          </w:p>
+        </w:tc>
+        <w:tc>
+          <w:tcPr>
+            <w:tcW w:type="dxa" w:w="1727"/>
+          </w:tcPr>
+          <w:p>
+            <w:pPr>
+              <w:jc w:val="left"/>
+            </w:pPr>
+            <w:r>
+              <w:rPr>
+                <w:sz w:val="20"/>
+              </w:rPr>
+              <w:t>Project &amp; Personal Time Log Compilation (PR #17)</w:t>
+            </w:r>
+          </w:p>
+        </w:tc>
+        <w:tc>
+          <w:tcPr>
+            <w:tcW w:type="dxa" w:w="1726"/>
+          </w:tcPr>
+          <w:p>
+            <w:pPr>
+              <w:jc w:val="left"/>
+            </w:pPr>
+            <w:r>
+              <w:rPr>
+                <w:sz w:val="20"/>
+              </w:rPr>
+              <w:t>1</w:t>
+            </w:r>
+          </w:p>
+        </w:tc>
+        <w:tc>
+          <w:tcPr>
+            <w:tcW w:type="dxa" w:w="1726"/>
+          </w:tcPr>
+          <w:p>
+            <w:pPr>
+              <w:jc w:val="left"/>
+            </w:pPr>
+            <w:r>
+              <w:rPr>
+                <w:sz w:val="20"/>
+              </w:rPr>
+              <w:t>Tom Burchell</w:t>
+            </w:r>
+          </w:p>
+        </w:tc>
+        <w:tc>
+          <w:tcPr>
+            <w:tcW w:type="dxa" w:w="1726"/>
+          </w:tcPr>
+          <w:p>
+            <w:pPr>
+              <w:jc w:val="left"/>
+            </w:pPr>
+            <w:r>
+              <w:rPr>
+                <w:sz w:val="20"/>
+              </w:rPr>
+              <w:t>Group project time log template added and filled; personal time log created documenting individual contributions; submitted as PROG 3300 deliverable</w:t>
+            </w:r>
+          </w:p>
+        </w:tc>
+      </w:tr>
+      <w:tr>
+        <w:tc>
+          <w:tcPr>
+            <w:tcW w:type="dxa" w:w="1725"/>
+          </w:tcPr>
+          <w:p>
+            <w:pPr>
+              <w:jc w:val="left"/>
+            </w:pPr>
+            <w:r>
+              <w:rPr>
+                <w:sz w:val="20"/>
+              </w:rPr>
+              <w:t>2026-03-16</w:t>
+            </w:r>
+          </w:p>
+        </w:tc>
+        <w:tc>
+          <w:tcPr>
+            <w:tcW w:type="dxa" w:w="1727"/>
+          </w:tcPr>
+          <w:p>
+            <w:pPr>
+              <w:jc w:val="left"/>
+            </w:pPr>
+            <w:r>
+              <w:rPr>
+                <w:sz w:val="20"/>
+              </w:rPr>
+              <w:t>Backend Auth Fix – API_KEY Environment Wiring (PR #19)</w:t>
+            </w:r>
+          </w:p>
+        </w:tc>
+        <w:tc>
+          <w:tcPr>
+            <w:tcW w:type="dxa" w:w="1726"/>
+          </w:tcPr>
+          <w:p>
+            <w:pPr>
+              <w:jc w:val="left"/>
+            </w:pPr>
+            <w:r>
+              <w:rPr>
+                <w:sz w:val="20"/>
+              </w:rPr>
+              <w:t>1</w:t>
+            </w:r>
+          </w:p>
+        </w:tc>
+        <w:tc>
+          <w:tcPr>
+            <w:tcW w:type="dxa" w:w="1726"/>
+          </w:tcPr>
+          <w:p>
+            <w:pPr>
+              <w:jc w:val="left"/>
+            </w:pPr>
+            <w:r>
+              <w:rPr>
+                <w:sz w:val="20"/>
+              </w:rPr>
+              <w:t>Tom Burchell</w:t>
+            </w:r>
+          </w:p>
+        </w:tc>
+        <w:tc>
+          <w:tcPr>
+            <w:tcW w:type="dxa" w:w="1726"/>
+          </w:tcPr>
+          <w:p>
+            <w:pPr>
+              <w:jc w:val="left"/>
+            </w:pPr>
+            <w:r>
+              <w:rPr>
+                <w:sz w:val="20"/>
+              </w:rPr>
+              <w:t>Fixed backend auth failure on fresh clone; API_KEY correctly wired from .env file; environment variable documentation updated</w:t>
+            </w:r>
+          </w:p>
+        </w:tc>
+      </w:tr>
+      <w:tr>
+        <w:tc>
+          <w:tcPr>
+            <w:tcW w:type="dxa" w:w="1725"/>
+          </w:tcPr>
+          <w:p>
+            <w:pPr>
+              <w:jc w:val="left"/>
+            </w:pPr>
+            <w:r>
+              <w:rPr>
+                <w:sz w:val="20"/>
+              </w:rPr>
+              <w:t>2026-03-17</w:t>
+            </w:r>
+          </w:p>
+        </w:tc>
+        <w:tc>
+          <w:tcPr>
+            <w:tcW w:type="dxa" w:w="1727"/>
+          </w:tcPr>
+          <w:p>
+            <w:pPr>
+              <w:jc w:val="left"/>
+            </w:pPr>
+            <w:r>
+              <w:rPr>
+                <w:sz w:val="20"/>
+              </w:rPr>
+              <w:t>Tech Showcase Poster – Create, Redesign &amp; Rebrand (PRs #20–22)</w:t>
+            </w:r>
+          </w:p>
+        </w:tc>
+        <w:tc>
+          <w:tcPr>
+            <w:tcW w:type="dxa" w:w="1726"/>
+          </w:tcPr>
+          <w:p>
+            <w:pPr>
+              <w:jc w:val="left"/>
+            </w:pPr>
+            <w:r>
+              <w:rPr>
+                <w:sz w:val="20"/>
+              </w:rPr>
+              <w:t>3</w:t>
+            </w:r>
+          </w:p>
+        </w:tc>
+        <w:tc>
+          <w:tcPr>
+            <w:tcW w:type="dxa" w:w="1726"/>
+          </w:tcPr>
+          <w:p>
+            <w:pPr>
+              <w:jc w:val="left"/>
+            </w:pPr>
+            <w:r>
+              <w:rPr>
+                <w:sz w:val="20"/>
+              </w:rPr>
+              <w:t>Tom Burchell</w:t>
+            </w:r>
+          </w:p>
+        </w:tc>
+        <w:tc>
+          <w:tcPr>
+            <w:tcW w:type="dxa" w:w="1726"/>
+          </w:tcPr>
+          <w:p>
+            <w:pPr>
+              <w:jc w:val="left"/>
+            </w:pPr>
+            <w:r>
+              <w:rPr>
+                <w:sz w:val="20"/>
+              </w:rPr>
+              <w:t>Print-ready A3 conference poster created; reference layout merged with full content; S.I.R.E. brand logo integrated to replace placeholder mock-ups</w:t>
+            </w:r>
+          </w:p>
+        </w:tc>
+      </w:tr>
+      <w:tr>
+        <w:tc>
+          <w:tcPr>
+            <w:tcW w:type="dxa" w:w="1725"/>
+          </w:tcPr>
+          <w:p>
+            <w:pPr>
+              <w:jc w:val="left"/>
+            </w:pPr>
+            <w:r>
+              <w:rPr>
+                <w:sz w:val="20"/>
+              </w:rPr>
+              <w:t>2026-03-19</w:t>
+            </w:r>
+          </w:p>
+        </w:tc>
+        <w:tc>
+          <w:tcPr>
+            <w:tcW w:type="dxa" w:w="1727"/>
+          </w:tcPr>
+          <w:p>
+            <w:pPr>
+              <w:jc w:val="left"/>
+            </w:pPr>
+            <w:r>
+              <w:rPr>
+                <w:sz w:val="20"/>
+              </w:rPr>
+              <w:t>Render Cloud Deployment – Setup &amp; Connectivity Fixes (PRs #23–28)</w:t>
+            </w:r>
+          </w:p>
+        </w:tc>
+        <w:tc>
+          <w:tcPr>
+            <w:tcW w:type="dxa" w:w="1726"/>
+          </w:tcPr>
+          <w:p>
+            <w:pPr>
+              <w:jc w:val="left"/>
+            </w:pPr>
+            <w:r>
+              <w:rPr>
+                <w:sz w:val="20"/>
+              </w:rPr>
+              <w:t>4</w:t>
+            </w:r>
+          </w:p>
+        </w:tc>
+        <w:tc>
+          <w:tcPr>
+            <w:tcW w:type="dxa" w:w="1726"/>
+          </w:tcPr>
+          <w:p>
+            <w:pPr>
+              <w:jc w:val="left"/>
+            </w:pPr>
+            <w:r>
+              <w:rPr>
+                <w:sz w:val="20"/>
+              </w:rPr>
+              <w:t>Tom Burchell</w:t>
+            </w:r>
+          </w:p>
+        </w:tc>
+        <w:tc>
+          <w:tcPr>
+            <w:tcW w:type="dxa" w:w="1726"/>
+          </w:tcPr>
+          <w:p>
+            <w:pPr>
+              <w:jc w:val="left"/>
+            </w:pPr>
+            <w:r>
+              <w:rPr>
+                <w:sz w:val="20"/>
+              </w:rPr>
+              <w:t>Separate frontend (sire-web) and backend (sire-api) Render services configured; Socket.IO auth payload fixed; render.yaml service wiring; blank page fix; VITE_API_KEY auto-sync from backend; session creation errors resolved</w:t>
+            </w:r>
+          </w:p>
+        </w:tc>
+      </w:tr>
+      <w:tr>
+        <w:tc>
+          <w:tcPr>
+            <w:tcW w:type="dxa" w:w="1725"/>
+          </w:tcPr>
+          <w:p>
+            <w:pPr>
+              <w:jc w:val="left"/>
+            </w:pPr>
+            <w:r>
+              <w:rPr>
+                <w:sz w:val="20"/>
+              </w:rPr>
+              <w:t>2026-03-23</w:t>
+            </w:r>
+          </w:p>
+        </w:tc>
+        <w:tc>
+          <w:tcPr>
+            <w:tcW w:type="dxa" w:w="1727"/>
+          </w:tcPr>
+          <w:p>
+            <w:pPr>
+              <w:jc w:val="left"/>
+            </w:pPr>
+            <w:r>
+              <w:rPr>
+                <w:sz w:val="20"/>
+              </w:rPr>
+              <w:t>New Frontend UI Integration &amp; Auth/CORS Fixes (PRs #29–34)</w:t>
+            </w:r>
+          </w:p>
+        </w:tc>
+        <w:tc>
+          <w:tcPr>
+            <w:tcW w:type="dxa" w:w="1726"/>
+          </w:tcPr>
+          <w:p>
+            <w:pPr>
+              <w:jc w:val="left"/>
+            </w:pPr>
+            <w:r>
+              <w:rPr>
+                <w:sz w:val="20"/>
+              </w:rPr>
+              <w:t>5</w:t>
+            </w:r>
+          </w:p>
+        </w:tc>
+        <w:tc>
+          <w:tcPr>
+            <w:tcW w:type="dxa" w:w="1726"/>
+          </w:tcPr>
+          <w:p>
+            <w:pPr>
+              <w:jc w:val="left"/>
+            </w:pPr>
+            <w:r>
+              <w:rPr>
+                <w:sz w:val="20"/>
+              </w:rPr>
+              <w:t>Tom Burchell</w:t>
+            </w:r>
+          </w:p>
+        </w:tc>
+        <w:tc>
+          <w:tcPr>
+            <w:tcW w:type="dxa" w:w="1726"/>
+          </w:tcPr>
+          <w:p>
+            <w:pPr>
+              <w:jc w:val="left"/>
+            </w:pPr>
+            <w:r>
+              <w:rPr>
+                <w:sz w:val="20"/>
+              </w:rPr>
+              <w:t>Replaced SIRE_frontend with aelayette/sire-simulator UI; SQLite user authentication added; API key middleware fixed for auth routes; CORS credentials fix; React Router Link replacing bare anchor tags</w:t>
+            </w:r>
+          </w:p>
+        </w:tc>
+      </w:tr>
+      <w:tr>
+        <w:tc>
+          <w:tcPr>
+            <w:tcW w:type="dxa" w:w="1725"/>
+          </w:tcPr>
+          <w:p>
+            <w:pPr>
+              <w:jc w:val="left"/>
+            </w:pPr>
+            <w:r>
+              <w:rPr>
+                <w:sz w:val="20"/>
+              </w:rPr>
+              <w:t>2026-03-24</w:t>
+            </w:r>
+          </w:p>
+        </w:tc>
+        <w:tc>
+          <w:tcPr>
+            <w:tcW w:type="dxa" w:w="1727"/>
+          </w:tcPr>
+          <w:p>
+            <w:pPr>
+              <w:jc w:val="left"/>
+            </w:pPr>
+            <w:r>
+              <w:rPr>
+                <w:sz w:val="20"/>
+              </w:rPr>
+              <w:t>Presentation Materials – Handouts, PowerPoint &amp; Test Content (PRs #35–38)</w:t>
+            </w:r>
+          </w:p>
+        </w:tc>
+        <w:tc>
+          <w:tcPr>
+            <w:tcW w:type="dxa" w:w="1726"/>
+          </w:tcPr>
+          <w:p>
+            <w:pPr>
+              <w:jc w:val="left"/>
+            </w:pPr>
+            <w:r>
+              <w:rPr>
+                <w:sz w:val="20"/>
+              </w:rPr>
+              <w:t>3</w:t>
+            </w:r>
+          </w:p>
+        </w:tc>
+        <w:tc>
+          <w:tcPr>
+            <w:tcW w:type="dxa" w:w="1726"/>
+          </w:tcPr>
+          <w:p>
+            <w:pPr>
+              <w:jc w:val="left"/>
+            </w:pPr>
+            <w:r>
+              <w:rPr>
+                <w:sz w:val="20"/>
+              </w:rPr>
+              <w:t>Tom Burchell</w:t>
+            </w:r>
+          </w:p>
+        </w:tc>
+        <w:tc>
+          <w:tcPr>
+            <w:tcW w:type="dxa" w:w="1726"/>
+          </w:tcPr>
+          <w:p>
+            <w:pPr>
+              <w:jc w:val="left"/>
+            </w:pPr>
+            <w:r>
+              <w:rPr>
+                <w:sz w:val="20"/>
+              </w:rPr>
+              <w:t>A4 print-ready tech showcase handout created; printer-friendly variant added; PowerPoint generator combining poster content; backend testing content added to Interim Report 03</w:t>
+            </w:r>
+          </w:p>
+        </w:tc>
+      </w:tr>
+      <w:tr>
+        <w:tc>
+          <w:tcPr>
+            <w:tcW w:type="dxa" w:w="1725"/>
+          </w:tcPr>
+          <w:p>
+            <w:pPr>
+              <w:jc w:val="left"/>
+            </w:pPr>
+            <w:r>
+              <w:rPr>
+                <w:sz w:val="20"/>
+              </w:rPr>
+              <w:t>2026-03-25</w:t>
+            </w:r>
+          </w:p>
+        </w:tc>
+        <w:tc>
+          <w:tcPr>
+            <w:tcW w:type="dxa" w:w="1727"/>
+          </w:tcPr>
+          <w:p>
+            <w:pPr>
+              <w:jc w:val="left"/>
+            </w:pPr>
+            <w:r>
+              <w:rPr>
+                <w:sz w:val="20"/>
+              </w:rPr>
+              <w:t>Demo Mode &amp; Admin Dashboard Enhancements (PRs #39–47)</w:t>
+            </w:r>
+          </w:p>
+        </w:tc>
+        <w:tc>
+          <w:tcPr>
+            <w:tcW w:type="dxa" w:w="1726"/>
+          </w:tcPr>
+          <w:p>
+            <w:pPr>
+              <w:jc w:val="left"/>
+            </w:pPr>
+            <w:r>
+              <w:rPr>
+                <w:sz w:val="20"/>
+              </w:rPr>
+              <w:t>5</w:t>
+            </w:r>
+          </w:p>
+        </w:tc>
+        <w:tc>
+          <w:tcPr>
+            <w:tcW w:type="dxa" w:w="1726"/>
+          </w:tcPr>
+          <w:p>
+            <w:pPr>
+              <w:jc w:val="left"/>
+            </w:pPr>
+            <w:r>
+              <w:rPr>
+                <w:sz w:val="20"/>
+              </w:rPr>
+              <w:t>Tom Burchell</w:t>
+            </w:r>
+          </w:p>
+        </w:tc>
+        <w:tc>
+          <w:tcPr>
+            <w:tcW w:type="dxa" w:w="1726"/>
+          </w:tcPr>
+          <w:p>
+            <w:pPr>
+              <w:jc w:val="left"/>
+            </w:pPr>
+            <w:r>
+              <w:rPr>
+                <w:sz w:val="20"/>
+              </w:rPr>
+              <w:t>Auth bypass for demo mode; all 8 scenario JSON files unlocked; admin dashboard made dynamic with scenario cards and live API fetch; health check moved before API key middleware; Render service URL and routing fixes</w:t>
+            </w:r>
+          </w:p>
+        </w:tc>
+      </w:tr>
+      <w:tr>
+        <w:tc>
+          <w:tcPr>
+            <w:tcW w:type="dxa" w:w="1725"/>
+          </w:tcPr>
+          <w:p>
+            <w:pPr>
+              <w:jc w:val="left"/>
+            </w:pPr>
+            <w:r>
+              <w:rPr>
+                <w:sz w:val="20"/>
+              </w:rPr>
+              <w:t>2026-03-26</w:t>
+            </w:r>
+          </w:p>
+        </w:tc>
+        <w:tc>
+          <w:tcPr>
+            <w:tcW w:type="dxa" w:w="1727"/>
+          </w:tcPr>
+          <w:p>
+            <w:pPr>
+              <w:jc w:val="left"/>
+            </w:pPr>
+            <w:r>
+              <w:rPr>
+                <w:sz w:val="20"/>
+              </w:rPr>
+              <w:t>SQLite Database, Showcase/Kiosk, Demo Mode &amp; Business Cards (PRs #48–55)</w:t>
+            </w:r>
+          </w:p>
+        </w:tc>
+        <w:tc>
+          <w:tcPr>
+            <w:tcW w:type="dxa" w:w="1726"/>
+          </w:tcPr>
+          <w:p>
+            <w:pPr>
+              <w:jc w:val="left"/>
+            </w:pPr>
+            <w:r>
+              <w:rPr>
+                <w:sz w:val="20"/>
+              </w:rPr>
+              <w:t>5</w:t>
+            </w:r>
+          </w:p>
+        </w:tc>
+        <w:tc>
+          <w:tcPr>
+            <w:tcW w:type="dxa" w:w="1726"/>
+          </w:tcPr>
+          <w:p>
+            <w:pPr>
+              <w:jc w:val="left"/>
+            </w:pPr>
+            <w:r>
+              <w:rPr>
+                <w:sz w:val="20"/>
+              </w:rPr>
+              <w:t>Tom Burchell</w:t>
+            </w:r>
+          </w:p>
+        </w:tc>
+        <w:tc>
+          <w:tcPr>
+            <w:tcW w:type="dxa" w:w="1726"/>
+          </w:tcPr>
+          <w:p>
+            <w:pPr>
+              <w:jc w:val="left"/>
+            </w:pPr>
+            <w:r>
+              <w:rPr>
+                <w:sz w:val="20"/>
+              </w:rPr>
+              <w:t>Standalone SQLite database for usernames and scenario data; frontend-only demo mode with bundled scenario data; auto-playing showcase/kiosk screen; Team Nibble business cards with QR code to simulator URL</w:t>
+            </w:r>
+          </w:p>
+        </w:tc>
+      </w:tr>
+      <w:tr>
+        <w:tc>
+          <w:tcPr>
+            <w:tcW w:type="dxa" w:w="1725"/>
+          </w:tcPr>
+          <w:p>
+            <w:pPr>
+              <w:jc w:val="left"/>
+            </w:pPr>
+            <w:r>
+              <w:rPr>
+                <w:sz w:val="20"/>
+              </w:rPr>
+              <w:t>2026-03-30</w:t>
+            </w:r>
+          </w:p>
+        </w:tc>
+        <w:tc>
+          <w:tcPr>
+            <w:tcW w:type="dxa" w:w="1727"/>
+          </w:tcPr>
+          <w:p>
+            <w:pPr>
+              <w:jc w:val="left"/>
+            </w:pPr>
+            <w:r>
+              <w:rPr>
+                <w:sz w:val="20"/>
+              </w:rPr>
+              <w:t>Render Deployment Debugging &amp; Configuration (PRs #56–67)</w:t>
             </w:r>
           </w:p>
         </w:tc>
@@ -331,7 +1663,7 @@
               <w:rPr>
                 <w:sz w:val="20"/>
               </w:rPr>
-              <w:t>GitHub repo initialised; Node/Express skeleton; .gitignore, README, package.json</w:t>
+              <w:t>Backend↔frontend re-wiring for Render; fromService property iterations (host → url → hardcoded); VITE_API_BASE build-time injection fix; static/web runtime fix; npm audit vulnerability fixes; Render free-tier deployment guide</w:t>
             </w:r>
           </w:p>
         </w:tc>
@@ -349,7 +1681,7 @@
               <w:rPr>
                 <w:sz w:val="20"/>
               </w:rPr>
-              <w:t>2025-06-23</w:t>
+              <w:t>2026-03-31</w:t>
             </w:r>
           </w:p>
         </w:tc>
@@ -365,7 +1697,7 @@
               <w:rPr>
                 <w:sz w:val="20"/>
               </w:rPr>
-              <w:t>Repo &amp; Project Scaffolding – Frontend</w:t>
+              <w:t>CORS Testing, Session Export, UI Polish &amp; Branding (PRs #68–72)</w:t>
             </w:r>
           </w:p>
         </w:tc>
@@ -381,7 +1713,7 @@
               <w:rPr>
                 <w:sz w:val="20"/>
               </w:rPr>
-              <w:t>6</w:t>
+              <w:t>3</w:t>
             </w:r>
           </w:p>
         </w:tc>
@@ -397,7 +1729,7 @@
               <w:rPr>
                 <w:sz w:val="20"/>
               </w:rPr>
-              <w:t>Leo Wasiliew</w:t>
+              <w:t>Tom Burchell</w:t>
             </w:r>
           </w:p>
         </w:tc>
@@ -413,7 +1745,7 @@
               <w:rPr>
                 <w:sz w:val="20"/>
               </w:rPr>
-              <w:t>React + Vite scaffold; ESLint config; folder structure aligned with backend</w:t>
+              <w:t>CORS preflight test suite added to CI; CORS policy fix for cross-origin requests; end-session modal with export; back navigation; admin injects visible in trainee Live Updates panel; SIRE shield favicon</w:t>
             </w:r>
           </w:p>
         </w:tc>
@@ -431,7 +1763,7 @@
               <w:rPr>
                 <w:sz w:val="20"/>
               </w:rPr>
-              <w:t>2025-06-26</w:t>
+              <w:t>2026-04-07</w:t>
             </w:r>
           </w:p>
         </w:tc>
@@ -447,7 +1779,171 @@
               <w:rPr>
                 <w:sz w:val="20"/>
               </w:rPr>
-              <w:t>Gantt chart &amp; project planning documents</w:t>
+              <w:t>Cybersecurity Scenarios – Malware, Phishing &amp; Identity Attacks (PRs #73–75)</w:t>
+            </w:r>
+          </w:p>
+        </w:tc>
+        <w:tc>
+          <w:tcPr>
+            <w:tcW w:type="dxa" w:w="1726"/>
+          </w:tcPr>
+          <w:p>
+            <w:pPr>
+              <w:jc w:val="left"/>
+            </w:pPr>
+            <w:r>
+              <w:rPr>
+                <w:sz w:val="20"/>
+              </w:rPr>
+              <w:t>3</w:t>
+            </w:r>
+          </w:p>
+        </w:tc>
+        <w:tc>
+          <w:tcPr>
+            <w:tcW w:type="dxa" w:w="1726"/>
+          </w:tcPr>
+          <w:p>
+            <w:pPr>
+              <w:jc w:val="left"/>
+            </w:pPr>
+            <w:r>
+              <w:rPr>
+                <w:sz w:val="20"/>
+              </w:rPr>
+              <w:t>Tom Burchell</w:t>
+            </w:r>
+          </w:p>
+        </w:tc>
+        <w:tc>
+          <w:tcPr>
+            <w:tcW w:type="dxa" w:w="1726"/>
+          </w:tcPr>
+          <w:p>
+            <w:pPr>
+              <w:jc w:val="left"/>
+            </w:pPr>
+            <w:r>
+              <w:rPr>
+                <w:sz w:val="20"/>
+              </w:rPr>
+              <w:t>29 cybersecurity scenarios created: malware-based incidents (9), phishing/social engineering (10), credential and identity attack simulations (10)</w:t>
+            </w:r>
+          </w:p>
+        </w:tc>
+      </w:tr>
+      <w:tr>
+        <w:tc>
+          <w:tcPr>
+            <w:tcW w:type="dxa" w:w="1725"/>
+          </w:tcPr>
+          <w:p>
+            <w:pPr>
+              <w:jc w:val="left"/>
+            </w:pPr>
+            <w:r>
+              <w:rPr>
+                <w:sz w:val="20"/>
+              </w:rPr>
+              <w:t>2026-04-08</w:t>
+            </w:r>
+          </w:p>
+        </w:tc>
+        <w:tc>
+          <w:tcPr>
+            <w:tcW w:type="dxa" w:w="1727"/>
+          </w:tcPr>
+          <w:p>
+            <w:pPr>
+              <w:jc w:val="left"/>
+            </w:pPr>
+            <w:r>
+              <w:rPr>
+                <w:sz w:val="20"/>
+              </w:rPr>
+              <w:t>UI Enhancement – God Mode, Live Scoring &amp; Dark Theme (PRs #76–77)</w:t>
+            </w:r>
+          </w:p>
+        </w:tc>
+        <w:tc>
+          <w:tcPr>
+            <w:tcW w:type="dxa" w:w="1726"/>
+          </w:tcPr>
+          <w:p>
+            <w:pPr>
+              <w:jc w:val="left"/>
+            </w:pPr>
+            <w:r>
+              <w:rPr>
+                <w:sz w:val="20"/>
+              </w:rPr>
+              <w:t>2</w:t>
+            </w:r>
+          </w:p>
+        </w:tc>
+        <w:tc>
+          <w:tcPr>
+            <w:tcW w:type="dxa" w:w="1726"/>
+          </w:tcPr>
+          <w:p>
+            <w:pPr>
+              <w:jc w:val="left"/>
+            </w:pPr>
+            <w:r>
+              <w:rPr>
+                <w:sz w:val="20"/>
+              </w:rPr>
+              <w:t>Tom Burchell</w:t>
+            </w:r>
+          </w:p>
+        </w:tc>
+        <w:tc>
+          <w:tcPr>
+            <w:tcW w:type="dxa" w:w="1726"/>
+          </w:tcPr>
+          <w:p>
+            <w:pPr>
+              <w:jc w:val="left"/>
+            </w:pPr>
+            <w:r>
+              <w:rPr>
+                <w:sz w:val="20"/>
+              </w:rPr>
+              <w:t>God Mode: live timer, scoring, inline feedback, scenario filters, enhanced AAR export; UI polish: soft-edge components, consistent spacing, modern dark aesthetic</w:t>
+            </w:r>
+          </w:p>
+        </w:tc>
+      </w:tr>
+      <w:tr>
+        <w:tc>
+          <w:tcPr>
+            <w:tcW w:type="dxa" w:w="1725"/>
+          </w:tcPr>
+          <w:p>
+            <w:pPr>
+              <w:jc w:val="left"/>
+            </w:pPr>
+            <w:r>
+              <w:rPr>
+                <w:sz w:val="20"/>
+              </w:rPr>
+              <w:t>2026-04-08</w:t>
+            </w:r>
+          </w:p>
+        </w:tc>
+        <w:tc>
+          <w:tcPr>
+            <w:tcW w:type="dxa" w:w="1727"/>
+          </w:tcPr>
+          <w:p>
+            <w:pPr>
+              <w:jc w:val="left"/>
+            </w:pPr>
+            <w:r>
+              <w:rPr>
+                <w:sz w:val="20"/>
+              </w:rPr>
+              <w:t>Cybersecurity Scenario Expansion (PRs #78–84)</w:t>
             </w:r>
           </w:p>
         </w:tc>
@@ -479,7 +1975,7 @@
               <w:rPr>
                 <w:sz w:val="20"/>
               </w:rPr>
-              <w:t>Kael Payette</w:t>
+              <w:t>Tom Burchell</w:t>
             </w:r>
           </w:p>
         </w:tc>
@@ -495,7 +1991,7 @@
               <w:rPr>
                 <w:sz w:val="20"/>
               </w:rPr>
-              <w:t>Gantt_Detailed.csv created; Project Charter written; milestones confirmed</w:t>
+              <w:t>26 new cybersecurity IR scenarios; 33 IT Operations/Infrastructure incidents; Insider Threat (malicious/negligent); BCDR scenarios; Supply Chain, Compliance, Healthcare incidents; OT/ICS, Crisis Communications, IR Process Failure; Advanced tabletop scenarios</w:t>
             </w:r>
           </w:p>
         </w:tc>
@@ -513,7 +2009,7 @@
               <w:rPr>
                 <w:sz w:val="20"/>
               </w:rPr>
-              <w:t>2025-06-30</w:t>
+              <w:t>2026-04-08</w:t>
             </w:r>
           </w:p>
         </w:tc>
@@ -529,1565 +2025,7 @@
               <w:rPr>
                 <w:sz w:val="20"/>
               </w:rPr>
-              <w:t>Backend Architecture &amp; Express Setup</w:t>
-            </w:r>
-          </w:p>
-        </w:tc>
-        <w:tc>
-          <w:tcPr>
-            <w:tcW w:type="dxa" w:w="1726"/>
-          </w:tcPr>
-          <w:p>
-            <w:pPr>
-              <w:jc w:val="left"/>
-            </w:pPr>
-            <w:r>
-              <w:rPr>
-                <w:sz w:val="20"/>
-              </w:rPr>
-              <w:t>8</w:t>
-            </w:r>
-          </w:p>
-        </w:tc>
-        <w:tc>
-          <w:tcPr>
-            <w:tcW w:type="dxa" w:w="1726"/>
-          </w:tcPr>
-          <w:p>
-            <w:pPr>
-              <w:jc w:val="left"/>
-            </w:pPr>
-            <w:r>
-              <w:rPr>
-                <w:sz w:val="20"/>
-              </w:rPr>
-              <w:t>Tom Burchell</w:t>
-            </w:r>
-          </w:p>
-        </w:tc>
-        <w:tc>
-          <w:tcPr>
-            <w:tcW w:type="dxa" w:w="1726"/>
-          </w:tcPr>
-          <w:p>
-            <w:pPr>
-              <w:jc w:val="left"/>
-            </w:pPr>
-            <w:r>
-              <w:rPr>
-                <w:sz w:val="20"/>
-              </w:rPr>
-              <w:t>Express middleware stack; environment config; security headers; logger setup</w:t>
-            </w:r>
-          </w:p>
-        </w:tc>
-      </w:tr>
-      <w:tr>
-        <w:tc>
-          <w:tcPr>
-            <w:tcW w:type="dxa" w:w="1725"/>
-          </w:tcPr>
-          <w:p>
-            <w:pPr>
-              <w:jc w:val="left"/>
-            </w:pPr>
-            <w:r>
-              <w:rPr>
-                <w:sz w:val="20"/>
-              </w:rPr>
-              <w:t>2025-07-03</w:t>
-            </w:r>
-          </w:p>
-        </w:tc>
-        <w:tc>
-          <w:tcPr>
-            <w:tcW w:type="dxa" w:w="1727"/>
-          </w:tcPr>
-          <w:p>
-            <w:pPr>
-              <w:jc w:val="left"/>
-            </w:pPr>
-            <w:r>
-              <w:rPr>
-                <w:sz w:val="20"/>
-              </w:rPr>
-              <w:t>Backend Architecture – API routes &amp; error handling</w:t>
-            </w:r>
-          </w:p>
-        </w:tc>
-        <w:tc>
-          <w:tcPr>
-            <w:tcW w:type="dxa" w:w="1726"/>
-          </w:tcPr>
-          <w:p>
-            <w:pPr>
-              <w:jc w:val="left"/>
-            </w:pPr>
-            <w:r>
-              <w:rPr>
-                <w:sz w:val="20"/>
-              </w:rPr>
-              <w:t>6</w:t>
-            </w:r>
-          </w:p>
-        </w:tc>
-        <w:tc>
-          <w:tcPr>
-            <w:tcW w:type="dxa" w:w="1726"/>
-          </w:tcPr>
-          <w:p>
-            <w:pPr>
-              <w:jc w:val="left"/>
-            </w:pPr>
-            <w:r>
-              <w:rPr>
-                <w:sz w:val="20"/>
-              </w:rPr>
-              <w:t>Tom Burchell</w:t>
-            </w:r>
-          </w:p>
-        </w:tc>
-        <w:tc>
-          <w:tcPr>
-            <w:tcW w:type="dxa" w:w="1726"/>
-          </w:tcPr>
-          <w:p>
-            <w:pPr>
-              <w:jc w:val="left"/>
-            </w:pPr>
-            <w:r>
-              <w:rPr>
-                <w:sz w:val="20"/>
-              </w:rPr>
-              <w:t>Health route; session route skeleton; centralised error handler; audit logger</w:t>
-            </w:r>
-          </w:p>
-        </w:tc>
-      </w:tr>
-      <w:tr>
-        <w:tc>
-          <w:tcPr>
-            <w:tcW w:type="dxa" w:w="1725"/>
-          </w:tcPr>
-          <w:p>
-            <w:pPr>
-              <w:jc w:val="left"/>
-            </w:pPr>
-            <w:r>
-              <w:rPr>
-                <w:sz w:val="20"/>
-              </w:rPr>
-              <w:t>2025-07-07</w:t>
-            </w:r>
-          </w:p>
-        </w:tc>
-        <w:tc>
-          <w:tcPr>
-            <w:tcW w:type="dxa" w:w="1727"/>
-          </w:tcPr>
-          <w:p>
-            <w:pPr>
-              <w:jc w:val="left"/>
-            </w:pPr>
-            <w:r>
-              <w:rPr>
-                <w:sz w:val="20"/>
-              </w:rPr>
-              <w:t>Socket.IO Core – Namespaces &amp; Rooms</w:t>
-            </w:r>
-          </w:p>
-        </w:tc>
-        <w:tc>
-          <w:tcPr>
-            <w:tcW w:type="dxa" w:w="1726"/>
-          </w:tcPr>
-          <w:p>
-            <w:pPr>
-              <w:jc w:val="left"/>
-            </w:pPr>
-            <w:r>
-              <w:rPr>
-                <w:sz w:val="20"/>
-              </w:rPr>
-              <w:t>8</w:t>
-            </w:r>
-          </w:p>
-        </w:tc>
-        <w:tc>
-          <w:tcPr>
-            <w:tcW w:type="dxa" w:w="1726"/>
-          </w:tcPr>
-          <w:p>
-            <w:pPr>
-              <w:jc w:val="left"/>
-            </w:pPr>
-            <w:r>
-              <w:rPr>
-                <w:sz w:val="20"/>
-              </w:rPr>
-              <w:t>Tom Burchell</w:t>
-            </w:r>
-          </w:p>
-        </w:tc>
-        <w:tc>
-          <w:tcPr>
-            <w:tcW w:type="dxa" w:w="1726"/>
-          </w:tcPr>
-          <w:p>
-            <w:pPr>
-              <w:jc w:val="left"/>
-            </w:pPr>
-            <w:r>
-              <w:rPr>
-                <w:sz w:val="20"/>
-              </w:rPr>
-              <w:t>Socket.IO server init; room creation on session start; namespace strategy defined</w:t>
-            </w:r>
-          </w:p>
-        </w:tc>
-      </w:tr>
-      <w:tr>
-        <w:tc>
-          <w:tcPr>
-            <w:tcW w:type="dxa" w:w="1725"/>
-          </w:tcPr>
-          <w:p>
-            <w:pPr>
-              <w:jc w:val="left"/>
-            </w:pPr>
-            <w:r>
-              <w:rPr>
-                <w:sz w:val="20"/>
-              </w:rPr>
-              <w:t>2025-07-10</w:t>
-            </w:r>
-          </w:p>
-        </w:tc>
-        <w:tc>
-          <w:tcPr>
-            <w:tcW w:type="dxa" w:w="1727"/>
-          </w:tcPr>
-          <w:p>
-            <w:pPr>
-              <w:jc w:val="left"/>
-            </w:pPr>
-            <w:r>
-              <w:rPr>
-                <w:sz w:val="20"/>
-              </w:rPr>
-              <w:t>Socket.IO Core – event protocol design</w:t>
-            </w:r>
-          </w:p>
-        </w:tc>
-        <w:tc>
-          <w:tcPr>
-            <w:tcW w:type="dxa" w:w="1726"/>
-          </w:tcPr>
-          <w:p>
-            <w:pPr>
-              <w:jc w:val="left"/>
-            </w:pPr>
-            <w:r>
-              <w:rPr>
-                <w:sz w:val="20"/>
-              </w:rPr>
-              <w:t>6</w:t>
-            </w:r>
-          </w:p>
-        </w:tc>
-        <w:tc>
-          <w:tcPr>
-            <w:tcW w:type="dxa" w:w="1726"/>
-          </w:tcPr>
-          <w:p>
-            <w:pPr>
-              <w:jc w:val="left"/>
-            </w:pPr>
-            <w:r>
-              <w:rPr>
-                <w:sz w:val="20"/>
-              </w:rPr>
-              <w:t>Tom Burchell</w:t>
-            </w:r>
-          </w:p>
-        </w:tc>
-        <w:tc>
-          <w:tcPr>
-            <w:tcW w:type="dxa" w:w="1726"/>
-          </w:tcPr>
-          <w:p>
-            <w:pPr>
-              <w:jc w:val="left"/>
-            </w:pPr>
-            <w:r>
-              <w:rPr>
-                <w:sz w:val="20"/>
-              </w:rPr>
-              <w:t>Socket event catalog drafted; join/leave events; broadcast vs. targeted emit</w:t>
-            </w:r>
-          </w:p>
-        </w:tc>
-      </w:tr>
-      <w:tr>
-        <w:tc>
-          <w:tcPr>
-            <w:tcW w:type="dxa" w:w="1725"/>
-          </w:tcPr>
-          <w:p>
-            <w:pPr>
-              <w:jc w:val="left"/>
-            </w:pPr>
-            <w:r>
-              <w:rPr>
-                <w:sz w:val="20"/>
-              </w:rPr>
-              <w:t>2025-07-14</w:t>
-            </w:r>
-          </w:p>
-        </w:tc>
-        <w:tc>
-          <w:tcPr>
-            <w:tcW w:type="dxa" w:w="1727"/>
-          </w:tcPr>
-          <w:p>
-            <w:pPr>
-              <w:jc w:val="left"/>
-            </w:pPr>
-            <w:r>
-              <w:rPr>
-                <w:sz w:val="20"/>
-              </w:rPr>
-              <w:t>Session Store &amp; Join Flow</w:t>
-            </w:r>
-          </w:p>
-        </w:tc>
-        <w:tc>
-          <w:tcPr>
-            <w:tcW w:type="dxa" w:w="1726"/>
-          </w:tcPr>
-          <w:p>
-            <w:pPr>
-              <w:jc w:val="left"/>
-            </w:pPr>
-            <w:r>
-              <w:rPr>
-                <w:sz w:val="20"/>
-              </w:rPr>
-              <w:t>7</w:t>
-            </w:r>
-          </w:p>
-        </w:tc>
-        <w:tc>
-          <w:tcPr>
-            <w:tcW w:type="dxa" w:w="1726"/>
-          </w:tcPr>
-          <w:p>
-            <w:pPr>
-              <w:jc w:val="left"/>
-            </w:pPr>
-            <w:r>
-              <w:rPr>
-                <w:sz w:val="20"/>
-              </w:rPr>
-              <w:t>Tom Burchell</w:t>
-            </w:r>
-          </w:p>
-        </w:tc>
-        <w:tc>
-          <w:tcPr>
-            <w:tcW w:type="dxa" w:w="1726"/>
-          </w:tcPr>
-          <w:p>
-            <w:pPr>
-              <w:jc w:val="left"/>
-            </w:pPr>
-            <w:r>
-              <w:rPr>
-                <w:sz w:val="20"/>
-              </w:rPr>
-              <w:t>In-memory session store implemented; trainee join/leave; session expiry logic</w:t>
-            </w:r>
-          </w:p>
-        </w:tc>
-      </w:tr>
-      <w:tr>
-        <w:tc>
-          <w:tcPr>
-            <w:tcW w:type="dxa" w:w="1725"/>
-          </w:tcPr>
-          <w:p>
-            <w:pPr>
-              <w:jc w:val="left"/>
-            </w:pPr>
-            <w:r>
-              <w:rPr>
-                <w:sz w:val="20"/>
-              </w:rPr>
-              <w:t>2025-07-14</w:t>
-            </w:r>
-          </w:p>
-        </w:tc>
-        <w:tc>
-          <w:tcPr>
-            <w:tcW w:type="dxa" w:w="1727"/>
-          </w:tcPr>
-          <w:p>
-            <w:pPr>
-              <w:jc w:val="left"/>
-            </w:pPr>
-            <w:r>
-              <w:rPr>
-                <w:sz w:val="20"/>
-              </w:rPr>
-              <w:t>Frontend Component Skeleton</w:t>
-            </w:r>
-          </w:p>
-        </w:tc>
-        <w:tc>
-          <w:tcPr>
-            <w:tcW w:type="dxa" w:w="1726"/>
-          </w:tcPr>
-          <w:p>
-            <w:pPr>
-              <w:jc w:val="left"/>
-            </w:pPr>
-            <w:r>
-              <w:rPr>
-                <w:sz w:val="20"/>
-              </w:rPr>
-              <w:t>7</w:t>
-            </w:r>
-          </w:p>
-        </w:tc>
-        <w:tc>
-          <w:tcPr>
-            <w:tcW w:type="dxa" w:w="1726"/>
-          </w:tcPr>
-          <w:p>
-            <w:pPr>
-              <w:jc w:val="left"/>
-            </w:pPr>
-            <w:r>
-              <w:rPr>
-                <w:sz w:val="20"/>
-              </w:rPr>
-              <w:t>Leo Wasiliew</w:t>
-            </w:r>
-          </w:p>
-        </w:tc>
-        <w:tc>
-          <w:tcPr>
-            <w:tcW w:type="dxa" w:w="1726"/>
-          </w:tcPr>
-          <w:p>
-            <w:pPr>
-              <w:jc w:val="left"/>
-            </w:pPr>
-            <w:r>
-              <w:rPr>
-                <w:sz w:val="20"/>
-              </w:rPr>
-              <w:t>React component tree; SessionSetup, ScenarioSelector, EventLog stubs created</w:t>
-            </w:r>
-          </w:p>
-        </w:tc>
-      </w:tr>
-      <w:tr>
-        <w:tc>
-          <w:tcPr>
-            <w:tcW w:type="dxa" w:w="1725"/>
-          </w:tcPr>
-          <w:p>
-            <w:pPr>
-              <w:jc w:val="left"/>
-            </w:pPr>
-            <w:r>
-              <w:rPr>
-                <w:sz w:val="20"/>
-              </w:rPr>
-              <w:t>2025-07-17</w:t>
-            </w:r>
-          </w:p>
-        </w:tc>
-        <w:tc>
-          <w:tcPr>
-            <w:tcW w:type="dxa" w:w="1727"/>
-          </w:tcPr>
-          <w:p>
-            <w:pPr>
-              <w:jc w:val="left"/>
-            </w:pPr>
-            <w:r>
-              <w:rPr>
-                <w:sz w:val="20"/>
-              </w:rPr>
-              <w:t>Frontend – routing &amp; state management</w:t>
-            </w:r>
-          </w:p>
-        </w:tc>
-        <w:tc>
-          <w:tcPr>
-            <w:tcW w:type="dxa" w:w="1726"/>
-          </w:tcPr>
-          <w:p>
-            <w:pPr>
-              <w:jc w:val="left"/>
-            </w:pPr>
-            <w:r>
-              <w:rPr>
-                <w:sz w:val="20"/>
-              </w:rPr>
-              <w:t>6</w:t>
-            </w:r>
-          </w:p>
-        </w:tc>
-        <w:tc>
-          <w:tcPr>
-            <w:tcW w:type="dxa" w:w="1726"/>
-          </w:tcPr>
-          <w:p>
-            <w:pPr>
-              <w:jc w:val="left"/>
-            </w:pPr>
-            <w:r>
-              <w:rPr>
-                <w:sz w:val="20"/>
-              </w:rPr>
-              <w:t>Leo Wasiliew</w:t>
-            </w:r>
-          </w:p>
-        </w:tc>
-        <w:tc>
-          <w:tcPr>
-            <w:tcW w:type="dxa" w:w="1726"/>
-          </w:tcPr>
-          <w:p>
-            <w:pPr>
-              <w:jc w:val="left"/>
-            </w:pPr>
-            <w:r>
-              <w:rPr>
-                <w:sz w:val="20"/>
-              </w:rPr>
-              <w:t>useSocket hook; socket context; App-level routing between views</w:t>
-            </w:r>
-          </w:p>
-        </w:tc>
-      </w:tr>
-      <w:tr>
-        <w:tc>
-          <w:tcPr>
-            <w:tcW w:type="dxa" w:w="1725"/>
-          </w:tcPr>
-          <w:p>
-            <w:pPr>
-              <w:jc w:val="left"/>
-            </w:pPr>
-            <w:r>
-              <w:rPr>
-                <w:sz w:val="20"/>
-              </w:rPr>
-              <w:t>2025-07-21</w:t>
-            </w:r>
-          </w:p>
-        </w:tc>
-        <w:tc>
-          <w:tcPr>
-            <w:tcW w:type="dxa" w:w="1727"/>
-          </w:tcPr>
-          <w:p>
-            <w:pPr>
-              <w:jc w:val="left"/>
-            </w:pPr>
-            <w:r>
-              <w:rPr>
-                <w:sz w:val="20"/>
-              </w:rPr>
-              <w:t>Timed Escalation Engine – design &amp; prototype</w:t>
-            </w:r>
-          </w:p>
-        </w:tc>
-        <w:tc>
-          <w:tcPr>
-            <w:tcW w:type="dxa" w:w="1726"/>
-          </w:tcPr>
-          <w:p>
-            <w:pPr>
-              <w:jc w:val="left"/>
-            </w:pPr>
-            <w:r>
-              <w:rPr>
-                <w:sz w:val="20"/>
-              </w:rPr>
-              <w:t>8</w:t>
-            </w:r>
-          </w:p>
-        </w:tc>
-        <w:tc>
-          <w:tcPr>
-            <w:tcW w:type="dxa" w:w="1726"/>
-          </w:tcPr>
-          <w:p>
-            <w:pPr>
-              <w:jc w:val="left"/>
-            </w:pPr>
-            <w:r>
-              <w:rPr>
-                <w:sz w:val="20"/>
-              </w:rPr>
-              <w:t>Tom Burchell</w:t>
-            </w:r>
-          </w:p>
-        </w:tc>
-        <w:tc>
-          <w:tcPr>
-            <w:tcW w:type="dxa" w:w="1726"/>
-          </w:tcPr>
-          <w:p>
-            <w:pPr>
-              <w:jc w:val="left"/>
-            </w:pPr>
-            <w:r>
-              <w:rPr>
-                <w:sz w:val="20"/>
-              </w:rPr>
-              <w:t>Escalation service architecture; timer queue; automatic scenario event injection</w:t>
-            </w:r>
-          </w:p>
-        </w:tc>
-      </w:tr>
-      <w:tr>
-        <w:tc>
-          <w:tcPr>
-            <w:tcW w:type="dxa" w:w="1725"/>
-          </w:tcPr>
-          <w:p>
-            <w:pPr>
-              <w:jc w:val="left"/>
-            </w:pPr>
-            <w:r>
-              <w:rPr>
-                <w:sz w:val="20"/>
-              </w:rPr>
-              <w:t>2025-07-24</w:t>
-            </w:r>
-          </w:p>
-        </w:tc>
-        <w:tc>
-          <w:tcPr>
-            <w:tcW w:type="dxa" w:w="1727"/>
-          </w:tcPr>
-          <w:p>
-            <w:pPr>
-              <w:jc w:val="left"/>
-            </w:pPr>
-            <w:r>
-              <w:rPr>
-                <w:sz w:val="20"/>
-              </w:rPr>
-              <w:t>Timed Escalation Engine – integration</w:t>
-            </w:r>
-          </w:p>
-        </w:tc>
-        <w:tc>
-          <w:tcPr>
-            <w:tcW w:type="dxa" w:w="1726"/>
-          </w:tcPr>
-          <w:p>
-            <w:pPr>
-              <w:jc w:val="left"/>
-            </w:pPr>
-            <w:r>
-              <w:rPr>
-                <w:sz w:val="20"/>
-              </w:rPr>
-              <w:t>7</w:t>
-            </w:r>
-          </w:p>
-        </w:tc>
-        <w:tc>
-          <w:tcPr>
-            <w:tcW w:type="dxa" w:w="1726"/>
-          </w:tcPr>
-          <w:p>
-            <w:pPr>
-              <w:jc w:val="left"/>
-            </w:pPr>
-            <w:r>
-              <w:rPr>
-                <w:sz w:val="20"/>
-              </w:rPr>
-              <w:t>Tom Burchell</w:t>
-            </w:r>
-          </w:p>
-        </w:tc>
-        <w:tc>
-          <w:tcPr>
-            <w:tcW w:type="dxa" w:w="1726"/>
-          </w:tcPr>
-          <w:p>
-            <w:pPr>
-              <w:jc w:val="left"/>
-            </w:pPr>
-            <w:r>
-              <w:rPr>
-                <w:sz w:val="20"/>
-              </w:rPr>
-              <w:t>Escalation events wired to Socket.IO broadcasts; scenario registry integrated</w:t>
-            </w:r>
-          </w:p>
-        </w:tc>
-      </w:tr>
-      <w:tr>
-        <w:tc>
-          <w:tcPr>
-            <w:tcW w:type="dxa" w:w="1725"/>
-          </w:tcPr>
-          <w:p>
-            <w:pPr>
-              <w:jc w:val="left"/>
-            </w:pPr>
-            <w:r>
-              <w:rPr>
-                <w:sz w:val="20"/>
-              </w:rPr>
-              <w:t>2025-07-28</w:t>
-            </w:r>
-          </w:p>
-        </w:tc>
-        <w:tc>
-          <w:tcPr>
-            <w:tcW w:type="dxa" w:w="1727"/>
-          </w:tcPr>
-          <w:p>
-            <w:pPr>
-              <w:jc w:val="left"/>
-            </w:pPr>
-            <w:r>
-              <w:rPr>
-                <w:sz w:val="20"/>
-              </w:rPr>
-              <w:t>Admin Dashboard with Real-Time Log</w:t>
-            </w:r>
-          </w:p>
-        </w:tc>
-        <w:tc>
-          <w:tcPr>
-            <w:tcW w:type="dxa" w:w="1726"/>
-          </w:tcPr>
-          <w:p>
-            <w:pPr>
-              <w:jc w:val="left"/>
-            </w:pPr>
-            <w:r>
-              <w:rPr>
-                <w:sz w:val="20"/>
-              </w:rPr>
-              <w:t>8</w:t>
-            </w:r>
-          </w:p>
-        </w:tc>
-        <w:tc>
-          <w:tcPr>
-            <w:tcW w:type="dxa" w:w="1726"/>
-          </w:tcPr>
-          <w:p>
-            <w:pPr>
-              <w:jc w:val="left"/>
-            </w:pPr>
-            <w:r>
-              <w:rPr>
-                <w:sz w:val="20"/>
-              </w:rPr>
-              <w:t>Leo Wasiliew</w:t>
-            </w:r>
-          </w:p>
-        </w:tc>
-        <w:tc>
-          <w:tcPr>
-            <w:tcW w:type="dxa" w:w="1726"/>
-          </w:tcPr>
-          <w:p>
-            <w:pPr>
-              <w:jc w:val="left"/>
-            </w:pPr>
-            <w:r>
-              <w:rPr>
-                <w:sz w:val="20"/>
-              </w:rPr>
-              <w:t>AdminDashboard component; live event log display; scenario control panel</w:t>
-            </w:r>
-          </w:p>
-        </w:tc>
-      </w:tr>
-      <w:tr>
-        <w:tc>
-          <w:tcPr>
-            <w:tcW w:type="dxa" w:w="1725"/>
-          </w:tcPr>
-          <w:p>
-            <w:pPr>
-              <w:jc w:val="left"/>
-            </w:pPr>
-            <w:r>
-              <w:rPr>
-                <w:sz w:val="20"/>
-              </w:rPr>
-              <w:t>2025-07-28</w:t>
-            </w:r>
-          </w:p>
-        </w:tc>
-        <w:tc>
-          <w:tcPr>
-            <w:tcW w:type="dxa" w:w="1727"/>
-          </w:tcPr>
-          <w:p>
-            <w:pPr>
-              <w:jc w:val="left"/>
-            </w:pPr>
-            <w:r>
-              <w:rPr>
-                <w:sz w:val="20"/>
-              </w:rPr>
-              <w:t>Scenario Authoring – Fire scenarios (Class A–K)</w:t>
-            </w:r>
-          </w:p>
-        </w:tc>
-        <w:tc>
-          <w:tcPr>
-            <w:tcW w:type="dxa" w:w="1726"/>
-          </w:tcPr>
-          <w:p>
-            <w:pPr>
-              <w:jc w:val="left"/>
-            </w:pPr>
-            <w:r>
-              <w:rPr>
-                <w:sz w:val="20"/>
-              </w:rPr>
-              <w:t>8</w:t>
-            </w:r>
-          </w:p>
-        </w:tc>
-        <w:tc>
-          <w:tcPr>
-            <w:tcW w:type="dxa" w:w="1726"/>
-          </w:tcPr>
-          <w:p>
-            <w:pPr>
-              <w:jc w:val="left"/>
-            </w:pPr>
-            <w:r>
-              <w:rPr>
-                <w:sz w:val="20"/>
-              </w:rPr>
-              <w:t>John Hay</w:t>
-            </w:r>
-          </w:p>
-        </w:tc>
-        <w:tc>
-          <w:tcPr>
-            <w:tcW w:type="dxa" w:w="1726"/>
-          </w:tcPr>
-          <w:p>
-            <w:pPr>
-              <w:jc w:val="left"/>
-            </w:pPr>
-            <w:r>
-              <w:rPr>
-                <w:sz w:val="20"/>
-              </w:rPr>
-              <w:t>Five fire scenario JSON definitions with decision trees and failure nodes</w:t>
-            </w:r>
-          </w:p>
-        </w:tc>
-      </w:tr>
-      <w:tr>
-        <w:tc>
-          <w:tcPr>
-            <w:tcW w:type="dxa" w:w="1725"/>
-          </w:tcPr>
-          <w:p>
-            <w:pPr>
-              <w:jc w:val="left"/>
-            </w:pPr>
-            <w:r>
-              <w:rPr>
-                <w:sz w:val="20"/>
-              </w:rPr>
-              <w:t>2025-07-31</w:t>
-            </w:r>
-          </w:p>
-        </w:tc>
-        <w:tc>
-          <w:tcPr>
-            <w:tcW w:type="dxa" w:w="1727"/>
-          </w:tcPr>
-          <w:p>
-            <w:pPr>
-              <w:jc w:val="left"/>
-            </w:pPr>
-            <w:r>
-              <w:rPr>
-                <w:sz w:val="20"/>
-              </w:rPr>
-              <w:t>Admin Dashboard – real-time socket integration</w:t>
-            </w:r>
-          </w:p>
-        </w:tc>
-        <w:tc>
-          <w:tcPr>
-            <w:tcW w:type="dxa" w:w="1726"/>
-          </w:tcPr>
-          <w:p>
-            <w:pPr>
-              <w:jc w:val="left"/>
-            </w:pPr>
-            <w:r>
-              <w:rPr>
-                <w:sz w:val="20"/>
-              </w:rPr>
-              <w:t>6</w:t>
-            </w:r>
-          </w:p>
-        </w:tc>
-        <w:tc>
-          <w:tcPr>
-            <w:tcW w:type="dxa" w:w="1726"/>
-          </w:tcPr>
-          <w:p>
-            <w:pPr>
-              <w:jc w:val="left"/>
-            </w:pPr>
-            <w:r>
-              <w:rPr>
-                <w:sz w:val="20"/>
-              </w:rPr>
-              <w:t>Leo Wasiliew</w:t>
-            </w:r>
-          </w:p>
-        </w:tc>
-        <w:tc>
-          <w:tcPr>
-            <w:tcW w:type="dxa" w:w="1726"/>
-          </w:tcPr>
-          <w:p>
-            <w:pPr>
-              <w:jc w:val="left"/>
-            </w:pPr>
-            <w:r>
-              <w:rPr>
-                <w:sz w:val="20"/>
-              </w:rPr>
-              <w:t>Admin socket listeners; session state reflected in UI; trainee list panel</w:t>
-            </w:r>
-          </w:p>
-        </w:tc>
-      </w:tr>
-      <w:tr>
-        <w:tc>
-          <w:tcPr>
-            <w:tcW w:type="dxa" w:w="1725"/>
-          </w:tcPr>
-          <w:p>
-            <w:pPr>
-              <w:jc w:val="left"/>
-            </w:pPr>
-            <w:r>
-              <w:rPr>
-                <w:sz w:val="20"/>
-              </w:rPr>
-              <w:t>2025-08-04</w:t>
-            </w:r>
-          </w:p>
-        </w:tc>
-        <w:tc>
-          <w:tcPr>
-            <w:tcW w:type="dxa" w:w="1727"/>
-          </w:tcPr>
-          <w:p>
-            <w:pPr>
-              <w:jc w:val="left"/>
-            </w:pPr>
-            <w:r>
-              <w:rPr>
-                <w:sz w:val="20"/>
-              </w:rPr>
-              <w:t>Trainee Interface &amp; Actions</w:t>
-            </w:r>
-          </w:p>
-        </w:tc>
-        <w:tc>
-          <w:tcPr>
-            <w:tcW w:type="dxa" w:w="1726"/>
-          </w:tcPr>
-          <w:p>
-            <w:pPr>
-              <w:jc w:val="left"/>
-            </w:pPr>
-            <w:r>
-              <w:rPr>
-                <w:sz w:val="20"/>
-              </w:rPr>
-              <w:t>8</w:t>
-            </w:r>
-          </w:p>
-        </w:tc>
-        <w:tc>
-          <w:tcPr>
-            <w:tcW w:type="dxa" w:w="1726"/>
-          </w:tcPr>
-          <w:p>
-            <w:pPr>
-              <w:jc w:val="left"/>
-            </w:pPr>
-            <w:r>
-              <w:rPr>
-                <w:sz w:val="20"/>
-              </w:rPr>
-              <w:t>Leo Wasiliew</w:t>
-            </w:r>
-          </w:p>
-        </w:tc>
-        <w:tc>
-          <w:tcPr>
-            <w:tcW w:type="dxa" w:w="1726"/>
-          </w:tcPr>
-          <w:p>
-            <w:pPr>
-              <w:jc w:val="left"/>
-            </w:pPr>
-            <w:r>
-              <w:rPr>
-                <w:sz w:val="20"/>
-              </w:rPr>
-              <w:t>TraineeInterface component; action submission; live event log for trainees</w:t>
-            </w:r>
-          </w:p>
-        </w:tc>
-      </w:tr>
-      <w:tr>
-        <w:tc>
-          <w:tcPr>
-            <w:tcW w:type="dxa" w:w="1725"/>
-          </w:tcPr>
-          <w:p>
-            <w:pPr>
-              <w:jc w:val="left"/>
-            </w:pPr>
-            <w:r>
-              <w:rPr>
-                <w:sz w:val="20"/>
-              </w:rPr>
-              <w:t>2025-08-04</w:t>
-            </w:r>
-          </w:p>
-        </w:tc>
-        <w:tc>
-          <w:tcPr>
-            <w:tcW w:type="dxa" w:w="1727"/>
-          </w:tcPr>
-          <w:p>
-            <w:pPr>
-              <w:jc w:val="left"/>
-            </w:pPr>
-            <w:r>
-              <w:rPr>
-                <w:sz w:val="20"/>
-              </w:rPr>
-              <w:t>Scenario Authoring – Medical scenarios</w:t>
-            </w:r>
-          </w:p>
-        </w:tc>
-        <w:tc>
-          <w:tcPr>
-            <w:tcW w:type="dxa" w:w="1726"/>
-          </w:tcPr>
-          <w:p>
-            <w:pPr>
-              <w:jc w:val="left"/>
-            </w:pPr>
-            <w:r>
-              <w:rPr>
-                <w:sz w:val="20"/>
-              </w:rPr>
-              <w:t>8</w:t>
-            </w:r>
-          </w:p>
-        </w:tc>
-        <w:tc>
-          <w:tcPr>
-            <w:tcW w:type="dxa" w:w="1726"/>
-          </w:tcPr>
-          <w:p>
-            <w:pPr>
-              <w:jc w:val="left"/>
-            </w:pPr>
-            <w:r>
-              <w:rPr>
-                <w:sz w:val="20"/>
-              </w:rPr>
-              <w:t>John Hay</w:t>
-            </w:r>
-          </w:p>
-        </w:tc>
-        <w:tc>
-          <w:tcPr>
-            <w:tcW w:type="dxa" w:w="1726"/>
-          </w:tcPr>
-          <w:p>
-            <w:pPr>
-              <w:jc w:val="left"/>
-            </w:pPr>
-            <w:r>
-              <w:rPr>
-                <w:sz w:val="20"/>
-              </w:rPr>
-              <w:t>Medical emergency scenarios: Chest Pain, Stroke, Opioid Overdose, Seizure, Falls, etc.</w:t>
-            </w:r>
-          </w:p>
-        </w:tc>
-      </w:tr>
-      <w:tr>
-        <w:tc>
-          <w:tcPr>
-            <w:tcW w:type="dxa" w:w="1725"/>
-          </w:tcPr>
-          <w:p>
-            <w:pPr>
-              <w:jc w:val="left"/>
-            </w:pPr>
-            <w:r>
-              <w:rPr>
-                <w:sz w:val="20"/>
-              </w:rPr>
-              <w:t>2025-08-07</w:t>
-            </w:r>
-          </w:p>
-        </w:tc>
-        <w:tc>
-          <w:tcPr>
-            <w:tcW w:type="dxa" w:w="1727"/>
-          </w:tcPr>
-          <w:p>
-            <w:pPr>
-              <w:jc w:val="left"/>
-            </w:pPr>
-            <w:r>
-              <w:rPr>
-                <w:sz w:val="20"/>
-              </w:rPr>
-              <w:t>Trainee Interface – responsive design pass</w:t>
-            </w:r>
-          </w:p>
-        </w:tc>
-        <w:tc>
-          <w:tcPr>
-            <w:tcW w:type="dxa" w:w="1726"/>
-          </w:tcPr>
-          <w:p>
-            <w:pPr>
-              <w:jc w:val="left"/>
-            </w:pPr>
-            <w:r>
-              <w:rPr>
-                <w:sz w:val="20"/>
-              </w:rPr>
-              <w:t>5</w:t>
-            </w:r>
-          </w:p>
-        </w:tc>
-        <w:tc>
-          <w:tcPr>
-            <w:tcW w:type="dxa" w:w="1726"/>
-          </w:tcPr>
-          <w:p>
-            <w:pPr>
-              <w:jc w:val="left"/>
-            </w:pPr>
-            <w:r>
-              <w:rPr>
-                <w:sz w:val="20"/>
-              </w:rPr>
-              <w:t>Leo Wasiliew</w:t>
-            </w:r>
-          </w:p>
-        </w:tc>
-        <w:tc>
-          <w:tcPr>
-            <w:tcW w:type="dxa" w:w="1726"/>
-          </w:tcPr>
-          <w:p>
-            <w:pPr>
-              <w:jc w:val="left"/>
-            </w:pPr>
-            <w:r>
-              <w:rPr>
-                <w:sz w:val="20"/>
-              </w:rPr>
-              <w:t>Mobile-friendly layout; CSS refinements; TimelineDisplay component</w:t>
-            </w:r>
-          </w:p>
-        </w:tc>
-      </w:tr>
-      <w:tr>
-        <w:tc>
-          <w:tcPr>
-            <w:tcW w:type="dxa" w:w="1725"/>
-          </w:tcPr>
-          <w:p>
-            <w:pPr>
-              <w:jc w:val="left"/>
-            </w:pPr>
-            <w:r>
-              <w:rPr>
-                <w:sz w:val="20"/>
-              </w:rPr>
-              <w:t>2025-08-11</w:t>
-            </w:r>
-          </w:p>
-        </w:tc>
-        <w:tc>
-          <w:tcPr>
-            <w:tcW w:type="dxa" w:w="1727"/>
-          </w:tcPr>
-          <w:p>
-            <w:pPr>
-              <w:jc w:val="left"/>
-            </w:pPr>
-            <w:r>
-              <w:rPr>
-                <w:sz w:val="20"/>
-              </w:rPr>
-              <w:t>Scenario Integration &amp; Validation – initial pass</w:t>
-            </w:r>
-          </w:p>
-        </w:tc>
-        <w:tc>
-          <w:tcPr>
-            <w:tcW w:type="dxa" w:w="1726"/>
-          </w:tcPr>
-          <w:p>
-            <w:pPr>
-              <w:jc w:val="left"/>
-            </w:pPr>
-            <w:r>
-              <w:rPr>
-                <w:sz w:val="20"/>
-              </w:rPr>
-              <w:t>8</w:t>
-            </w:r>
-          </w:p>
-        </w:tc>
-        <w:tc>
-          <w:tcPr>
-            <w:tcW w:type="dxa" w:w="1726"/>
-          </w:tcPr>
-          <w:p>
-            <w:pPr>
-              <w:jc w:val="left"/>
-            </w:pPr>
-            <w:r>
-              <w:rPr>
-                <w:sz w:val="20"/>
-              </w:rPr>
-              <w:t>Tom Burchell, John Hay, Leo Wasiliew</w:t>
-            </w:r>
-          </w:p>
-        </w:tc>
-        <w:tc>
-          <w:tcPr>
-            <w:tcW w:type="dxa" w:w="1726"/>
-          </w:tcPr>
-          <w:p>
-            <w:pPr>
-              <w:jc w:val="left"/>
-            </w:pPr>
-            <w:r>
-              <w:rPr>
-                <w:sz w:val="20"/>
-              </w:rPr>
-              <w:t>End-to-end test of all 8 scenarios; socket flow verified; escalation timings checked</w:t>
-            </w:r>
-          </w:p>
-        </w:tc>
-      </w:tr>
-      <w:tr>
-        <w:tc>
-          <w:tcPr>
-            <w:tcW w:type="dxa" w:w="1725"/>
-          </w:tcPr>
-          <w:p>
-            <w:pPr>
-              <w:jc w:val="left"/>
-            </w:pPr>
-            <w:r>
-              <w:rPr>
-                <w:sz w:val="20"/>
-              </w:rPr>
-              <w:t>2025-08-14</w:t>
-            </w:r>
-          </w:p>
-        </w:tc>
-        <w:tc>
-          <w:tcPr>
-            <w:tcW w:type="dxa" w:w="1727"/>
-          </w:tcPr>
-          <w:p>
-            <w:pPr>
-              <w:jc w:val="left"/>
-            </w:pPr>
-            <w:r>
-              <w:rPr>
-                <w:sz w:val="20"/>
-              </w:rPr>
-              <w:t>Scenario Authoring – Environmental &amp; Security scenarios</w:t>
-            </w:r>
-          </w:p>
-        </w:tc>
-        <w:tc>
-          <w:tcPr>
-            <w:tcW w:type="dxa" w:w="1726"/>
-          </w:tcPr>
-          <w:p>
-            <w:pPr>
-              <w:jc w:val="left"/>
-            </w:pPr>
-            <w:r>
-              <w:rPr>
-                <w:sz w:val="20"/>
-              </w:rPr>
-              <w:t>8</w:t>
-            </w:r>
-          </w:p>
-        </w:tc>
-        <w:tc>
-          <w:tcPr>
-            <w:tcW w:type="dxa" w:w="1726"/>
-          </w:tcPr>
-          <w:p>
-            <w:pPr>
-              <w:jc w:val="left"/>
-            </w:pPr>
-            <w:r>
-              <w:rPr>
-                <w:sz w:val="20"/>
-              </w:rPr>
-              <w:t>John Hay</w:t>
-            </w:r>
-          </w:p>
-        </w:tc>
-        <w:tc>
-          <w:tcPr>
-            <w:tcW w:type="dxa" w:w="1726"/>
-          </w:tcPr>
-          <w:p>
-            <w:pPr>
-              <w:jc w:val="left"/>
-            </w:pPr>
-            <w:r>
-              <w:rPr>
-                <w:sz w:val="20"/>
-              </w:rPr>
-              <w:t>Environmental/Infrastructure and Security &amp; Threat JSON scenarios completed</w:t>
-            </w:r>
-          </w:p>
-        </w:tc>
-      </w:tr>
-      <w:tr>
-        <w:tc>
-          <w:tcPr>
-            <w:tcW w:type="dxa" w:w="1725"/>
-          </w:tcPr>
-          <w:p>
-            <w:pPr>
-              <w:jc w:val="left"/>
-            </w:pPr>
-            <w:r>
-              <w:rPr>
-                <w:sz w:val="20"/>
-              </w:rPr>
-              <w:t>2025-08-18</w:t>
-            </w:r>
-          </w:p>
-        </w:tc>
-        <w:tc>
-          <w:tcPr>
-            <w:tcW w:type="dxa" w:w="1727"/>
-          </w:tcPr>
-          <w:p>
-            <w:pPr>
-              <w:jc w:val="left"/>
-            </w:pPr>
-            <w:r>
-              <w:rPr>
-                <w:sz w:val="20"/>
-              </w:rPr>
-              <w:t>Deployment Pipeline – Docker &amp; CI</w:t>
-            </w:r>
-          </w:p>
-        </w:tc>
-        <w:tc>
-          <w:tcPr>
-            <w:tcW w:type="dxa" w:w="1726"/>
-          </w:tcPr>
-          <w:p>
-            <w:pPr>
-              <w:jc w:val="left"/>
-            </w:pPr>
-            <w:r>
-              <w:rPr>
-                <w:sz w:val="20"/>
-              </w:rPr>
-              <w:t>8</w:t>
-            </w:r>
-          </w:p>
-        </w:tc>
-        <w:tc>
-          <w:tcPr>
-            <w:tcW w:type="dxa" w:w="1726"/>
-          </w:tcPr>
-          <w:p>
-            <w:pPr>
-              <w:jc w:val="left"/>
-            </w:pPr>
-            <w:r>
-              <w:rPr>
-                <w:sz w:val="20"/>
-              </w:rPr>
-              <w:t>Tom Burchell, Kael Payette</w:t>
-            </w:r>
-          </w:p>
-        </w:tc>
-        <w:tc>
-          <w:tcPr>
-            <w:tcW w:type="dxa" w:w="1726"/>
-          </w:tcPr>
-          <w:p>
-            <w:pPr>
-              <w:jc w:val="left"/>
-            </w:pPr>
-            <w:r>
-              <w:rPr>
-                <w:sz w:val="20"/>
-              </w:rPr>
-              <w:t>Dockerfile; docker-compose; GitHub Actions CI workflow; lint and test jobs</w:t>
-            </w:r>
-          </w:p>
-        </w:tc>
-      </w:tr>
-      <w:tr>
-        <w:tc>
-          <w:tcPr>
-            <w:tcW w:type="dxa" w:w="1725"/>
-          </w:tcPr>
-          <w:p>
-            <w:pPr>
-              <w:jc w:val="left"/>
-            </w:pPr>
-            <w:r>
-              <w:rPr>
-                <w:sz w:val="20"/>
-              </w:rPr>
-              <w:t>2025-08-18</w:t>
-            </w:r>
-          </w:p>
-        </w:tc>
-        <w:tc>
-          <w:tcPr>
-            <w:tcW w:type="dxa" w:w="1727"/>
-          </w:tcPr>
-          <w:p>
-            <w:pPr>
-              <w:jc w:val="left"/>
-            </w:pPr>
-            <w:r>
-              <w:rPr>
-                <w:sz w:val="20"/>
-              </w:rPr>
-              <w:t>Scenario Integration – bug fixes &amp; re-testing</w:t>
-            </w:r>
-          </w:p>
-        </w:tc>
-        <w:tc>
-          <w:tcPr>
-            <w:tcW w:type="dxa" w:w="1726"/>
-          </w:tcPr>
-          <w:p>
-            <w:pPr>
-              <w:jc w:val="left"/>
-            </w:pPr>
-            <w:r>
-              <w:rPr>
-                <w:sz w:val="20"/>
-              </w:rPr>
-              <w:t>6</w:t>
-            </w:r>
-          </w:p>
-        </w:tc>
-        <w:tc>
-          <w:tcPr>
-            <w:tcW w:type="dxa" w:w="1726"/>
-          </w:tcPr>
-          <w:p>
-            <w:pPr>
-              <w:jc w:val="left"/>
-            </w:pPr>
-            <w:r>
-              <w:rPr>
-                <w:sz w:val="20"/>
-              </w:rPr>
-              <w:t>Tom Burchell, John Hay, Leo Wasiliew</w:t>
-            </w:r>
-          </w:p>
-        </w:tc>
-        <w:tc>
-          <w:tcPr>
-            <w:tcW w:type="dxa" w:w="1726"/>
-          </w:tcPr>
-          <w:p>
-            <w:pPr>
-              <w:jc w:val="left"/>
-            </w:pPr>
-            <w:r>
-              <w:rPr>
-                <w:sz w:val="20"/>
-              </w:rPr>
-              <w:t>Bug fixes from initial integration pass; scenario data corrections</w:t>
-            </w:r>
-          </w:p>
-        </w:tc>
-      </w:tr>
-      <w:tr>
-        <w:tc>
-          <w:tcPr>
-            <w:tcW w:type="dxa" w:w="1725"/>
-          </w:tcPr>
-          <w:p>
-            <w:pPr>
-              <w:jc w:val="left"/>
-            </w:pPr>
-            <w:r>
-              <w:rPr>
-                <w:sz w:val="20"/>
-              </w:rPr>
-              <w:t>2025-08-21</w:t>
-            </w:r>
-          </w:p>
-        </w:tc>
-        <w:tc>
-          <w:tcPr>
-            <w:tcW w:type="dxa" w:w="1727"/>
-          </w:tcPr>
-          <w:p>
-            <w:pPr>
-              <w:jc w:val="left"/>
-            </w:pPr>
-            <w:r>
-              <w:rPr>
-                <w:sz w:val="20"/>
-              </w:rPr>
-              <w:t>Deployment Pipeline – Render / Railway config</w:t>
+              <w:t>Fire &amp; Rescue Scenario Content (PRs #85–101)</w:t>
             </w:r>
           </w:p>
         </w:tc>
@@ -2135,7 +2073,7 @@
               <w:rPr>
                 <w:sz w:val="20"/>
               </w:rPr>
-              <w:t>render.yaml; railway.json; environment variable documentation; Procfile</w:t>
+              <w:t>Wildland/interface fire; structural fire; roadway/rail/air/marine fire; HazMat; vehicle/transportation fire; technical rescue; medical/EMS; search &amp; rescue; explosion; special environment; fireground complications; mass casualty; arson; fire training notional; psychological/post-incident; removed kiosk mode</w:t>
             </w:r>
           </w:p>
         </w:tc>
@@ -2153,7 +2091,7 @@
               <w:rPr>
                 <w:sz w:val="20"/>
               </w:rPr>
-              <w:t>2025-08-25</w:t>
+              <w:t>2026-04-08</w:t>
             </w:r>
           </w:p>
         </w:tc>
@@ -2169,7 +2107,7 @@
               <w:rPr>
                 <w:sz w:val="20"/>
               </w:rPr>
-              <w:t>Integration / E2E Testing</w:t>
+              <w:t>Law Enforcement – Patrol &amp; Traffic Scenarios (PRs #102–104)</w:t>
             </w:r>
           </w:p>
         </w:tc>
@@ -2185,335 +2123,7 @@
               <w:rPr>
                 <w:sz w:val="20"/>
               </w:rPr>
-              <w:t>8</w:t>
-            </w:r>
-          </w:p>
-        </w:tc>
-        <w:tc>
-          <w:tcPr>
-            <w:tcW w:type="dxa" w:w="1726"/>
-          </w:tcPr>
-          <w:p>
-            <w:pPr>
-              <w:jc w:val="left"/>
-            </w:pPr>
-            <w:r>
-              <w:rPr>
-                <w:sz w:val="20"/>
-              </w:rPr>
-              <w:t>Kael Payette, John Hay</w:t>
-            </w:r>
-          </w:p>
-        </w:tc>
-        <w:tc>
-          <w:tcPr>
-            <w:tcW w:type="dxa" w:w="1726"/>
-          </w:tcPr>
-          <w:p>
-            <w:pPr>
-              <w:jc w:val="left"/>
-            </w:pPr>
-            <w:r>
-              <w:rPr>
-                <w:sz w:val="20"/>
-              </w:rPr>
-              <w:t>Full system test suite; acceptance criteria validation; test report drafted</w:t>
-            </w:r>
-          </w:p>
-        </w:tc>
-      </w:tr>
-      <w:tr>
-        <w:tc>
-          <w:tcPr>
-            <w:tcW w:type="dxa" w:w="1725"/>
-          </w:tcPr>
-          <w:p>
-            <w:pPr>
-              <w:jc w:val="left"/>
-            </w:pPr>
-            <w:r>
-              <w:rPr>
-                <w:sz w:val="20"/>
-              </w:rPr>
-              <w:t>2025-08-25</w:t>
-            </w:r>
-          </w:p>
-        </w:tc>
-        <w:tc>
-          <w:tcPr>
-            <w:tcW w:type="dxa" w:w="1727"/>
-          </w:tcPr>
-          <w:p>
-            <w:pPr>
-              <w:jc w:val="left"/>
-            </w:pPr>
-            <w:r>
-              <w:rPr>
-                <w:sz w:val="20"/>
-              </w:rPr>
-              <w:t>Accessibility &amp; Responsive Pass</w:t>
-            </w:r>
-          </w:p>
-        </w:tc>
-        <w:tc>
-          <w:tcPr>
-            <w:tcW w:type="dxa" w:w="1726"/>
-          </w:tcPr>
-          <w:p>
-            <w:pPr>
-              <w:jc w:val="left"/>
-            </w:pPr>
-            <w:r>
-              <w:rPr>
-                <w:sz w:val="20"/>
-              </w:rPr>
-              <w:t>6</w:t>
-            </w:r>
-          </w:p>
-        </w:tc>
-        <w:tc>
-          <w:tcPr>
-            <w:tcW w:type="dxa" w:w="1726"/>
-          </w:tcPr>
-          <w:p>
-            <w:pPr>
-              <w:jc w:val="left"/>
-            </w:pPr>
-            <w:r>
-              <w:rPr>
-                <w:sz w:val="20"/>
-              </w:rPr>
-              <w:t>John Hay, Leo Wasiliew</w:t>
-            </w:r>
-          </w:p>
-        </w:tc>
-        <w:tc>
-          <w:tcPr>
-            <w:tcW w:type="dxa" w:w="1726"/>
-          </w:tcPr>
-          <w:p>
-            <w:pPr>
-              <w:jc w:val="left"/>
-            </w:pPr>
-            <w:r>
-              <w:rPr>
-                <w:sz w:val="20"/>
-              </w:rPr>
-              <w:t>WCAG 2.1 AA audit; keyboard navigation; colour contrast; ARIA labels</w:t>
-            </w:r>
-          </w:p>
-        </w:tc>
-      </w:tr>
-      <w:tr>
-        <w:tc>
-          <w:tcPr>
-            <w:tcW w:type="dxa" w:w="1725"/>
-          </w:tcPr>
-          <w:p>
-            <w:pPr>
-              <w:jc w:val="left"/>
-            </w:pPr>
-            <w:r>
-              <w:rPr>
-                <w:sz w:val="20"/>
-              </w:rPr>
-              <w:t>2025-08-25</w:t>
-            </w:r>
-          </w:p>
-        </w:tc>
-        <w:tc>
-          <w:tcPr>
-            <w:tcW w:type="dxa" w:w="1727"/>
-          </w:tcPr>
-          <w:p>
-            <w:pPr>
-              <w:jc w:val="left"/>
-            </w:pPr>
-            <w:r>
-              <w:rPr>
-                <w:sz w:val="20"/>
-              </w:rPr>
-              <w:t>Documentation Suite – README &amp; API Specification</w:t>
-            </w:r>
-          </w:p>
-        </w:tc>
-        <w:tc>
-          <w:tcPr>
-            <w:tcW w:type="dxa" w:w="1726"/>
-          </w:tcPr>
-          <w:p>
-            <w:pPr>
-              <w:jc w:val="left"/>
-            </w:pPr>
-            <w:r>
-              <w:rPr>
-                <w:sz w:val="20"/>
-              </w:rPr>
-              <w:t>6</w:t>
-            </w:r>
-          </w:p>
-        </w:tc>
-        <w:tc>
-          <w:tcPr>
-            <w:tcW w:type="dxa" w:w="1726"/>
-          </w:tcPr>
-          <w:p>
-            <w:pPr>
-              <w:jc w:val="left"/>
-            </w:pPr>
-            <w:r>
-              <w:rPr>
-                <w:sz w:val="20"/>
-              </w:rPr>
-              <w:t>Tom Burchell, Leo Wasiliew</w:t>
-            </w:r>
-          </w:p>
-        </w:tc>
-        <w:tc>
-          <w:tcPr>
-            <w:tcW w:type="dxa" w:w="1726"/>
-          </w:tcPr>
-          <w:p>
-            <w:pPr>
-              <w:jc w:val="left"/>
-            </w:pPr>
-            <w:r>
-              <w:rPr>
-                <w:sz w:val="20"/>
-              </w:rPr>
-              <w:t>Backend README; API_Specification.yaml; endpoint documentation</w:t>
-            </w:r>
-          </w:p>
-        </w:tc>
-      </w:tr>
-      <w:tr>
-        <w:tc>
-          <w:tcPr>
-            <w:tcW w:type="dxa" w:w="1725"/>
-          </w:tcPr>
-          <w:p>
-            <w:pPr>
-              <w:jc w:val="left"/>
-            </w:pPr>
-            <w:r>
-              <w:rPr>
-                <w:sz w:val="20"/>
-              </w:rPr>
-              <w:t>2025-08-28</w:t>
-            </w:r>
-          </w:p>
-        </w:tc>
-        <w:tc>
-          <w:tcPr>
-            <w:tcW w:type="dxa" w:w="1727"/>
-          </w:tcPr>
-          <w:p>
-            <w:pPr>
-              <w:jc w:val="left"/>
-            </w:pPr>
-            <w:r>
-              <w:rPr>
-                <w:sz w:val="20"/>
-              </w:rPr>
-              <w:t>Documentation Suite – Socket.IO Event Catalog &amp; Deployment Guide</w:t>
-            </w:r>
-          </w:p>
-        </w:tc>
-        <w:tc>
-          <w:tcPr>
-            <w:tcW w:type="dxa" w:w="1726"/>
-          </w:tcPr>
-          <w:p>
-            <w:pPr>
-              <w:jc w:val="left"/>
-            </w:pPr>
-            <w:r>
-              <w:rPr>
-                <w:sz w:val="20"/>
-              </w:rPr>
-              <w:t>5</w:t>
-            </w:r>
-          </w:p>
-        </w:tc>
-        <w:tc>
-          <w:tcPr>
-            <w:tcW w:type="dxa" w:w="1726"/>
-          </w:tcPr>
-          <w:p>
-            <w:pPr>
-              <w:jc w:val="left"/>
-            </w:pPr>
-            <w:r>
-              <w:rPr>
-                <w:sz w:val="20"/>
-              </w:rPr>
-              <w:t>Tom Burchell, Kael Payette</w:t>
-            </w:r>
-          </w:p>
-        </w:tc>
-        <w:tc>
-          <w:tcPr>
-            <w:tcW w:type="dxa" w:w="1726"/>
-          </w:tcPr>
-          <w:p>
-            <w:pPr>
-              <w:jc w:val="left"/>
-            </w:pPr>
-            <w:r>
-              <w:rPr>
-                <w:sz w:val="20"/>
-              </w:rPr>
-              <w:t>SocketIO_Event_Catalog.md; Deployment_Guide.md; Cloud_Deployment_Quickstart.md</w:t>
-            </w:r>
-          </w:p>
-        </w:tc>
-      </w:tr>
-      <w:tr>
-        <w:tc>
-          <w:tcPr>
-            <w:tcW w:type="dxa" w:w="1725"/>
-          </w:tcPr>
-          <w:p>
-            <w:pPr>
-              <w:jc w:val="left"/>
-            </w:pPr>
-            <w:r>
-              <w:rPr>
-                <w:sz w:val="20"/>
-              </w:rPr>
-              <w:t>2025-09-01</w:t>
-            </w:r>
-          </w:p>
-        </w:tc>
-        <w:tc>
-          <w:tcPr>
-            <w:tcW w:type="dxa" w:w="1727"/>
-          </w:tcPr>
-          <w:p>
-            <w:pPr>
-              <w:jc w:val="left"/>
-            </w:pPr>
-            <w:r>
-              <w:rPr>
-                <w:sz w:val="20"/>
-              </w:rPr>
-              <w:t>Cloud Deployment &amp; Smoke Test</w:t>
-            </w:r>
-          </w:p>
-        </w:tc>
-        <w:tc>
-          <w:tcPr>
-            <w:tcW w:type="dxa" w:w="1726"/>
-          </w:tcPr>
-          <w:p>
-            <w:pPr>
-              <w:jc w:val="left"/>
-            </w:pPr>
-            <w:r>
-              <w:rPr>
-                <w:sz w:val="20"/>
-              </w:rPr>
-              <w:t>6</w:t>
+              <w:t>3</w:t>
             </w:r>
           </w:p>
         </w:tc>
@@ -2545,7 +2155,7 @@
               <w:rPr>
                 <w:sz w:val="20"/>
               </w:rPr>
-              <w:t>Production deployment to cloud platform; smoke tests; live URL verified</w:t>
+              <w:t>12 police patrol and first-response scenarios; 12 Canada-specific traffic and roadway law enforcement scenarios; Criminal Code and major crime scenarios (Sections 2.1–2.2) created</w:t>
             </w:r>
           </w:p>
         </w:tc>
@@ -2563,7 +2173,7 @@
               <w:rPr>
                 <w:sz w:val="20"/>
               </w:rPr>
-              <w:t>2025-09-01</w:t>
+              <w:t>2026-04-09</w:t>
             </w:r>
           </w:p>
         </w:tc>
@@ -2579,499 +2189,7 @@
               <w:rPr>
                 <w:sz w:val="20"/>
               </w:rPr>
-              <w:t>Integration testing – final round</w:t>
-            </w:r>
-          </w:p>
-        </w:tc>
-        <w:tc>
-          <w:tcPr>
-            <w:tcW w:type="dxa" w:w="1726"/>
-          </w:tcPr>
-          <w:p>
-            <w:pPr>
-              <w:jc w:val="left"/>
-            </w:pPr>
-            <w:r>
-              <w:rPr>
-                <w:sz w:val="20"/>
-              </w:rPr>
-              <w:t>5</w:t>
-            </w:r>
-          </w:p>
-        </w:tc>
-        <w:tc>
-          <w:tcPr>
-            <w:tcW w:type="dxa" w:w="1726"/>
-          </w:tcPr>
-          <w:p>
-            <w:pPr>
-              <w:jc w:val="left"/>
-            </w:pPr>
-            <w:r>
-              <w:rPr>
-                <w:sz w:val="20"/>
-              </w:rPr>
-              <w:t>Kael Payette, John Hay</w:t>
-            </w:r>
-          </w:p>
-        </w:tc>
-        <w:tc>
-          <w:tcPr>
-            <w:tcW w:type="dxa" w:w="1726"/>
-          </w:tcPr>
-          <w:p>
-            <w:pPr>
-              <w:jc w:val="left"/>
-            </w:pPr>
-            <w:r>
-              <w:rPr>
-                <w:sz w:val="20"/>
-              </w:rPr>
-              <w:t>Final acceptance test run; sign-off checklist completed; issues logged</w:t>
-            </w:r>
-          </w:p>
-        </w:tc>
-      </w:tr>
-      <w:tr>
-        <w:tc>
-          <w:tcPr>
-            <w:tcW w:type="dxa" w:w="1725"/>
-          </w:tcPr>
-          <w:p>
-            <w:pPr>
-              <w:jc w:val="left"/>
-            </w:pPr>
-            <w:r>
-              <w:rPr>
-                <w:sz w:val="20"/>
-              </w:rPr>
-              <w:t>2025-09-04</w:t>
-            </w:r>
-          </w:p>
-        </w:tc>
-        <w:tc>
-          <w:tcPr>
-            <w:tcW w:type="dxa" w:w="1727"/>
-          </w:tcPr>
-          <w:p>
-            <w:pPr>
-              <w:jc w:val="left"/>
-            </w:pPr>
-            <w:r>
-              <w:rPr>
-                <w:sz w:val="20"/>
-              </w:rPr>
-              <w:t>ADR &amp; supplementary documentation</w:t>
-            </w:r>
-          </w:p>
-        </w:tc>
-        <w:tc>
-          <w:tcPr>
-            <w:tcW w:type="dxa" w:w="1726"/>
-          </w:tcPr>
-          <w:p>
-            <w:pPr>
-              <w:jc w:val="left"/>
-            </w:pPr>
-            <w:r>
-              <w:rPr>
-                <w:sz w:val="20"/>
-              </w:rPr>
-              <w:t>4</w:t>
-            </w:r>
-          </w:p>
-        </w:tc>
-        <w:tc>
-          <w:tcPr>
-            <w:tcW w:type="dxa" w:w="1726"/>
-          </w:tcPr>
-          <w:p>
-            <w:pPr>
-              <w:jc w:val="left"/>
-            </w:pPr>
-            <w:r>
-              <w:rPr>
-                <w:sz w:val="20"/>
-              </w:rPr>
-              <w:t>All Team</w:t>
-            </w:r>
-          </w:p>
-        </w:tc>
-        <w:tc>
-          <w:tcPr>
-            <w:tcW w:type="dxa" w:w="1726"/>
-          </w:tcPr>
-          <w:p>
-            <w:pPr>
-              <w:jc w:val="left"/>
-            </w:pPr>
-            <w:r>
-              <w:rPr>
-                <w:sz w:val="20"/>
-              </w:rPr>
-              <w:t>ADR-001 Stack Selection written; Kickoff Meeting Agenda finalised</w:t>
-            </w:r>
-          </w:p>
-        </w:tc>
-      </w:tr>
-      <w:tr>
-        <w:tc>
-          <w:tcPr>
-            <w:tcW w:type="dxa" w:w="1725"/>
-          </w:tcPr>
-          <w:p>
-            <w:pPr>
-              <w:jc w:val="left"/>
-            </w:pPr>
-            <w:r>
-              <w:rPr>
-                <w:sz w:val="20"/>
-              </w:rPr>
-              <w:t>2025-09-08</w:t>
-            </w:r>
-          </w:p>
-        </w:tc>
-        <w:tc>
-          <w:tcPr>
-            <w:tcW w:type="dxa" w:w="1727"/>
-          </w:tcPr>
-          <w:p>
-            <w:pPr>
-              <w:jc w:val="left"/>
-            </w:pPr>
-            <w:r>
-              <w:rPr>
-                <w:sz w:val="20"/>
-              </w:rPr>
-              <w:t>Demo Preparation</w:t>
-            </w:r>
-          </w:p>
-        </w:tc>
-        <w:tc>
-          <w:tcPr>
-            <w:tcW w:type="dxa" w:w="1726"/>
-          </w:tcPr>
-          <w:p>
-            <w:pPr>
-              <w:jc w:val="left"/>
-            </w:pPr>
-            <w:r>
-              <w:rPr>
-                <w:sz w:val="20"/>
-              </w:rPr>
-              <w:t>6</w:t>
-            </w:r>
-          </w:p>
-        </w:tc>
-        <w:tc>
-          <w:tcPr>
-            <w:tcW w:type="dxa" w:w="1726"/>
-          </w:tcPr>
-          <w:p>
-            <w:pPr>
-              <w:jc w:val="left"/>
-            </w:pPr>
-            <w:r>
-              <w:rPr>
-                <w:sz w:val="20"/>
-              </w:rPr>
-              <w:t>All Team</w:t>
-            </w:r>
-          </w:p>
-        </w:tc>
-        <w:tc>
-          <w:tcPr>
-            <w:tcW w:type="dxa" w:w="1726"/>
-          </w:tcPr>
-          <w:p>
-            <w:pPr>
-              <w:jc w:val="left"/>
-            </w:pPr>
-            <w:r>
-              <w:rPr>
-                <w:sz w:val="20"/>
-              </w:rPr>
-              <w:t>Demo script written; rehearsal run; slide deck finalised</w:t>
-            </w:r>
-          </w:p>
-        </w:tc>
-      </w:tr>
-      <w:tr>
-        <w:tc>
-          <w:tcPr>
-            <w:tcW w:type="dxa" w:w="1725"/>
-          </w:tcPr>
-          <w:p>
-            <w:pPr>
-              <w:jc w:val="left"/>
-            </w:pPr>
-            <w:r>
-              <w:rPr>
-                <w:sz w:val="20"/>
-              </w:rPr>
-              <w:t>2025-09-11</w:t>
-            </w:r>
-          </w:p>
-        </w:tc>
-        <w:tc>
-          <w:tcPr>
-            <w:tcW w:type="dxa" w:w="1727"/>
-          </w:tcPr>
-          <w:p>
-            <w:pPr>
-              <w:jc w:val="left"/>
-            </w:pPr>
-            <w:r>
-              <w:rPr>
-                <w:sz w:val="20"/>
-              </w:rPr>
-              <w:t>Final Presentation &amp; Project Submission</w:t>
-            </w:r>
-          </w:p>
-        </w:tc>
-        <w:tc>
-          <w:tcPr>
-            <w:tcW w:type="dxa" w:w="1726"/>
-          </w:tcPr>
-          <w:p>
-            <w:pPr>
-              <w:jc w:val="left"/>
-            </w:pPr>
-            <w:r>
-              <w:rPr>
-                <w:sz w:val="20"/>
-              </w:rPr>
-              <w:t>5</w:t>
-            </w:r>
-          </w:p>
-        </w:tc>
-        <w:tc>
-          <w:tcPr>
-            <w:tcW w:type="dxa" w:w="1726"/>
-          </w:tcPr>
-          <w:p>
-            <w:pPr>
-              <w:jc w:val="left"/>
-            </w:pPr>
-            <w:r>
-              <w:rPr>
-                <w:sz w:val="20"/>
-              </w:rPr>
-              <w:t>All Team</w:t>
-            </w:r>
-          </w:p>
-        </w:tc>
-        <w:tc>
-          <w:tcPr>
-            <w:tcW w:type="dxa" w:w="1726"/>
-          </w:tcPr>
-          <w:p>
-            <w:pPr>
-              <w:jc w:val="left"/>
-            </w:pPr>
-            <w:r>
-              <w:rPr>
-                <w:sz w:val="20"/>
-              </w:rPr>
-              <w:t>Live demo delivered to instructor; project artefacts submitted</w:t>
-            </w:r>
-          </w:p>
-        </w:tc>
-      </w:tr>
-      <w:tr>
-        <w:tc>
-          <w:tcPr>
-            <w:tcW w:type="dxa" w:w="1725"/>
-          </w:tcPr>
-          <w:p>
-            <w:pPr>
-              <w:jc w:val="left"/>
-            </w:pPr>
-            <w:r>
-              <w:rPr>
-                <w:sz w:val="20"/>
-              </w:rPr>
-              <w:t>2025-09-14</w:t>
-            </w:r>
-          </w:p>
-        </w:tc>
-        <w:tc>
-          <w:tcPr>
-            <w:tcW w:type="dxa" w:w="1727"/>
-          </w:tcPr>
-          <w:p>
-            <w:pPr>
-              <w:jc w:val="left"/>
-            </w:pPr>
-            <w:r>
-              <w:rPr>
-                <w:sz w:val="20"/>
-              </w:rPr>
-              <w:t>Post-delivery retrospective</w:t>
-            </w:r>
-          </w:p>
-        </w:tc>
-        <w:tc>
-          <w:tcPr>
-            <w:tcW w:type="dxa" w:w="1726"/>
-          </w:tcPr>
-          <w:p>
-            <w:pPr>
-              <w:jc w:val="left"/>
-            </w:pPr>
-            <w:r>
-              <w:rPr>
-                <w:sz w:val="20"/>
-              </w:rPr>
-              <w:t>2</w:t>
-            </w:r>
-          </w:p>
-        </w:tc>
-        <w:tc>
-          <w:tcPr>
-            <w:tcW w:type="dxa" w:w="1726"/>
-          </w:tcPr>
-          <w:p>
-            <w:pPr>
-              <w:jc w:val="left"/>
-            </w:pPr>
-            <w:r>
-              <w:rPr>
-                <w:sz w:val="20"/>
-              </w:rPr>
-              <w:t>All Team (Lead: Kael Payette)</w:t>
-            </w:r>
-          </w:p>
-        </w:tc>
-        <w:tc>
-          <w:tcPr>
-            <w:tcW w:type="dxa" w:w="1726"/>
-          </w:tcPr>
-          <w:p>
-            <w:pPr>
-              <w:jc w:val="left"/>
-            </w:pPr>
-            <w:r>
-              <w:rPr>
-                <w:sz w:val="20"/>
-              </w:rPr>
-              <w:t>Lessons-learned session; backlog of enhancements documented</w:t>
-            </w:r>
-          </w:p>
-        </w:tc>
-      </w:tr>
-      <w:tr>
-        <w:tc>
-          <w:tcPr>
-            <w:tcW w:type="dxa" w:w="1725"/>
-          </w:tcPr>
-          <w:p>
-            <w:pPr>
-              <w:jc w:val="left"/>
-            </w:pPr>
-            <w:r>
-              <w:rPr>
-                <w:sz w:val="20"/>
-              </w:rPr>
-              <w:t>2025-10-02</w:t>
-            </w:r>
-          </w:p>
-        </w:tc>
-        <w:tc>
-          <w:tcPr>
-            <w:tcW w:type="dxa" w:w="1727"/>
-          </w:tcPr>
-          <w:p>
-            <w:pPr>
-              <w:jc w:val="left"/>
-            </w:pPr>
-            <w:r>
-              <w:rPr>
-                <w:sz w:val="20"/>
-              </w:rPr>
-              <w:t>Post-delivery: scenario content expansion – JSON docs</w:t>
-            </w:r>
-          </w:p>
-        </w:tc>
-        <w:tc>
-          <w:tcPr>
-            <w:tcW w:type="dxa" w:w="1726"/>
-          </w:tcPr>
-          <w:p>
-            <w:pPr>
-              <w:jc w:val="left"/>
-            </w:pPr>
-            <w:r>
-              <w:rPr>
-                <w:sz w:val="20"/>
-              </w:rPr>
-              <w:t>6</w:t>
-            </w:r>
-          </w:p>
-        </w:tc>
-        <w:tc>
-          <w:tcPr>
-            <w:tcW w:type="dxa" w:w="1726"/>
-          </w:tcPr>
-          <w:p>
-            <w:pPr>
-              <w:jc w:val="left"/>
-            </w:pPr>
-            <w:r>
-              <w:rPr>
-                <w:sz w:val="20"/>
-              </w:rPr>
-              <w:t>John Hay</w:t>
-            </w:r>
-          </w:p>
-        </w:tc>
-        <w:tc>
-          <w:tcPr>
-            <w:tcW w:type="dxa" w:w="1726"/>
-          </w:tcPr>
-          <w:p>
-            <w:pPr>
-              <w:jc w:val="left"/>
-            </w:pPr>
-            <w:r>
-              <w:rPr>
-                <w:sz w:val="20"/>
-              </w:rPr>
-              <w:t>Expanded and refined scenario decision-tree documents for JSON directory</w:t>
-            </w:r>
-          </w:p>
-        </w:tc>
-      </w:tr>
-      <w:tr>
-        <w:tc>
-          <w:tcPr>
-            <w:tcW w:type="dxa" w:w="1725"/>
-          </w:tcPr>
-          <w:p>
-            <w:pPr>
-              <w:jc w:val="left"/>
-            </w:pPr>
-            <w:r>
-              <w:rPr>
-                <w:sz w:val="20"/>
-              </w:rPr>
-              <w:t>2025-10-15</w:t>
-            </w:r>
-          </w:p>
-        </w:tc>
-        <w:tc>
-          <w:tcPr>
-            <w:tcW w:type="dxa" w:w="1727"/>
-          </w:tcPr>
-          <w:p>
-            <w:pPr>
-              <w:jc w:val="left"/>
-            </w:pPr>
-            <w:r>
-              <w:rPr>
-                <w:sz w:val="20"/>
-              </w:rPr>
-              <w:t>Post-delivery: backend security hardening</w:t>
+              <w:t>Law Enforcement Expansion &amp; Answer Randomization (PRs #105–112, #106, #114)</w:t>
             </w:r>
           </w:p>
         </w:tc>
@@ -3119,7 +2237,7 @@
               <w:rPr>
                 <w:sz w:val="20"/>
               </w:rPr>
-              <w:t>Auth middleware review; rate limiting; security config tightening</w:t>
+              <w:t>Mental health/crisis intervention; Indigenous/remote policing; public disorder; drugs/organized crime; search/arrest; Charter/legal; domestic/family; youth/school/cybercrime; emergency/disaster; officer safety; post-incident/investigative; education scenarios; answer order randomized on each node</w:t>
             </w:r>
           </w:p>
         </w:tc>
@@ -3137,7 +2255,7 @@
               <w:rPr>
                 <w:sz w:val="20"/>
               </w:rPr>
-              <w:t>2025-11-10</w:t>
+              <w:t>2026-04-10</w:t>
             </w:r>
           </w:p>
         </w:tc>
@@ -3153,335 +2271,7 @@
               <w:rPr>
                 <w:sz w:val="20"/>
               </w:rPr>
-              <w:t>Post-delivery: frontend UI polish</w:t>
-            </w:r>
-          </w:p>
-        </w:tc>
-        <w:tc>
-          <w:tcPr>
-            <w:tcW w:type="dxa" w:w="1726"/>
-          </w:tcPr>
-          <w:p>
-            <w:pPr>
-              <w:jc w:val="left"/>
-            </w:pPr>
-            <w:r>
-              <w:rPr>
-                <w:sz w:val="20"/>
-              </w:rPr>
-              <w:t>4</w:t>
-            </w:r>
-          </w:p>
-        </w:tc>
-        <w:tc>
-          <w:tcPr>
-            <w:tcW w:type="dxa" w:w="1726"/>
-          </w:tcPr>
-          <w:p>
-            <w:pPr>
-              <w:jc w:val="left"/>
-            </w:pPr>
-            <w:r>
-              <w:rPr>
-                <w:sz w:val="20"/>
-              </w:rPr>
-              <w:t>Leo Wasiliew</w:t>
-            </w:r>
-          </w:p>
-        </w:tc>
-        <w:tc>
-          <w:tcPr>
-            <w:tcW w:type="dxa" w:w="1726"/>
-          </w:tcPr>
-          <w:p>
-            <w:pPr>
-              <w:jc w:val="left"/>
-            </w:pPr>
-            <w:r>
-              <w:rPr>
-                <w:sz w:val="20"/>
-              </w:rPr>
-              <w:t>UI refinements; component accessibility improvements; CSS clean-up</w:t>
-            </w:r>
-          </w:p>
-        </w:tc>
-      </w:tr>
-      <w:tr>
-        <w:tc>
-          <w:tcPr>
-            <w:tcW w:type="dxa" w:w="1725"/>
-          </w:tcPr>
-          <w:p>
-            <w:pPr>
-              <w:jc w:val="left"/>
-            </w:pPr>
-            <w:r>
-              <w:rPr>
-                <w:sz w:val="20"/>
-              </w:rPr>
-              <w:t>2025-12-05</w:t>
-            </w:r>
-          </w:p>
-        </w:tc>
-        <w:tc>
-          <w:tcPr>
-            <w:tcW w:type="dxa" w:w="1727"/>
-          </w:tcPr>
-          <w:p>
-            <w:pPr>
-              <w:jc w:val="left"/>
-            </w:pPr>
-            <w:r>
-              <w:rPr>
-                <w:sz w:val="20"/>
-              </w:rPr>
-              <w:t>Post-delivery: additional scenario JSON content</w:t>
-            </w:r>
-          </w:p>
-        </w:tc>
-        <w:tc>
-          <w:tcPr>
-            <w:tcW w:type="dxa" w:w="1726"/>
-          </w:tcPr>
-          <w:p>
-            <w:pPr>
-              <w:jc w:val="left"/>
-            </w:pPr>
-            <w:r>
-              <w:rPr>
-                <w:sz w:val="20"/>
-              </w:rPr>
-              <w:t>8</w:t>
-            </w:r>
-          </w:p>
-        </w:tc>
-        <w:tc>
-          <w:tcPr>
-            <w:tcW w:type="dxa" w:w="1726"/>
-          </w:tcPr>
-          <w:p>
-            <w:pPr>
-              <w:jc w:val="left"/>
-            </w:pPr>
-            <w:r>
-              <w:rPr>
-                <w:sz w:val="20"/>
-              </w:rPr>
-              <w:t>John Hay</w:t>
-            </w:r>
-          </w:p>
-        </w:tc>
-        <w:tc>
-          <w:tcPr>
-            <w:tcW w:type="dxa" w:w="1726"/>
-          </w:tcPr>
-          <w:p>
-            <w:pPr>
-              <w:jc w:val="left"/>
-            </w:pPr>
-            <w:r>
-              <w:rPr>
-                <w:sz w:val="20"/>
-              </w:rPr>
-              <w:t>Additional Medical, Fire, Environmental and Security scenario documents added</w:t>
-            </w:r>
-          </w:p>
-        </w:tc>
-      </w:tr>
-      <w:tr>
-        <w:tc>
-          <w:tcPr>
-            <w:tcW w:type="dxa" w:w="1725"/>
-          </w:tcPr>
-          <w:p>
-            <w:pPr>
-              <w:jc w:val="left"/>
-            </w:pPr>
-            <w:r>
-              <w:rPr>
-                <w:sz w:val="20"/>
-              </w:rPr>
-              <w:t>2026-01-20</w:t>
-            </w:r>
-          </w:p>
-        </w:tc>
-        <w:tc>
-          <w:tcPr>
-            <w:tcW w:type="dxa" w:w="1727"/>
-          </w:tcPr>
-          <w:p>
-            <w:pPr>
-              <w:jc w:val="left"/>
-            </w:pPr>
-            <w:r>
-              <w:rPr>
-                <w:sz w:val="20"/>
-              </w:rPr>
-              <w:t>Repository clean-up &amp; asset organisation</w:t>
-            </w:r>
-          </w:p>
-        </w:tc>
-        <w:tc>
-          <w:tcPr>
-            <w:tcW w:type="dxa" w:w="1726"/>
-          </w:tcPr>
-          <w:p>
-            <w:pPr>
-              <w:jc w:val="left"/>
-            </w:pPr>
-            <w:r>
-              <w:rPr>
-                <w:sz w:val="20"/>
-              </w:rPr>
-              <w:t>3</w:t>
-            </w:r>
-          </w:p>
-        </w:tc>
-        <w:tc>
-          <w:tcPr>
-            <w:tcW w:type="dxa" w:w="1726"/>
-          </w:tcPr>
-          <w:p>
-            <w:pPr>
-              <w:jc w:val="left"/>
-            </w:pPr>
-            <w:r>
-              <w:rPr>
-                <w:sz w:val="20"/>
-              </w:rPr>
-              <w:t>Kael Payette</w:t>
-            </w:r>
-          </w:p>
-        </w:tc>
-        <w:tc>
-          <w:tcPr>
-            <w:tcW w:type="dxa" w:w="1726"/>
-          </w:tcPr>
-          <w:p>
-            <w:pPr>
-              <w:jc w:val="left"/>
-            </w:pPr>
-            <w:r>
-              <w:rPr>
-                <w:sz w:val="20"/>
-              </w:rPr>
-              <w:t>Images and assets organised; repo structure tidied; .gitignore reviewed</w:t>
-            </w:r>
-          </w:p>
-        </w:tc>
-      </w:tr>
-      <w:tr>
-        <w:tc>
-          <w:tcPr>
-            <w:tcW w:type="dxa" w:w="1725"/>
-          </w:tcPr>
-          <w:p>
-            <w:pPr>
-              <w:jc w:val="left"/>
-            </w:pPr>
-            <w:r>
-              <w:rPr>
-                <w:sz w:val="20"/>
-              </w:rPr>
-              <w:t>2026-02-14</w:t>
-            </w:r>
-          </w:p>
-        </w:tc>
-        <w:tc>
-          <w:tcPr>
-            <w:tcW w:type="dxa" w:w="1727"/>
-          </w:tcPr>
-          <w:p>
-            <w:pPr>
-              <w:jc w:val="left"/>
-            </w:pPr>
-            <w:r>
-              <w:rPr>
-                <w:sz w:val="20"/>
-              </w:rPr>
-              <w:t>Documentation review &amp; updates</w:t>
-            </w:r>
-          </w:p>
-        </w:tc>
-        <w:tc>
-          <w:tcPr>
-            <w:tcW w:type="dxa" w:w="1726"/>
-          </w:tcPr>
-          <w:p>
-            <w:pPr>
-              <w:jc w:val="left"/>
-            </w:pPr>
-            <w:r>
-              <w:rPr>
-                <w:sz w:val="20"/>
-              </w:rPr>
-              <w:t>4</w:t>
-            </w:r>
-          </w:p>
-        </w:tc>
-        <w:tc>
-          <w:tcPr>
-            <w:tcW w:type="dxa" w:w="1726"/>
-          </w:tcPr>
-          <w:p>
-            <w:pPr>
-              <w:jc w:val="left"/>
-            </w:pPr>
-            <w:r>
-              <w:rPr>
-                <w:sz w:val="20"/>
-              </w:rPr>
-              <w:t>All Team</w:t>
-            </w:r>
-          </w:p>
-        </w:tc>
-        <w:tc>
-          <w:tcPr>
-            <w:tcW w:type="dxa" w:w="1726"/>
-          </w:tcPr>
-          <w:p>
-            <w:pPr>
-              <w:jc w:val="left"/>
-            </w:pPr>
-            <w:r>
-              <w:rPr>
-                <w:sz w:val="20"/>
-              </w:rPr>
-              <w:t>Reviewed and updated all documentation to reflect post-delivery changes</w:t>
-            </w:r>
-          </w:p>
-        </w:tc>
-      </w:tr>
-      <w:tr>
-        <w:tc>
-          <w:tcPr>
-            <w:tcW w:type="dxa" w:w="1725"/>
-          </w:tcPr>
-          <w:p>
-            <w:pPr>
-              <w:jc w:val="left"/>
-            </w:pPr>
-            <w:r>
-              <w:rPr>
-                <w:sz w:val="20"/>
-              </w:rPr>
-              <w:t>2026-03-15</w:t>
-            </w:r>
-          </w:p>
-        </w:tc>
-        <w:tc>
-          <w:tcPr>
-            <w:tcW w:type="dxa" w:w="1727"/>
-          </w:tcPr>
-          <w:p>
-            <w:pPr>
-              <w:jc w:val="left"/>
-            </w:pPr>
-            <w:r>
-              <w:rPr>
-                <w:sz w:val="20"/>
-              </w:rPr>
-              <w:t>Project time log compilation &amp; submission</w:t>
+              <w:t>Final Self-Reflection Report – Create &amp; Correct (PRs #116–117)</w:t>
             </w:r>
           </w:p>
         </w:tc>
@@ -3513,7 +2303,7 @@
               <w:rPr>
                 <w:sz w:val="20"/>
               </w:rPr>
-              <w:t>All Team</w:t>
+              <w:t>Tom Burchell</w:t>
             </w:r>
           </w:p>
         </w:tc>
@@ -3529,7 +2319,7 @@
               <w:rPr>
                 <w:sz w:val="20"/>
               </w:rPr>
-              <w:t>Project time logs compiled from Gantt and project records; template filled and submitted</w:t>
+              <w:t>SIRE_FinalSelfReflection_TomBurchell.docx created; factual inaccuracies corrected in Socket.IO event names, session creation flow, trainee join flow, and scoring description</w:t>
             </w:r>
           </w:p>
         </w:tc>

</xml_diff>

<commit_message>
Merge origin/main into branch, resolving demoScenarios.js conflict (keep both Education and Police post-incident scenarios)
Agent-Logs-Url: https://github.com/Anaxagorius/S.I.R.E./sessions/b17a7010-d892-4c6f-a9f3-228712b20024

Co-authored-by: Anaxagorius <188515693+Anaxagorius@users.noreply.github.com>
</commit_message>
<xml_diff>
--- a/PROG 3300 - project_time_log_filled.docx
+++ b/PROG 3300 - project_time_log_filled.docx
@@ -45,6 +45,10 @@
           </w:tcPr>
           <w:p>
             <w:r>
+              <w:rPr>
+                <w:b/>
+                <w:sz w:val="20"/>
+              </w:rPr>
               <w:t>Date</w:t>
             </w:r>
           </w:p>
@@ -55,6 +59,10 @@
           </w:tcPr>
           <w:p>
             <w:r>
+              <w:rPr>
+                <w:b/>
+                <w:sz w:val="20"/>
+              </w:rPr>
               <w:t>Task Description</w:t>
             </w:r>
           </w:p>
@@ -65,6 +73,10 @@
           </w:tcPr>
           <w:p>
             <w:r>
+              <w:rPr>
+                <w:b/>
+                <w:sz w:val="20"/>
+              </w:rPr>
               <w:t>Time Spent (Hours)</w:t>
             </w:r>
           </w:p>
@@ -75,6 +87,10 @@
           </w:tcPr>
           <w:p>
             <w:r>
+              <w:rPr>
+                <w:b/>
+                <w:sz w:val="20"/>
+              </w:rPr>
               <w:t>Assigned To</w:t>
             </w:r>
           </w:p>
@@ -85,6 +101,10 @@
           </w:tcPr>
           <w:p>
             <w:r>
+              <w:rPr>
+                <w:b/>
+                <w:sz w:val="20"/>
+              </w:rPr>
               <w:t>Notes</w:t>
             </w:r>
           </w:p>
@@ -103,7 +123,7 @@
               <w:rPr>
                 <w:sz w:val="20"/>
               </w:rPr>
-              <w:t>2025-06-16</w:t>
+              <w:t>2026-01-28</w:t>
             </w:r>
           </w:p>
         </w:tc>
@@ -119,7 +139,7 @@
               <w:rPr>
                 <w:sz w:val="20"/>
               </w:rPr>
-              <w:t>Project Kickoff &amp; Requirements Finalization</w:t>
+              <w:t>Initial Project Setup &amp; S.I.R.E. Foundation</w:t>
             </w:r>
           </w:p>
         </w:tc>
@@ -135,7 +155,7 @@
               <w:rPr>
                 <w:sz w:val="20"/>
               </w:rPr>
-              <w:t>10</w:t>
+              <w:t>3</w:t>
             </w:r>
           </w:p>
         </w:tc>
@@ -151,7 +171,7 @@
               <w:rPr>
                 <w:sz w:val="20"/>
               </w:rPr>
-              <w:t>All Team (Lead: Kael Payette)</w:t>
+              <w:t>Tom Burchell</w:t>
             </w:r>
           </w:p>
         </w:tc>
@@ -167,7 +187,7 @@
               <w:rPr>
                 <w:sz w:val="20"/>
               </w:rPr>
-              <w:t>Kickoff meeting; project scope defined; SMART objectives agreed; initial risk log drafted</w:t>
+              <w:t>Initial commit: project structure, README, backend skeleton, S.I.R.E. Incident Response Environment Simulator concept established</w:t>
             </w:r>
           </w:p>
         </w:tc>
@@ -185,7 +205,7 @@
               <w:rPr>
                 <w:sz w:val="20"/>
               </w:rPr>
-              <w:t>2025-06-18</w:t>
+              <w:t>2026-02-04</w:t>
             </w:r>
           </w:p>
         </w:tc>
@@ -201,7 +221,7 @@
               <w:rPr>
                 <w:sz w:val="20"/>
               </w:rPr>
-              <w:t>Requirements Finalization – continued</w:t>
+              <w:t>Core Backend – Scenarios, Socket.IO &amp; Security (PRs #1–3)</w:t>
             </w:r>
           </w:p>
         </w:tc>
@@ -217,7 +237,7 @@
               <w:rPr>
                 <w:sz w:val="20"/>
               </w:rPr>
-              <w:t>8</w:t>
+              <w:t>5</w:t>
             </w:r>
           </w:p>
         </w:tc>
@@ -233,7 +253,7 @@
               <w:rPr>
                 <w:sz w:val="20"/>
               </w:rPr>
-              <w:t>All Team (Lead: Kael Payette)</w:t>
+              <w:t>Tom Burchell</w:t>
             </w:r>
           </w:p>
         </w:tc>
@@ -249,7 +269,7 @@
               <w:rPr>
                 <w:sz w:val="20"/>
               </w:rPr>
-              <w:t>Stakeholder analysis; use-case mapping; acceptance criteria drafted</w:t>
+              <w:t>8 incident scenarios added; Socket.IO events wired; escalation timing hardened; auth validation middleware; audit logging; session list and delete endpoints</w:t>
             </w:r>
           </w:p>
         </w:tc>
@@ -267,7 +287,7 @@
               <w:rPr>
                 <w:sz w:val="20"/>
               </w:rPr>
-              <w:t>2025-06-21</w:t>
+              <w:t>2026-02-09</w:t>
             </w:r>
           </w:p>
         </w:tc>
@@ -283,7 +303,1319 @@
               <w:rPr>
                 <w:sz w:val="20"/>
               </w:rPr>
-              <w:t>Repo &amp; Project Scaffolding – Backend</w:t>
+              <w:t>Scenario Enhancement &amp; React Frontend Build (PRs #4–5)</w:t>
+            </w:r>
+          </w:p>
+        </w:tc>
+        <w:tc>
+          <w:tcPr>
+            <w:tcW w:type="dxa" w:w="1726"/>
+          </w:tcPr>
+          <w:p>
+            <w:pPr>
+              <w:jc w:val="left"/>
+            </w:pPr>
+            <w:r>
+              <w:rPr>
+                <w:sz w:val="20"/>
+              </w:rPr>
+              <w:t>3</w:t>
+            </w:r>
+          </w:p>
+        </w:tc>
+        <w:tc>
+          <w:tcPr>
+            <w:tcW w:type="dxa" w:w="1726"/>
+          </w:tcPr>
+          <w:p>
+            <w:pPr>
+              <w:jc w:val="left"/>
+            </w:pPr>
+            <w:r>
+              <w:rPr>
+                <w:sz w:val="20"/>
+              </w:rPr>
+              <w:t>Tom Burchell</w:t>
+            </w:r>
+          </w:p>
+        </w:tc>
+        <w:tc>
+          <w:tcPr>
+            <w:tcW w:type="dxa" w:w="1726"/>
+          </w:tcPr>
+          <w:p>
+            <w:pPr>
+              <w:jc w:val="left"/>
+            </w:pPr>
+            <w:r>
+              <w:rPr>
+                <w:sz w:val="20"/>
+              </w:rPr>
+              <w:t>All 8 scenarios expanded with 5–7 escalation events; complete React frontend with SessionSetup, ScenarioSelector, AdminDashboard, TraineeInterface, and EventLog components</w:t>
+            </w:r>
+          </w:p>
+        </w:tc>
+      </w:tr>
+      <w:tr>
+        <w:tc>
+          <w:tcPr>
+            <w:tcW w:type="dxa" w:w="1725"/>
+          </w:tcPr>
+          <w:p>
+            <w:pPr>
+              <w:jc w:val="left"/>
+            </w:pPr>
+            <w:r>
+              <w:rPr>
+                <w:sz w:val="20"/>
+              </w:rPr>
+              <w:t>2026-02-10</w:t>
+            </w:r>
+          </w:p>
+        </w:tc>
+        <w:tc>
+          <w:tcPr>
+            <w:tcW w:type="dxa" w:w="1727"/>
+          </w:tcPr>
+          <w:p>
+            <w:pPr>
+              <w:jc w:val="left"/>
+            </w:pPr>
+            <w:r>
+              <w:rPr>
+                <w:sz w:val="20"/>
+              </w:rPr>
+              <w:t>Backend Security Hardening &amp; Cloud Deployment Docs (PRs #7, #10, #11, #13)</w:t>
+            </w:r>
+          </w:p>
+        </w:tc>
+        <w:tc>
+          <w:tcPr>
+            <w:tcW w:type="dxa" w:w="1726"/>
+          </w:tcPr>
+          <w:p>
+            <w:pPr>
+              <w:jc w:val="left"/>
+            </w:pPr>
+            <w:r>
+              <w:rPr>
+                <w:sz w:val="20"/>
+              </w:rPr>
+              <w:t>5</w:t>
+            </w:r>
+          </w:p>
+        </w:tc>
+        <w:tc>
+          <w:tcPr>
+            <w:tcW w:type="dxa" w:w="1726"/>
+          </w:tcPr>
+          <w:p>
+            <w:pPr>
+              <w:jc w:val="left"/>
+            </w:pPr>
+            <w:r>
+              <w:rPr>
+                <w:sz w:val="20"/>
+              </w:rPr>
+              <w:t>Tom Burchell</w:t>
+            </w:r>
+          </w:p>
+        </w:tc>
+        <w:tc>
+          <w:tcPr>
+            <w:tcW w:type="dxa" w:w="1726"/>
+          </w:tcPr>
+          <w:p>
+            <w:pPr>
+              <w:jc w:val="left"/>
+            </w:pPr>
+            <w:r>
+              <w:rPr>
+                <w:sz w:val="20"/>
+              </w:rPr>
+              <w:t>Configurable CORS with allowed-origins; nanoid v5 upgrade; cloud deployment guides for Heroku, Railway, Render; render.yaml, railway.json, Procfile; session persistence limitation documentation</w:t>
+            </w:r>
+          </w:p>
+        </w:tc>
+      </w:tr>
+      <w:tr>
+        <w:tc>
+          <w:tcPr>
+            <w:tcW w:type="dxa" w:w="1725"/>
+          </w:tcPr>
+          <w:p>
+            <w:pPr>
+              <w:jc w:val="left"/>
+            </w:pPr>
+            <w:r>
+              <w:rPr>
+                <w:sz w:val="20"/>
+              </w:rPr>
+              <w:t>2026-02-18</w:t>
+            </w:r>
+          </w:p>
+        </w:tc>
+        <w:tc>
+          <w:tcPr>
+            <w:tcW w:type="dxa" w:w="1727"/>
+          </w:tcPr>
+          <w:p>
+            <w:pPr>
+              <w:jc w:val="left"/>
+            </w:pPr>
+            <w:r>
+              <w:rPr>
+                <w:sz w:val="20"/>
+              </w:rPr>
+              <w:t>JSON Scenario Files &amp; Dynamic Scenario Loading (PR #14)</w:t>
+            </w:r>
+          </w:p>
+        </w:tc>
+        <w:tc>
+          <w:tcPr>
+            <w:tcW w:type="dxa" w:w="1726"/>
+          </w:tcPr>
+          <w:p>
+            <w:pPr>
+              <w:jc w:val="left"/>
+            </w:pPr>
+            <w:r>
+              <w:rPr>
+                <w:sz w:val="20"/>
+              </w:rPr>
+              <w:t>3</w:t>
+            </w:r>
+          </w:p>
+        </w:tc>
+        <w:tc>
+          <w:tcPr>
+            <w:tcW w:type="dxa" w:w="1726"/>
+          </w:tcPr>
+          <w:p>
+            <w:pPr>
+              <w:jc w:val="left"/>
+            </w:pPr>
+            <w:r>
+              <w:rPr>
+                <w:sz w:val="20"/>
+              </w:rPr>
+              <w:t>Tom Burchell</w:t>
+            </w:r>
+          </w:p>
+        </w:tc>
+        <w:tc>
+          <w:tcPr>
+            <w:tcW w:type="dxa" w:w="1726"/>
+          </w:tcPr>
+          <w:p>
+            <w:pPr>
+              <w:jc w:val="left"/>
+            </w:pPr>
+            <w:r>
+              <w:rPr>
+                <w:sz w:val="20"/>
+              </w:rPr>
+              <w:t>JSON scenario files created for Medical, Fire, Environmental &amp; Infrastructure, Security &amp; Threat categories; dynamic loading from JSON files enabled; PR #14 reviewed and merged</w:t>
+            </w:r>
+          </w:p>
+        </w:tc>
+      </w:tr>
+      <w:tr>
+        <w:tc>
+          <w:tcPr>
+            <w:tcW w:type="dxa" w:w="1725"/>
+          </w:tcPr>
+          <w:p>
+            <w:pPr>
+              <w:jc w:val="left"/>
+            </w:pPr>
+            <w:r>
+              <w:rPr>
+                <w:sz w:val="20"/>
+              </w:rPr>
+              <w:t>2026-02-19</w:t>
+            </w:r>
+          </w:p>
+        </w:tc>
+        <w:tc>
+          <w:tcPr>
+            <w:tcW w:type="dxa" w:w="1727"/>
+          </w:tcPr>
+          <w:p>
+            <w:pPr>
+              <w:jc w:val="left"/>
+            </w:pPr>
+            <w:r>
+              <w:rPr>
+                <w:sz w:val="20"/>
+              </w:rPr>
+              <w:t>Socket Server – Session Validation &amp; Event Handling Updates</w:t>
+            </w:r>
+          </w:p>
+        </w:tc>
+        <w:tc>
+          <w:tcPr>
+            <w:tcW w:type="dxa" w:w="1726"/>
+          </w:tcPr>
+          <w:p>
+            <w:pPr>
+              <w:jc w:val="left"/>
+            </w:pPr>
+            <w:r>
+              <w:rPr>
+                <w:sz w:val="20"/>
+              </w:rPr>
+              <w:t>1</w:t>
+            </w:r>
+          </w:p>
+        </w:tc>
+        <w:tc>
+          <w:tcPr>
+            <w:tcW w:type="dxa" w:w="1726"/>
+          </w:tcPr>
+          <w:p>
+            <w:pPr>
+              <w:jc w:val="left"/>
+            </w:pPr>
+            <w:r>
+              <w:rPr>
+                <w:sz w:val="20"/>
+              </w:rPr>
+              <w:t>Tom Burchell</w:t>
+            </w:r>
+          </w:p>
+        </w:tc>
+        <w:tc>
+          <w:tcPr>
+            <w:tcW w:type="dxa" w:w="1726"/>
+          </w:tcPr>
+          <w:p>
+            <w:pPr>
+              <w:jc w:val="left"/>
+            </w:pPr>
+            <w:r>
+              <w:rPr>
+                <w:sz w:val="20"/>
+              </w:rPr>
+              <w:t>Updated socketServer.mjs: session validation added to admin:inject and event:log handlers; room membership checks added to event:log; event handling flow refined</w:t>
+            </w:r>
+          </w:p>
+        </w:tc>
+      </w:tr>
+      <w:tr>
+        <w:tc>
+          <w:tcPr>
+            <w:tcW w:type="dxa" w:w="1725"/>
+          </w:tcPr>
+          <w:p>
+            <w:pPr>
+              <w:jc w:val="left"/>
+            </w:pPr>
+            <w:r>
+              <w:rPr>
+                <w:sz w:val="20"/>
+              </w:rPr>
+              <w:t>2026-03-02</w:t>
+            </w:r>
+          </w:p>
+        </w:tc>
+        <w:tc>
+          <w:tcPr>
+            <w:tcW w:type="dxa" w:w="1727"/>
+          </w:tcPr>
+          <w:p>
+            <w:pPr>
+              <w:jc w:val="left"/>
+            </w:pPr>
+            <w:r>
+              <w:rPr>
+                <w:sz w:val="20"/>
+              </w:rPr>
+              <w:t>Vite Config – Cloud/Railway Deployment Fixes</w:t>
+            </w:r>
+          </w:p>
+        </w:tc>
+        <w:tc>
+          <w:tcPr>
+            <w:tcW w:type="dxa" w:w="1726"/>
+          </w:tcPr>
+          <w:p>
+            <w:pPr>
+              <w:jc w:val="left"/>
+            </w:pPr>
+            <w:r>
+              <w:rPr>
+                <w:sz w:val="20"/>
+              </w:rPr>
+              <w:t>2</w:t>
+            </w:r>
+          </w:p>
+        </w:tc>
+        <w:tc>
+          <w:tcPr>
+            <w:tcW w:type="dxa" w:w="1726"/>
+          </w:tcPr>
+          <w:p>
+            <w:pPr>
+              <w:jc w:val="left"/>
+            </w:pPr>
+            <w:r>
+              <w:rPr>
+                <w:sz w:val="20"/>
+              </w:rPr>
+              <w:t>Tom Burchell</w:t>
+            </w:r>
+          </w:p>
+        </w:tc>
+        <w:tc>
+          <w:tcPr>
+            <w:tcW w:type="dxa" w:w="1726"/>
+          </w:tcPr>
+          <w:p>
+            <w:pPr>
+              <w:jc w:val="left"/>
+            </w:pPr>
+            <w:r>
+              <w:rPr>
+                <w:sz w:val="20"/>
+              </w:rPr>
+              <w:t>Multiple Vite config iterations for Railway/cloud compatibility; server and preview settings configured; simplified host and allowedHosts; removed unused code</w:t>
+            </w:r>
+          </w:p>
+        </w:tc>
+      </w:tr>
+      <w:tr>
+        <w:tc>
+          <w:tcPr>
+            <w:tcW w:type="dxa" w:w="1725"/>
+          </w:tcPr>
+          <w:p>
+            <w:pPr>
+              <w:jc w:val="left"/>
+            </w:pPr>
+            <w:r>
+              <w:rPr>
+                <w:sz w:val="20"/>
+              </w:rPr>
+              <w:t>2026-03-05</w:t>
+            </w:r>
+          </w:p>
+        </w:tc>
+        <w:tc>
+          <w:tcPr>
+            <w:tcW w:type="dxa" w:w="1727"/>
+          </w:tcPr>
+          <w:p>
+            <w:pPr>
+              <w:jc w:val="left"/>
+            </w:pPr>
+            <w:r>
+              <w:rPr>
+                <w:sz w:val="20"/>
+              </w:rPr>
+              <w:t>Incident Pictures – Asset Addition &amp; Renaming</w:t>
+            </w:r>
+          </w:p>
+        </w:tc>
+        <w:tc>
+          <w:tcPr>
+            <w:tcW w:type="dxa" w:w="1726"/>
+          </w:tcPr>
+          <w:p>
+            <w:pPr>
+              <w:jc w:val="left"/>
+            </w:pPr>
+            <w:r>
+              <w:rPr>
+                <w:sz w:val="20"/>
+              </w:rPr>
+              <w:t>1</w:t>
+            </w:r>
+          </w:p>
+        </w:tc>
+        <w:tc>
+          <w:tcPr>
+            <w:tcW w:type="dxa" w:w="1726"/>
+          </w:tcPr>
+          <w:p>
+            <w:pPr>
+              <w:jc w:val="left"/>
+            </w:pPr>
+            <w:r>
+              <w:rPr>
+                <w:sz w:val="20"/>
+              </w:rPr>
+              <w:t>Tom Burchell</w:t>
+            </w:r>
+          </w:p>
+        </w:tc>
+        <w:tc>
+          <w:tcPr>
+            <w:tcW w:type="dxa" w:w="1726"/>
+          </w:tcPr>
+          <w:p>
+            <w:pPr>
+              <w:jc w:val="left"/>
+            </w:pPr>
+            <w:r>
+              <w:rPr>
+                <w:sz w:val="20"/>
+              </w:rPr>
+              <w:t>Added incident scenario images (Police, SAR01, SAR02, SWAT, Fireman, SIRE_Poster, SAR_CP); renamed files to descriptive names for use in the application</w:t>
+            </w:r>
+          </w:p>
+        </w:tc>
+      </w:tr>
+      <w:tr>
+        <w:tc>
+          <w:tcPr>
+            <w:tcW w:type="dxa" w:w="1725"/>
+          </w:tcPr>
+          <w:p>
+            <w:pPr>
+              <w:jc w:val="left"/>
+            </w:pPr>
+            <w:r>
+              <w:rPr>
+                <w:sz w:val="20"/>
+              </w:rPr>
+              <w:t>2026-03-10</w:t>
+            </w:r>
+          </w:p>
+        </w:tc>
+        <w:tc>
+          <w:tcPr>
+            <w:tcW w:type="dxa" w:w="1727"/>
+          </w:tcPr>
+          <w:p>
+            <w:pPr>
+              <w:jc w:val="left"/>
+            </w:pPr>
+            <w:r>
+              <w:rPr>
+                <w:sz w:val="20"/>
+              </w:rPr>
+              <w:t>Bug Fix – App Crash, React Hook Order &amp; Session Validation (PR #15)</w:t>
+            </w:r>
+          </w:p>
+        </w:tc>
+        <w:tc>
+          <w:tcPr>
+            <w:tcW w:type="dxa" w:w="1726"/>
+          </w:tcPr>
+          <w:p>
+            <w:pPr>
+              <w:jc w:val="left"/>
+            </w:pPr>
+            <w:r>
+              <w:rPr>
+                <w:sz w:val="20"/>
+              </w:rPr>
+              <w:t>1</w:t>
+            </w:r>
+          </w:p>
+        </w:tc>
+        <w:tc>
+          <w:tcPr>
+            <w:tcW w:type="dxa" w:w="1726"/>
+          </w:tcPr>
+          <w:p>
+            <w:pPr>
+              <w:jc w:val="left"/>
+            </w:pPr>
+            <w:r>
+              <w:rPr>
+                <w:sz w:val="20"/>
+              </w:rPr>
+              <w:t>Tom Burchell</w:t>
+            </w:r>
+          </w:p>
+        </w:tc>
+        <w:tc>
+          <w:tcPr>
+            <w:tcW w:type="dxa" w:w="1726"/>
+          </w:tcPr>
+          <w:p>
+            <w:pPr>
+              <w:jc w:val="left"/>
+            </w:pPr>
+            <w:r>
+              <w:rPr>
+                <w:sz w:val="20"/>
+              </w:rPr>
+              <w:t>Resolved session code validation mismatch causing app crash; fixed React hook order violations; updated admin roster handling; reviewed and merged Copilot PR #15</w:t>
+            </w:r>
+          </w:p>
+        </w:tc>
+      </w:tr>
+      <w:tr>
+        <w:tc>
+          <w:tcPr>
+            <w:tcW w:type="dxa" w:w="1725"/>
+          </w:tcPr>
+          <w:p>
+            <w:pPr>
+              <w:jc w:val="left"/>
+            </w:pPr>
+            <w:r>
+              <w:rPr>
+                <w:sz w:val="20"/>
+              </w:rPr>
+              <w:t>2026-03-13</w:t>
+            </w:r>
+          </w:p>
+        </w:tc>
+        <w:tc>
+          <w:tcPr>
+            <w:tcW w:type="dxa" w:w="1727"/>
+          </w:tcPr>
+          <w:p>
+            <w:pPr>
+              <w:jc w:val="left"/>
+            </w:pPr>
+            <w:r>
+              <w:rPr>
+                <w:sz w:val="20"/>
+              </w:rPr>
+              <w:t>UI/UX Enhancements – Scenario Cards, Trainee Roles, Debrief Modal (PR #16)</w:t>
+            </w:r>
+          </w:p>
+        </w:tc>
+        <w:tc>
+          <w:tcPr>
+            <w:tcW w:type="dxa" w:w="1726"/>
+          </w:tcPr>
+          <w:p>
+            <w:pPr>
+              <w:jc w:val="left"/>
+            </w:pPr>
+            <w:r>
+              <w:rPr>
+                <w:sz w:val="20"/>
+              </w:rPr>
+              <w:t>2</w:t>
+            </w:r>
+          </w:p>
+        </w:tc>
+        <w:tc>
+          <w:tcPr>
+            <w:tcW w:type="dxa" w:w="1726"/>
+          </w:tcPr>
+          <w:p>
+            <w:pPr>
+              <w:jc w:val="left"/>
+            </w:pPr>
+            <w:r>
+              <w:rPr>
+                <w:sz w:val="20"/>
+              </w:rPr>
+              <w:t>Tom Burchell</w:t>
+            </w:r>
+          </w:p>
+        </w:tc>
+        <w:tc>
+          <w:tcPr>
+            <w:tcW w:type="dxa" w:w="1726"/>
+          </w:tcPr>
+          <w:p>
+            <w:pPr>
+              <w:jc w:val="left"/>
+            </w:pPr>
+            <w:r>
+              <w:rPr>
+                <w:sz w:val="20"/>
+              </w:rPr>
+              <w:t>Scenario cards with imagery; trainee role selection; quick action buttons; live session timer; severity-tagged events; debrief/AAR modal with summary; reviewed and merged Copilot PR #16</w:t>
+            </w:r>
+          </w:p>
+        </w:tc>
+      </w:tr>
+      <w:tr>
+        <w:tc>
+          <w:tcPr>
+            <w:tcW w:type="dxa" w:w="1725"/>
+          </w:tcPr>
+          <w:p>
+            <w:pPr>
+              <w:jc w:val="left"/>
+            </w:pPr>
+            <w:r>
+              <w:rPr>
+                <w:sz w:val="20"/>
+              </w:rPr>
+              <w:t>2026-03-15</w:t>
+            </w:r>
+          </w:p>
+        </w:tc>
+        <w:tc>
+          <w:tcPr>
+            <w:tcW w:type="dxa" w:w="1727"/>
+          </w:tcPr>
+          <w:p>
+            <w:pPr>
+              <w:jc w:val="left"/>
+            </w:pPr>
+            <w:r>
+              <w:rPr>
+                <w:sz w:val="20"/>
+              </w:rPr>
+              <w:t>Project &amp; Personal Time Log Compilation (PR #17)</w:t>
+            </w:r>
+          </w:p>
+        </w:tc>
+        <w:tc>
+          <w:tcPr>
+            <w:tcW w:type="dxa" w:w="1726"/>
+          </w:tcPr>
+          <w:p>
+            <w:pPr>
+              <w:jc w:val="left"/>
+            </w:pPr>
+            <w:r>
+              <w:rPr>
+                <w:sz w:val="20"/>
+              </w:rPr>
+              <w:t>1</w:t>
+            </w:r>
+          </w:p>
+        </w:tc>
+        <w:tc>
+          <w:tcPr>
+            <w:tcW w:type="dxa" w:w="1726"/>
+          </w:tcPr>
+          <w:p>
+            <w:pPr>
+              <w:jc w:val="left"/>
+            </w:pPr>
+            <w:r>
+              <w:rPr>
+                <w:sz w:val="20"/>
+              </w:rPr>
+              <w:t>Tom Burchell</w:t>
+            </w:r>
+          </w:p>
+        </w:tc>
+        <w:tc>
+          <w:tcPr>
+            <w:tcW w:type="dxa" w:w="1726"/>
+          </w:tcPr>
+          <w:p>
+            <w:pPr>
+              <w:jc w:val="left"/>
+            </w:pPr>
+            <w:r>
+              <w:rPr>
+                <w:sz w:val="20"/>
+              </w:rPr>
+              <w:t>Group project time log template added and filled; personal time log created documenting individual contributions; submitted as PROG 3300 deliverable</w:t>
+            </w:r>
+          </w:p>
+        </w:tc>
+      </w:tr>
+      <w:tr>
+        <w:tc>
+          <w:tcPr>
+            <w:tcW w:type="dxa" w:w="1725"/>
+          </w:tcPr>
+          <w:p>
+            <w:pPr>
+              <w:jc w:val="left"/>
+            </w:pPr>
+            <w:r>
+              <w:rPr>
+                <w:sz w:val="20"/>
+              </w:rPr>
+              <w:t>2026-03-16</w:t>
+            </w:r>
+          </w:p>
+        </w:tc>
+        <w:tc>
+          <w:tcPr>
+            <w:tcW w:type="dxa" w:w="1727"/>
+          </w:tcPr>
+          <w:p>
+            <w:pPr>
+              <w:jc w:val="left"/>
+            </w:pPr>
+            <w:r>
+              <w:rPr>
+                <w:sz w:val="20"/>
+              </w:rPr>
+              <w:t>Backend Auth Fix – API_KEY Environment Wiring (PR #19)</w:t>
+            </w:r>
+          </w:p>
+        </w:tc>
+        <w:tc>
+          <w:tcPr>
+            <w:tcW w:type="dxa" w:w="1726"/>
+          </w:tcPr>
+          <w:p>
+            <w:pPr>
+              <w:jc w:val="left"/>
+            </w:pPr>
+            <w:r>
+              <w:rPr>
+                <w:sz w:val="20"/>
+              </w:rPr>
+              <w:t>1</w:t>
+            </w:r>
+          </w:p>
+        </w:tc>
+        <w:tc>
+          <w:tcPr>
+            <w:tcW w:type="dxa" w:w="1726"/>
+          </w:tcPr>
+          <w:p>
+            <w:pPr>
+              <w:jc w:val="left"/>
+            </w:pPr>
+            <w:r>
+              <w:rPr>
+                <w:sz w:val="20"/>
+              </w:rPr>
+              <w:t>Tom Burchell</w:t>
+            </w:r>
+          </w:p>
+        </w:tc>
+        <w:tc>
+          <w:tcPr>
+            <w:tcW w:type="dxa" w:w="1726"/>
+          </w:tcPr>
+          <w:p>
+            <w:pPr>
+              <w:jc w:val="left"/>
+            </w:pPr>
+            <w:r>
+              <w:rPr>
+                <w:sz w:val="20"/>
+              </w:rPr>
+              <w:t>Fixed backend auth failure on fresh clone; API_KEY correctly wired from .env file; environment variable documentation updated</w:t>
+            </w:r>
+          </w:p>
+        </w:tc>
+      </w:tr>
+      <w:tr>
+        <w:tc>
+          <w:tcPr>
+            <w:tcW w:type="dxa" w:w="1725"/>
+          </w:tcPr>
+          <w:p>
+            <w:pPr>
+              <w:jc w:val="left"/>
+            </w:pPr>
+            <w:r>
+              <w:rPr>
+                <w:sz w:val="20"/>
+              </w:rPr>
+              <w:t>2026-03-17</w:t>
+            </w:r>
+          </w:p>
+        </w:tc>
+        <w:tc>
+          <w:tcPr>
+            <w:tcW w:type="dxa" w:w="1727"/>
+          </w:tcPr>
+          <w:p>
+            <w:pPr>
+              <w:jc w:val="left"/>
+            </w:pPr>
+            <w:r>
+              <w:rPr>
+                <w:sz w:val="20"/>
+              </w:rPr>
+              <w:t>Tech Showcase Poster – Create, Redesign &amp; Rebrand (PRs #20–22)</w:t>
+            </w:r>
+          </w:p>
+        </w:tc>
+        <w:tc>
+          <w:tcPr>
+            <w:tcW w:type="dxa" w:w="1726"/>
+          </w:tcPr>
+          <w:p>
+            <w:pPr>
+              <w:jc w:val="left"/>
+            </w:pPr>
+            <w:r>
+              <w:rPr>
+                <w:sz w:val="20"/>
+              </w:rPr>
+              <w:t>3</w:t>
+            </w:r>
+          </w:p>
+        </w:tc>
+        <w:tc>
+          <w:tcPr>
+            <w:tcW w:type="dxa" w:w="1726"/>
+          </w:tcPr>
+          <w:p>
+            <w:pPr>
+              <w:jc w:val="left"/>
+            </w:pPr>
+            <w:r>
+              <w:rPr>
+                <w:sz w:val="20"/>
+              </w:rPr>
+              <w:t>Tom Burchell</w:t>
+            </w:r>
+          </w:p>
+        </w:tc>
+        <w:tc>
+          <w:tcPr>
+            <w:tcW w:type="dxa" w:w="1726"/>
+          </w:tcPr>
+          <w:p>
+            <w:pPr>
+              <w:jc w:val="left"/>
+            </w:pPr>
+            <w:r>
+              <w:rPr>
+                <w:sz w:val="20"/>
+              </w:rPr>
+              <w:t>Print-ready A3 conference poster created; reference layout merged with full content; S.I.R.E. brand logo integrated to replace placeholder mock-ups</w:t>
+            </w:r>
+          </w:p>
+        </w:tc>
+      </w:tr>
+      <w:tr>
+        <w:tc>
+          <w:tcPr>
+            <w:tcW w:type="dxa" w:w="1725"/>
+          </w:tcPr>
+          <w:p>
+            <w:pPr>
+              <w:jc w:val="left"/>
+            </w:pPr>
+            <w:r>
+              <w:rPr>
+                <w:sz w:val="20"/>
+              </w:rPr>
+              <w:t>2026-03-19</w:t>
+            </w:r>
+          </w:p>
+        </w:tc>
+        <w:tc>
+          <w:tcPr>
+            <w:tcW w:type="dxa" w:w="1727"/>
+          </w:tcPr>
+          <w:p>
+            <w:pPr>
+              <w:jc w:val="left"/>
+            </w:pPr>
+            <w:r>
+              <w:rPr>
+                <w:sz w:val="20"/>
+              </w:rPr>
+              <w:t>Render Cloud Deployment – Setup &amp; Connectivity Fixes (PRs #23–28)</w:t>
+            </w:r>
+          </w:p>
+        </w:tc>
+        <w:tc>
+          <w:tcPr>
+            <w:tcW w:type="dxa" w:w="1726"/>
+          </w:tcPr>
+          <w:p>
+            <w:pPr>
+              <w:jc w:val="left"/>
+            </w:pPr>
+            <w:r>
+              <w:rPr>
+                <w:sz w:val="20"/>
+              </w:rPr>
+              <w:t>4</w:t>
+            </w:r>
+          </w:p>
+        </w:tc>
+        <w:tc>
+          <w:tcPr>
+            <w:tcW w:type="dxa" w:w="1726"/>
+          </w:tcPr>
+          <w:p>
+            <w:pPr>
+              <w:jc w:val="left"/>
+            </w:pPr>
+            <w:r>
+              <w:rPr>
+                <w:sz w:val="20"/>
+              </w:rPr>
+              <w:t>Tom Burchell</w:t>
+            </w:r>
+          </w:p>
+        </w:tc>
+        <w:tc>
+          <w:tcPr>
+            <w:tcW w:type="dxa" w:w="1726"/>
+          </w:tcPr>
+          <w:p>
+            <w:pPr>
+              <w:jc w:val="left"/>
+            </w:pPr>
+            <w:r>
+              <w:rPr>
+                <w:sz w:val="20"/>
+              </w:rPr>
+              <w:t>Separate frontend (sire-web) and backend (sire-api) Render services configured; Socket.IO auth payload fixed; render.yaml service wiring; blank page fix; VITE_API_KEY auto-sync from backend; session creation errors resolved</w:t>
+            </w:r>
+          </w:p>
+        </w:tc>
+      </w:tr>
+      <w:tr>
+        <w:tc>
+          <w:tcPr>
+            <w:tcW w:type="dxa" w:w="1725"/>
+          </w:tcPr>
+          <w:p>
+            <w:pPr>
+              <w:jc w:val="left"/>
+            </w:pPr>
+            <w:r>
+              <w:rPr>
+                <w:sz w:val="20"/>
+              </w:rPr>
+              <w:t>2026-03-23</w:t>
+            </w:r>
+          </w:p>
+        </w:tc>
+        <w:tc>
+          <w:tcPr>
+            <w:tcW w:type="dxa" w:w="1727"/>
+          </w:tcPr>
+          <w:p>
+            <w:pPr>
+              <w:jc w:val="left"/>
+            </w:pPr>
+            <w:r>
+              <w:rPr>
+                <w:sz w:val="20"/>
+              </w:rPr>
+              <w:t>New Frontend UI Integration &amp; Auth/CORS Fixes (PRs #29–34)</w:t>
+            </w:r>
+          </w:p>
+        </w:tc>
+        <w:tc>
+          <w:tcPr>
+            <w:tcW w:type="dxa" w:w="1726"/>
+          </w:tcPr>
+          <w:p>
+            <w:pPr>
+              <w:jc w:val="left"/>
+            </w:pPr>
+            <w:r>
+              <w:rPr>
+                <w:sz w:val="20"/>
+              </w:rPr>
+              <w:t>5</w:t>
+            </w:r>
+          </w:p>
+        </w:tc>
+        <w:tc>
+          <w:tcPr>
+            <w:tcW w:type="dxa" w:w="1726"/>
+          </w:tcPr>
+          <w:p>
+            <w:pPr>
+              <w:jc w:val="left"/>
+            </w:pPr>
+            <w:r>
+              <w:rPr>
+                <w:sz w:val="20"/>
+              </w:rPr>
+              <w:t>Tom Burchell</w:t>
+            </w:r>
+          </w:p>
+        </w:tc>
+        <w:tc>
+          <w:tcPr>
+            <w:tcW w:type="dxa" w:w="1726"/>
+          </w:tcPr>
+          <w:p>
+            <w:pPr>
+              <w:jc w:val="left"/>
+            </w:pPr>
+            <w:r>
+              <w:rPr>
+                <w:sz w:val="20"/>
+              </w:rPr>
+              <w:t>Replaced SIRE_frontend with aelayette/sire-simulator UI; SQLite user authentication added; API key middleware fixed for auth routes; CORS credentials fix; React Router Link replacing bare anchor tags</w:t>
+            </w:r>
+          </w:p>
+        </w:tc>
+      </w:tr>
+      <w:tr>
+        <w:tc>
+          <w:tcPr>
+            <w:tcW w:type="dxa" w:w="1725"/>
+          </w:tcPr>
+          <w:p>
+            <w:pPr>
+              <w:jc w:val="left"/>
+            </w:pPr>
+            <w:r>
+              <w:rPr>
+                <w:sz w:val="20"/>
+              </w:rPr>
+              <w:t>2026-03-24</w:t>
+            </w:r>
+          </w:p>
+        </w:tc>
+        <w:tc>
+          <w:tcPr>
+            <w:tcW w:type="dxa" w:w="1727"/>
+          </w:tcPr>
+          <w:p>
+            <w:pPr>
+              <w:jc w:val="left"/>
+            </w:pPr>
+            <w:r>
+              <w:rPr>
+                <w:sz w:val="20"/>
+              </w:rPr>
+              <w:t>Presentation Materials – Handouts, PowerPoint &amp; Test Content (PRs #35–38)</w:t>
+            </w:r>
+          </w:p>
+        </w:tc>
+        <w:tc>
+          <w:tcPr>
+            <w:tcW w:type="dxa" w:w="1726"/>
+          </w:tcPr>
+          <w:p>
+            <w:pPr>
+              <w:jc w:val="left"/>
+            </w:pPr>
+            <w:r>
+              <w:rPr>
+                <w:sz w:val="20"/>
+              </w:rPr>
+              <w:t>3</w:t>
+            </w:r>
+          </w:p>
+        </w:tc>
+        <w:tc>
+          <w:tcPr>
+            <w:tcW w:type="dxa" w:w="1726"/>
+          </w:tcPr>
+          <w:p>
+            <w:pPr>
+              <w:jc w:val="left"/>
+            </w:pPr>
+            <w:r>
+              <w:rPr>
+                <w:sz w:val="20"/>
+              </w:rPr>
+              <w:t>Tom Burchell</w:t>
+            </w:r>
+          </w:p>
+        </w:tc>
+        <w:tc>
+          <w:tcPr>
+            <w:tcW w:type="dxa" w:w="1726"/>
+          </w:tcPr>
+          <w:p>
+            <w:pPr>
+              <w:jc w:val="left"/>
+            </w:pPr>
+            <w:r>
+              <w:rPr>
+                <w:sz w:val="20"/>
+              </w:rPr>
+              <w:t>A4 print-ready tech showcase handout created; printer-friendly variant added; PowerPoint generator combining poster content; backend testing content added to Interim Report 03</w:t>
+            </w:r>
+          </w:p>
+        </w:tc>
+      </w:tr>
+      <w:tr>
+        <w:tc>
+          <w:tcPr>
+            <w:tcW w:type="dxa" w:w="1725"/>
+          </w:tcPr>
+          <w:p>
+            <w:pPr>
+              <w:jc w:val="left"/>
+            </w:pPr>
+            <w:r>
+              <w:rPr>
+                <w:sz w:val="20"/>
+              </w:rPr>
+              <w:t>2026-03-25</w:t>
+            </w:r>
+          </w:p>
+        </w:tc>
+        <w:tc>
+          <w:tcPr>
+            <w:tcW w:type="dxa" w:w="1727"/>
+          </w:tcPr>
+          <w:p>
+            <w:pPr>
+              <w:jc w:val="left"/>
+            </w:pPr>
+            <w:r>
+              <w:rPr>
+                <w:sz w:val="20"/>
+              </w:rPr>
+              <w:t>Demo Mode &amp; Admin Dashboard Enhancements (PRs #39–47)</w:t>
+            </w:r>
+          </w:p>
+        </w:tc>
+        <w:tc>
+          <w:tcPr>
+            <w:tcW w:type="dxa" w:w="1726"/>
+          </w:tcPr>
+          <w:p>
+            <w:pPr>
+              <w:jc w:val="left"/>
+            </w:pPr>
+            <w:r>
+              <w:rPr>
+                <w:sz w:val="20"/>
+              </w:rPr>
+              <w:t>5</w:t>
+            </w:r>
+          </w:p>
+        </w:tc>
+        <w:tc>
+          <w:tcPr>
+            <w:tcW w:type="dxa" w:w="1726"/>
+          </w:tcPr>
+          <w:p>
+            <w:pPr>
+              <w:jc w:val="left"/>
+            </w:pPr>
+            <w:r>
+              <w:rPr>
+                <w:sz w:val="20"/>
+              </w:rPr>
+              <w:t>Tom Burchell</w:t>
+            </w:r>
+          </w:p>
+        </w:tc>
+        <w:tc>
+          <w:tcPr>
+            <w:tcW w:type="dxa" w:w="1726"/>
+          </w:tcPr>
+          <w:p>
+            <w:pPr>
+              <w:jc w:val="left"/>
+            </w:pPr>
+            <w:r>
+              <w:rPr>
+                <w:sz w:val="20"/>
+              </w:rPr>
+              <w:t>Auth bypass for demo mode; all 8 scenario JSON files unlocked; admin dashboard made dynamic with scenario cards and live API fetch; health check moved before API key middleware; Render service URL and routing fixes</w:t>
+            </w:r>
+          </w:p>
+        </w:tc>
+      </w:tr>
+      <w:tr>
+        <w:tc>
+          <w:tcPr>
+            <w:tcW w:type="dxa" w:w="1725"/>
+          </w:tcPr>
+          <w:p>
+            <w:pPr>
+              <w:jc w:val="left"/>
+            </w:pPr>
+            <w:r>
+              <w:rPr>
+                <w:sz w:val="20"/>
+              </w:rPr>
+              <w:t>2026-03-26</w:t>
+            </w:r>
+          </w:p>
+        </w:tc>
+        <w:tc>
+          <w:tcPr>
+            <w:tcW w:type="dxa" w:w="1727"/>
+          </w:tcPr>
+          <w:p>
+            <w:pPr>
+              <w:jc w:val="left"/>
+            </w:pPr>
+            <w:r>
+              <w:rPr>
+                <w:sz w:val="20"/>
+              </w:rPr>
+              <w:t>SQLite Database, Showcase/Kiosk, Demo Mode &amp; Business Cards (PRs #48–55)</w:t>
+            </w:r>
+          </w:p>
+        </w:tc>
+        <w:tc>
+          <w:tcPr>
+            <w:tcW w:type="dxa" w:w="1726"/>
+          </w:tcPr>
+          <w:p>
+            <w:pPr>
+              <w:jc w:val="left"/>
+            </w:pPr>
+            <w:r>
+              <w:rPr>
+                <w:sz w:val="20"/>
+              </w:rPr>
+              <w:t>5</w:t>
+            </w:r>
+          </w:p>
+        </w:tc>
+        <w:tc>
+          <w:tcPr>
+            <w:tcW w:type="dxa" w:w="1726"/>
+          </w:tcPr>
+          <w:p>
+            <w:pPr>
+              <w:jc w:val="left"/>
+            </w:pPr>
+            <w:r>
+              <w:rPr>
+                <w:sz w:val="20"/>
+              </w:rPr>
+              <w:t>Tom Burchell</w:t>
+            </w:r>
+          </w:p>
+        </w:tc>
+        <w:tc>
+          <w:tcPr>
+            <w:tcW w:type="dxa" w:w="1726"/>
+          </w:tcPr>
+          <w:p>
+            <w:pPr>
+              <w:jc w:val="left"/>
+            </w:pPr>
+            <w:r>
+              <w:rPr>
+                <w:sz w:val="20"/>
+              </w:rPr>
+              <w:t>Standalone SQLite database for usernames and scenario data; frontend-only demo mode with bundled scenario data; auto-playing showcase/kiosk screen; Team Nibble business cards with QR code to simulator URL</w:t>
+            </w:r>
+          </w:p>
+        </w:tc>
+      </w:tr>
+      <w:tr>
+        <w:tc>
+          <w:tcPr>
+            <w:tcW w:type="dxa" w:w="1725"/>
+          </w:tcPr>
+          <w:p>
+            <w:pPr>
+              <w:jc w:val="left"/>
+            </w:pPr>
+            <w:r>
+              <w:rPr>
+                <w:sz w:val="20"/>
+              </w:rPr>
+              <w:t>2026-03-30</w:t>
+            </w:r>
+          </w:p>
+        </w:tc>
+        <w:tc>
+          <w:tcPr>
+            <w:tcW w:type="dxa" w:w="1727"/>
+          </w:tcPr>
+          <w:p>
+            <w:pPr>
+              <w:jc w:val="left"/>
+            </w:pPr>
+            <w:r>
+              <w:rPr>
+                <w:sz w:val="20"/>
+              </w:rPr>
+              <w:t>Render Deployment Debugging &amp; Configuration (PRs #56–67)</w:t>
             </w:r>
           </w:p>
         </w:tc>
@@ -331,7 +1663,7 @@
               <w:rPr>
                 <w:sz w:val="20"/>
               </w:rPr>
-              <w:t>GitHub repo initialised; Node/Express skeleton; .gitignore, README, package.json</w:t>
+              <w:t>Backend↔frontend re-wiring for Render; fromService property iterations (host → url → hardcoded); VITE_API_BASE build-time injection fix; static/web runtime fix; npm audit vulnerability fixes; Render free-tier deployment guide</w:t>
             </w:r>
           </w:p>
         </w:tc>
@@ -349,7 +1681,7 @@
               <w:rPr>
                 <w:sz w:val="20"/>
               </w:rPr>
-              <w:t>2025-06-23</w:t>
+              <w:t>2026-03-31</w:t>
             </w:r>
           </w:p>
         </w:tc>
@@ -365,7 +1697,7 @@
               <w:rPr>
                 <w:sz w:val="20"/>
               </w:rPr>
-              <w:t>Repo &amp; Project Scaffolding – Frontend</w:t>
+              <w:t>CORS Testing, Session Export, UI Polish &amp; Branding (PRs #68–72)</w:t>
             </w:r>
           </w:p>
         </w:tc>
@@ -381,7 +1713,7 @@
               <w:rPr>
                 <w:sz w:val="20"/>
               </w:rPr>
-              <w:t>6</w:t>
+              <w:t>3</w:t>
             </w:r>
           </w:p>
         </w:tc>
@@ -397,7 +1729,7 @@
               <w:rPr>
                 <w:sz w:val="20"/>
               </w:rPr>
-              <w:t>Leo Wasiliew</w:t>
+              <w:t>Tom Burchell</w:t>
             </w:r>
           </w:p>
         </w:tc>
@@ -413,7 +1745,7 @@
               <w:rPr>
                 <w:sz w:val="20"/>
               </w:rPr>
-              <w:t>React + Vite scaffold; ESLint config; folder structure aligned with backend</w:t>
+              <w:t>CORS preflight test suite added to CI; CORS policy fix for cross-origin requests; end-session modal with export; back navigation; admin injects visible in trainee Live Updates panel; SIRE shield favicon</w:t>
             </w:r>
           </w:p>
         </w:tc>
@@ -431,7 +1763,7 @@
               <w:rPr>
                 <w:sz w:val="20"/>
               </w:rPr>
-              <w:t>2025-06-26</w:t>
+              <w:t>2026-04-07</w:t>
             </w:r>
           </w:p>
         </w:tc>
@@ -447,7 +1779,171 @@
               <w:rPr>
                 <w:sz w:val="20"/>
               </w:rPr>
-              <w:t>Gantt chart &amp; project planning documents</w:t>
+              <w:t>Cybersecurity Scenarios – Malware, Phishing &amp; Identity Attacks (PRs #73–75)</w:t>
+            </w:r>
+          </w:p>
+        </w:tc>
+        <w:tc>
+          <w:tcPr>
+            <w:tcW w:type="dxa" w:w="1726"/>
+          </w:tcPr>
+          <w:p>
+            <w:pPr>
+              <w:jc w:val="left"/>
+            </w:pPr>
+            <w:r>
+              <w:rPr>
+                <w:sz w:val="20"/>
+              </w:rPr>
+              <w:t>3</w:t>
+            </w:r>
+          </w:p>
+        </w:tc>
+        <w:tc>
+          <w:tcPr>
+            <w:tcW w:type="dxa" w:w="1726"/>
+          </w:tcPr>
+          <w:p>
+            <w:pPr>
+              <w:jc w:val="left"/>
+            </w:pPr>
+            <w:r>
+              <w:rPr>
+                <w:sz w:val="20"/>
+              </w:rPr>
+              <w:t>Tom Burchell</w:t>
+            </w:r>
+          </w:p>
+        </w:tc>
+        <w:tc>
+          <w:tcPr>
+            <w:tcW w:type="dxa" w:w="1726"/>
+          </w:tcPr>
+          <w:p>
+            <w:pPr>
+              <w:jc w:val="left"/>
+            </w:pPr>
+            <w:r>
+              <w:rPr>
+                <w:sz w:val="20"/>
+              </w:rPr>
+              <w:t>29 cybersecurity scenarios created: malware-based incidents (9), phishing/social engineering (10), credential and identity attack simulations (10)</w:t>
+            </w:r>
+          </w:p>
+        </w:tc>
+      </w:tr>
+      <w:tr>
+        <w:tc>
+          <w:tcPr>
+            <w:tcW w:type="dxa" w:w="1725"/>
+          </w:tcPr>
+          <w:p>
+            <w:pPr>
+              <w:jc w:val="left"/>
+            </w:pPr>
+            <w:r>
+              <w:rPr>
+                <w:sz w:val="20"/>
+              </w:rPr>
+              <w:t>2026-04-08</w:t>
+            </w:r>
+          </w:p>
+        </w:tc>
+        <w:tc>
+          <w:tcPr>
+            <w:tcW w:type="dxa" w:w="1727"/>
+          </w:tcPr>
+          <w:p>
+            <w:pPr>
+              <w:jc w:val="left"/>
+            </w:pPr>
+            <w:r>
+              <w:rPr>
+                <w:sz w:val="20"/>
+              </w:rPr>
+              <w:t>UI Enhancement – God Mode, Live Scoring &amp; Dark Theme (PRs #76–77)</w:t>
+            </w:r>
+          </w:p>
+        </w:tc>
+        <w:tc>
+          <w:tcPr>
+            <w:tcW w:type="dxa" w:w="1726"/>
+          </w:tcPr>
+          <w:p>
+            <w:pPr>
+              <w:jc w:val="left"/>
+            </w:pPr>
+            <w:r>
+              <w:rPr>
+                <w:sz w:val="20"/>
+              </w:rPr>
+              <w:t>2</w:t>
+            </w:r>
+          </w:p>
+        </w:tc>
+        <w:tc>
+          <w:tcPr>
+            <w:tcW w:type="dxa" w:w="1726"/>
+          </w:tcPr>
+          <w:p>
+            <w:pPr>
+              <w:jc w:val="left"/>
+            </w:pPr>
+            <w:r>
+              <w:rPr>
+                <w:sz w:val="20"/>
+              </w:rPr>
+              <w:t>Tom Burchell</w:t>
+            </w:r>
+          </w:p>
+        </w:tc>
+        <w:tc>
+          <w:tcPr>
+            <w:tcW w:type="dxa" w:w="1726"/>
+          </w:tcPr>
+          <w:p>
+            <w:pPr>
+              <w:jc w:val="left"/>
+            </w:pPr>
+            <w:r>
+              <w:rPr>
+                <w:sz w:val="20"/>
+              </w:rPr>
+              <w:t>God Mode: live timer, scoring, inline feedback, scenario filters, enhanced AAR export; UI polish: soft-edge components, consistent spacing, modern dark aesthetic</w:t>
+            </w:r>
+          </w:p>
+        </w:tc>
+      </w:tr>
+      <w:tr>
+        <w:tc>
+          <w:tcPr>
+            <w:tcW w:type="dxa" w:w="1725"/>
+          </w:tcPr>
+          <w:p>
+            <w:pPr>
+              <w:jc w:val="left"/>
+            </w:pPr>
+            <w:r>
+              <w:rPr>
+                <w:sz w:val="20"/>
+              </w:rPr>
+              <w:t>2026-04-08</w:t>
+            </w:r>
+          </w:p>
+        </w:tc>
+        <w:tc>
+          <w:tcPr>
+            <w:tcW w:type="dxa" w:w="1727"/>
+          </w:tcPr>
+          <w:p>
+            <w:pPr>
+              <w:jc w:val="left"/>
+            </w:pPr>
+            <w:r>
+              <w:rPr>
+                <w:sz w:val="20"/>
+              </w:rPr>
+              <w:t>Cybersecurity Scenario Expansion (PRs #78–84)</w:t>
             </w:r>
           </w:p>
         </w:tc>
@@ -479,7 +1975,7 @@
               <w:rPr>
                 <w:sz w:val="20"/>
               </w:rPr>
-              <w:t>Kael Payette</w:t>
+              <w:t>Tom Burchell</w:t>
             </w:r>
           </w:p>
         </w:tc>
@@ -495,7 +1991,7 @@
               <w:rPr>
                 <w:sz w:val="20"/>
               </w:rPr>
-              <w:t>Gantt_Detailed.csv created; Project Charter written; milestones confirmed</w:t>
+              <w:t>26 new cybersecurity IR scenarios; 33 IT Operations/Infrastructure incidents; Insider Threat (malicious/negligent); BCDR scenarios; Supply Chain, Compliance, Healthcare incidents; OT/ICS, Crisis Communications, IR Process Failure; Advanced tabletop scenarios</w:t>
             </w:r>
           </w:p>
         </w:tc>
@@ -513,7 +2009,7 @@
               <w:rPr>
                 <w:sz w:val="20"/>
               </w:rPr>
-              <w:t>2025-06-30</w:t>
+              <w:t>2026-04-08</w:t>
             </w:r>
           </w:p>
         </w:tc>
@@ -529,1565 +2025,7 @@
               <w:rPr>
                 <w:sz w:val="20"/>
               </w:rPr>
-              <w:t>Backend Architecture &amp; Express Setup</w:t>
-            </w:r>
-          </w:p>
-        </w:tc>
-        <w:tc>
-          <w:tcPr>
-            <w:tcW w:type="dxa" w:w="1726"/>
-          </w:tcPr>
-          <w:p>
-            <w:pPr>
-              <w:jc w:val="left"/>
-            </w:pPr>
-            <w:r>
-              <w:rPr>
-                <w:sz w:val="20"/>
-              </w:rPr>
-              <w:t>8</w:t>
-            </w:r>
-          </w:p>
-        </w:tc>
-        <w:tc>
-          <w:tcPr>
-            <w:tcW w:type="dxa" w:w="1726"/>
-          </w:tcPr>
-          <w:p>
-            <w:pPr>
-              <w:jc w:val="left"/>
-            </w:pPr>
-            <w:r>
-              <w:rPr>
-                <w:sz w:val="20"/>
-              </w:rPr>
-              <w:t>Tom Burchell</w:t>
-            </w:r>
-          </w:p>
-        </w:tc>
-        <w:tc>
-          <w:tcPr>
-            <w:tcW w:type="dxa" w:w="1726"/>
-          </w:tcPr>
-          <w:p>
-            <w:pPr>
-              <w:jc w:val="left"/>
-            </w:pPr>
-            <w:r>
-              <w:rPr>
-                <w:sz w:val="20"/>
-              </w:rPr>
-              <w:t>Express middleware stack; environment config; security headers; logger setup</w:t>
-            </w:r>
-          </w:p>
-        </w:tc>
-      </w:tr>
-      <w:tr>
-        <w:tc>
-          <w:tcPr>
-            <w:tcW w:type="dxa" w:w="1725"/>
-          </w:tcPr>
-          <w:p>
-            <w:pPr>
-              <w:jc w:val="left"/>
-            </w:pPr>
-            <w:r>
-              <w:rPr>
-                <w:sz w:val="20"/>
-              </w:rPr>
-              <w:t>2025-07-03</w:t>
-            </w:r>
-          </w:p>
-        </w:tc>
-        <w:tc>
-          <w:tcPr>
-            <w:tcW w:type="dxa" w:w="1727"/>
-          </w:tcPr>
-          <w:p>
-            <w:pPr>
-              <w:jc w:val="left"/>
-            </w:pPr>
-            <w:r>
-              <w:rPr>
-                <w:sz w:val="20"/>
-              </w:rPr>
-              <w:t>Backend Architecture – API routes &amp; error handling</w:t>
-            </w:r>
-          </w:p>
-        </w:tc>
-        <w:tc>
-          <w:tcPr>
-            <w:tcW w:type="dxa" w:w="1726"/>
-          </w:tcPr>
-          <w:p>
-            <w:pPr>
-              <w:jc w:val="left"/>
-            </w:pPr>
-            <w:r>
-              <w:rPr>
-                <w:sz w:val="20"/>
-              </w:rPr>
-              <w:t>6</w:t>
-            </w:r>
-          </w:p>
-        </w:tc>
-        <w:tc>
-          <w:tcPr>
-            <w:tcW w:type="dxa" w:w="1726"/>
-          </w:tcPr>
-          <w:p>
-            <w:pPr>
-              <w:jc w:val="left"/>
-            </w:pPr>
-            <w:r>
-              <w:rPr>
-                <w:sz w:val="20"/>
-              </w:rPr>
-              <w:t>Tom Burchell</w:t>
-            </w:r>
-          </w:p>
-        </w:tc>
-        <w:tc>
-          <w:tcPr>
-            <w:tcW w:type="dxa" w:w="1726"/>
-          </w:tcPr>
-          <w:p>
-            <w:pPr>
-              <w:jc w:val="left"/>
-            </w:pPr>
-            <w:r>
-              <w:rPr>
-                <w:sz w:val="20"/>
-              </w:rPr>
-              <w:t>Health route; session route skeleton; centralised error handler; audit logger</w:t>
-            </w:r>
-          </w:p>
-        </w:tc>
-      </w:tr>
-      <w:tr>
-        <w:tc>
-          <w:tcPr>
-            <w:tcW w:type="dxa" w:w="1725"/>
-          </w:tcPr>
-          <w:p>
-            <w:pPr>
-              <w:jc w:val="left"/>
-            </w:pPr>
-            <w:r>
-              <w:rPr>
-                <w:sz w:val="20"/>
-              </w:rPr>
-              <w:t>2025-07-07</w:t>
-            </w:r>
-          </w:p>
-        </w:tc>
-        <w:tc>
-          <w:tcPr>
-            <w:tcW w:type="dxa" w:w="1727"/>
-          </w:tcPr>
-          <w:p>
-            <w:pPr>
-              <w:jc w:val="left"/>
-            </w:pPr>
-            <w:r>
-              <w:rPr>
-                <w:sz w:val="20"/>
-              </w:rPr>
-              <w:t>Socket.IO Core – Namespaces &amp; Rooms</w:t>
-            </w:r>
-          </w:p>
-        </w:tc>
-        <w:tc>
-          <w:tcPr>
-            <w:tcW w:type="dxa" w:w="1726"/>
-          </w:tcPr>
-          <w:p>
-            <w:pPr>
-              <w:jc w:val="left"/>
-            </w:pPr>
-            <w:r>
-              <w:rPr>
-                <w:sz w:val="20"/>
-              </w:rPr>
-              <w:t>8</w:t>
-            </w:r>
-          </w:p>
-        </w:tc>
-        <w:tc>
-          <w:tcPr>
-            <w:tcW w:type="dxa" w:w="1726"/>
-          </w:tcPr>
-          <w:p>
-            <w:pPr>
-              <w:jc w:val="left"/>
-            </w:pPr>
-            <w:r>
-              <w:rPr>
-                <w:sz w:val="20"/>
-              </w:rPr>
-              <w:t>Tom Burchell</w:t>
-            </w:r>
-          </w:p>
-        </w:tc>
-        <w:tc>
-          <w:tcPr>
-            <w:tcW w:type="dxa" w:w="1726"/>
-          </w:tcPr>
-          <w:p>
-            <w:pPr>
-              <w:jc w:val="left"/>
-            </w:pPr>
-            <w:r>
-              <w:rPr>
-                <w:sz w:val="20"/>
-              </w:rPr>
-              <w:t>Socket.IO server init; room creation on session start; namespace strategy defined</w:t>
-            </w:r>
-          </w:p>
-        </w:tc>
-      </w:tr>
-      <w:tr>
-        <w:tc>
-          <w:tcPr>
-            <w:tcW w:type="dxa" w:w="1725"/>
-          </w:tcPr>
-          <w:p>
-            <w:pPr>
-              <w:jc w:val="left"/>
-            </w:pPr>
-            <w:r>
-              <w:rPr>
-                <w:sz w:val="20"/>
-              </w:rPr>
-              <w:t>2025-07-10</w:t>
-            </w:r>
-          </w:p>
-        </w:tc>
-        <w:tc>
-          <w:tcPr>
-            <w:tcW w:type="dxa" w:w="1727"/>
-          </w:tcPr>
-          <w:p>
-            <w:pPr>
-              <w:jc w:val="left"/>
-            </w:pPr>
-            <w:r>
-              <w:rPr>
-                <w:sz w:val="20"/>
-              </w:rPr>
-              <w:t>Socket.IO Core – event protocol design</w:t>
-            </w:r>
-          </w:p>
-        </w:tc>
-        <w:tc>
-          <w:tcPr>
-            <w:tcW w:type="dxa" w:w="1726"/>
-          </w:tcPr>
-          <w:p>
-            <w:pPr>
-              <w:jc w:val="left"/>
-            </w:pPr>
-            <w:r>
-              <w:rPr>
-                <w:sz w:val="20"/>
-              </w:rPr>
-              <w:t>6</w:t>
-            </w:r>
-          </w:p>
-        </w:tc>
-        <w:tc>
-          <w:tcPr>
-            <w:tcW w:type="dxa" w:w="1726"/>
-          </w:tcPr>
-          <w:p>
-            <w:pPr>
-              <w:jc w:val="left"/>
-            </w:pPr>
-            <w:r>
-              <w:rPr>
-                <w:sz w:val="20"/>
-              </w:rPr>
-              <w:t>Tom Burchell</w:t>
-            </w:r>
-          </w:p>
-        </w:tc>
-        <w:tc>
-          <w:tcPr>
-            <w:tcW w:type="dxa" w:w="1726"/>
-          </w:tcPr>
-          <w:p>
-            <w:pPr>
-              <w:jc w:val="left"/>
-            </w:pPr>
-            <w:r>
-              <w:rPr>
-                <w:sz w:val="20"/>
-              </w:rPr>
-              <w:t>Socket event catalog drafted; join/leave events; broadcast vs. targeted emit</w:t>
-            </w:r>
-          </w:p>
-        </w:tc>
-      </w:tr>
-      <w:tr>
-        <w:tc>
-          <w:tcPr>
-            <w:tcW w:type="dxa" w:w="1725"/>
-          </w:tcPr>
-          <w:p>
-            <w:pPr>
-              <w:jc w:val="left"/>
-            </w:pPr>
-            <w:r>
-              <w:rPr>
-                <w:sz w:val="20"/>
-              </w:rPr>
-              <w:t>2025-07-14</w:t>
-            </w:r>
-          </w:p>
-        </w:tc>
-        <w:tc>
-          <w:tcPr>
-            <w:tcW w:type="dxa" w:w="1727"/>
-          </w:tcPr>
-          <w:p>
-            <w:pPr>
-              <w:jc w:val="left"/>
-            </w:pPr>
-            <w:r>
-              <w:rPr>
-                <w:sz w:val="20"/>
-              </w:rPr>
-              <w:t>Session Store &amp; Join Flow</w:t>
-            </w:r>
-          </w:p>
-        </w:tc>
-        <w:tc>
-          <w:tcPr>
-            <w:tcW w:type="dxa" w:w="1726"/>
-          </w:tcPr>
-          <w:p>
-            <w:pPr>
-              <w:jc w:val="left"/>
-            </w:pPr>
-            <w:r>
-              <w:rPr>
-                <w:sz w:val="20"/>
-              </w:rPr>
-              <w:t>7</w:t>
-            </w:r>
-          </w:p>
-        </w:tc>
-        <w:tc>
-          <w:tcPr>
-            <w:tcW w:type="dxa" w:w="1726"/>
-          </w:tcPr>
-          <w:p>
-            <w:pPr>
-              <w:jc w:val="left"/>
-            </w:pPr>
-            <w:r>
-              <w:rPr>
-                <w:sz w:val="20"/>
-              </w:rPr>
-              <w:t>Tom Burchell</w:t>
-            </w:r>
-          </w:p>
-        </w:tc>
-        <w:tc>
-          <w:tcPr>
-            <w:tcW w:type="dxa" w:w="1726"/>
-          </w:tcPr>
-          <w:p>
-            <w:pPr>
-              <w:jc w:val="left"/>
-            </w:pPr>
-            <w:r>
-              <w:rPr>
-                <w:sz w:val="20"/>
-              </w:rPr>
-              <w:t>In-memory session store implemented; trainee join/leave; session expiry logic</w:t>
-            </w:r>
-          </w:p>
-        </w:tc>
-      </w:tr>
-      <w:tr>
-        <w:tc>
-          <w:tcPr>
-            <w:tcW w:type="dxa" w:w="1725"/>
-          </w:tcPr>
-          <w:p>
-            <w:pPr>
-              <w:jc w:val="left"/>
-            </w:pPr>
-            <w:r>
-              <w:rPr>
-                <w:sz w:val="20"/>
-              </w:rPr>
-              <w:t>2025-07-14</w:t>
-            </w:r>
-          </w:p>
-        </w:tc>
-        <w:tc>
-          <w:tcPr>
-            <w:tcW w:type="dxa" w:w="1727"/>
-          </w:tcPr>
-          <w:p>
-            <w:pPr>
-              <w:jc w:val="left"/>
-            </w:pPr>
-            <w:r>
-              <w:rPr>
-                <w:sz w:val="20"/>
-              </w:rPr>
-              <w:t>Frontend Component Skeleton</w:t>
-            </w:r>
-          </w:p>
-        </w:tc>
-        <w:tc>
-          <w:tcPr>
-            <w:tcW w:type="dxa" w:w="1726"/>
-          </w:tcPr>
-          <w:p>
-            <w:pPr>
-              <w:jc w:val="left"/>
-            </w:pPr>
-            <w:r>
-              <w:rPr>
-                <w:sz w:val="20"/>
-              </w:rPr>
-              <w:t>7</w:t>
-            </w:r>
-          </w:p>
-        </w:tc>
-        <w:tc>
-          <w:tcPr>
-            <w:tcW w:type="dxa" w:w="1726"/>
-          </w:tcPr>
-          <w:p>
-            <w:pPr>
-              <w:jc w:val="left"/>
-            </w:pPr>
-            <w:r>
-              <w:rPr>
-                <w:sz w:val="20"/>
-              </w:rPr>
-              <w:t>Leo Wasiliew</w:t>
-            </w:r>
-          </w:p>
-        </w:tc>
-        <w:tc>
-          <w:tcPr>
-            <w:tcW w:type="dxa" w:w="1726"/>
-          </w:tcPr>
-          <w:p>
-            <w:pPr>
-              <w:jc w:val="left"/>
-            </w:pPr>
-            <w:r>
-              <w:rPr>
-                <w:sz w:val="20"/>
-              </w:rPr>
-              <w:t>React component tree; SessionSetup, ScenarioSelector, EventLog stubs created</w:t>
-            </w:r>
-          </w:p>
-        </w:tc>
-      </w:tr>
-      <w:tr>
-        <w:tc>
-          <w:tcPr>
-            <w:tcW w:type="dxa" w:w="1725"/>
-          </w:tcPr>
-          <w:p>
-            <w:pPr>
-              <w:jc w:val="left"/>
-            </w:pPr>
-            <w:r>
-              <w:rPr>
-                <w:sz w:val="20"/>
-              </w:rPr>
-              <w:t>2025-07-17</w:t>
-            </w:r>
-          </w:p>
-        </w:tc>
-        <w:tc>
-          <w:tcPr>
-            <w:tcW w:type="dxa" w:w="1727"/>
-          </w:tcPr>
-          <w:p>
-            <w:pPr>
-              <w:jc w:val="left"/>
-            </w:pPr>
-            <w:r>
-              <w:rPr>
-                <w:sz w:val="20"/>
-              </w:rPr>
-              <w:t>Frontend – routing &amp; state management</w:t>
-            </w:r>
-          </w:p>
-        </w:tc>
-        <w:tc>
-          <w:tcPr>
-            <w:tcW w:type="dxa" w:w="1726"/>
-          </w:tcPr>
-          <w:p>
-            <w:pPr>
-              <w:jc w:val="left"/>
-            </w:pPr>
-            <w:r>
-              <w:rPr>
-                <w:sz w:val="20"/>
-              </w:rPr>
-              <w:t>6</w:t>
-            </w:r>
-          </w:p>
-        </w:tc>
-        <w:tc>
-          <w:tcPr>
-            <w:tcW w:type="dxa" w:w="1726"/>
-          </w:tcPr>
-          <w:p>
-            <w:pPr>
-              <w:jc w:val="left"/>
-            </w:pPr>
-            <w:r>
-              <w:rPr>
-                <w:sz w:val="20"/>
-              </w:rPr>
-              <w:t>Leo Wasiliew</w:t>
-            </w:r>
-          </w:p>
-        </w:tc>
-        <w:tc>
-          <w:tcPr>
-            <w:tcW w:type="dxa" w:w="1726"/>
-          </w:tcPr>
-          <w:p>
-            <w:pPr>
-              <w:jc w:val="left"/>
-            </w:pPr>
-            <w:r>
-              <w:rPr>
-                <w:sz w:val="20"/>
-              </w:rPr>
-              <w:t>useSocket hook; socket context; App-level routing between views</w:t>
-            </w:r>
-          </w:p>
-        </w:tc>
-      </w:tr>
-      <w:tr>
-        <w:tc>
-          <w:tcPr>
-            <w:tcW w:type="dxa" w:w="1725"/>
-          </w:tcPr>
-          <w:p>
-            <w:pPr>
-              <w:jc w:val="left"/>
-            </w:pPr>
-            <w:r>
-              <w:rPr>
-                <w:sz w:val="20"/>
-              </w:rPr>
-              <w:t>2025-07-21</w:t>
-            </w:r>
-          </w:p>
-        </w:tc>
-        <w:tc>
-          <w:tcPr>
-            <w:tcW w:type="dxa" w:w="1727"/>
-          </w:tcPr>
-          <w:p>
-            <w:pPr>
-              <w:jc w:val="left"/>
-            </w:pPr>
-            <w:r>
-              <w:rPr>
-                <w:sz w:val="20"/>
-              </w:rPr>
-              <w:t>Timed Escalation Engine – design &amp; prototype</w:t>
-            </w:r>
-          </w:p>
-        </w:tc>
-        <w:tc>
-          <w:tcPr>
-            <w:tcW w:type="dxa" w:w="1726"/>
-          </w:tcPr>
-          <w:p>
-            <w:pPr>
-              <w:jc w:val="left"/>
-            </w:pPr>
-            <w:r>
-              <w:rPr>
-                <w:sz w:val="20"/>
-              </w:rPr>
-              <w:t>8</w:t>
-            </w:r>
-          </w:p>
-        </w:tc>
-        <w:tc>
-          <w:tcPr>
-            <w:tcW w:type="dxa" w:w="1726"/>
-          </w:tcPr>
-          <w:p>
-            <w:pPr>
-              <w:jc w:val="left"/>
-            </w:pPr>
-            <w:r>
-              <w:rPr>
-                <w:sz w:val="20"/>
-              </w:rPr>
-              <w:t>Tom Burchell</w:t>
-            </w:r>
-          </w:p>
-        </w:tc>
-        <w:tc>
-          <w:tcPr>
-            <w:tcW w:type="dxa" w:w="1726"/>
-          </w:tcPr>
-          <w:p>
-            <w:pPr>
-              <w:jc w:val="left"/>
-            </w:pPr>
-            <w:r>
-              <w:rPr>
-                <w:sz w:val="20"/>
-              </w:rPr>
-              <w:t>Escalation service architecture; timer queue; automatic scenario event injection</w:t>
-            </w:r>
-          </w:p>
-        </w:tc>
-      </w:tr>
-      <w:tr>
-        <w:tc>
-          <w:tcPr>
-            <w:tcW w:type="dxa" w:w="1725"/>
-          </w:tcPr>
-          <w:p>
-            <w:pPr>
-              <w:jc w:val="left"/>
-            </w:pPr>
-            <w:r>
-              <w:rPr>
-                <w:sz w:val="20"/>
-              </w:rPr>
-              <w:t>2025-07-24</w:t>
-            </w:r>
-          </w:p>
-        </w:tc>
-        <w:tc>
-          <w:tcPr>
-            <w:tcW w:type="dxa" w:w="1727"/>
-          </w:tcPr>
-          <w:p>
-            <w:pPr>
-              <w:jc w:val="left"/>
-            </w:pPr>
-            <w:r>
-              <w:rPr>
-                <w:sz w:val="20"/>
-              </w:rPr>
-              <w:t>Timed Escalation Engine – integration</w:t>
-            </w:r>
-          </w:p>
-        </w:tc>
-        <w:tc>
-          <w:tcPr>
-            <w:tcW w:type="dxa" w:w="1726"/>
-          </w:tcPr>
-          <w:p>
-            <w:pPr>
-              <w:jc w:val="left"/>
-            </w:pPr>
-            <w:r>
-              <w:rPr>
-                <w:sz w:val="20"/>
-              </w:rPr>
-              <w:t>7</w:t>
-            </w:r>
-          </w:p>
-        </w:tc>
-        <w:tc>
-          <w:tcPr>
-            <w:tcW w:type="dxa" w:w="1726"/>
-          </w:tcPr>
-          <w:p>
-            <w:pPr>
-              <w:jc w:val="left"/>
-            </w:pPr>
-            <w:r>
-              <w:rPr>
-                <w:sz w:val="20"/>
-              </w:rPr>
-              <w:t>Tom Burchell</w:t>
-            </w:r>
-          </w:p>
-        </w:tc>
-        <w:tc>
-          <w:tcPr>
-            <w:tcW w:type="dxa" w:w="1726"/>
-          </w:tcPr>
-          <w:p>
-            <w:pPr>
-              <w:jc w:val="left"/>
-            </w:pPr>
-            <w:r>
-              <w:rPr>
-                <w:sz w:val="20"/>
-              </w:rPr>
-              <w:t>Escalation events wired to Socket.IO broadcasts; scenario registry integrated</w:t>
-            </w:r>
-          </w:p>
-        </w:tc>
-      </w:tr>
-      <w:tr>
-        <w:tc>
-          <w:tcPr>
-            <w:tcW w:type="dxa" w:w="1725"/>
-          </w:tcPr>
-          <w:p>
-            <w:pPr>
-              <w:jc w:val="left"/>
-            </w:pPr>
-            <w:r>
-              <w:rPr>
-                <w:sz w:val="20"/>
-              </w:rPr>
-              <w:t>2025-07-28</w:t>
-            </w:r>
-          </w:p>
-        </w:tc>
-        <w:tc>
-          <w:tcPr>
-            <w:tcW w:type="dxa" w:w="1727"/>
-          </w:tcPr>
-          <w:p>
-            <w:pPr>
-              <w:jc w:val="left"/>
-            </w:pPr>
-            <w:r>
-              <w:rPr>
-                <w:sz w:val="20"/>
-              </w:rPr>
-              <w:t>Admin Dashboard with Real-Time Log</w:t>
-            </w:r>
-          </w:p>
-        </w:tc>
-        <w:tc>
-          <w:tcPr>
-            <w:tcW w:type="dxa" w:w="1726"/>
-          </w:tcPr>
-          <w:p>
-            <w:pPr>
-              <w:jc w:val="left"/>
-            </w:pPr>
-            <w:r>
-              <w:rPr>
-                <w:sz w:val="20"/>
-              </w:rPr>
-              <w:t>8</w:t>
-            </w:r>
-          </w:p>
-        </w:tc>
-        <w:tc>
-          <w:tcPr>
-            <w:tcW w:type="dxa" w:w="1726"/>
-          </w:tcPr>
-          <w:p>
-            <w:pPr>
-              <w:jc w:val="left"/>
-            </w:pPr>
-            <w:r>
-              <w:rPr>
-                <w:sz w:val="20"/>
-              </w:rPr>
-              <w:t>Leo Wasiliew</w:t>
-            </w:r>
-          </w:p>
-        </w:tc>
-        <w:tc>
-          <w:tcPr>
-            <w:tcW w:type="dxa" w:w="1726"/>
-          </w:tcPr>
-          <w:p>
-            <w:pPr>
-              <w:jc w:val="left"/>
-            </w:pPr>
-            <w:r>
-              <w:rPr>
-                <w:sz w:val="20"/>
-              </w:rPr>
-              <w:t>AdminDashboard component; live event log display; scenario control panel</w:t>
-            </w:r>
-          </w:p>
-        </w:tc>
-      </w:tr>
-      <w:tr>
-        <w:tc>
-          <w:tcPr>
-            <w:tcW w:type="dxa" w:w="1725"/>
-          </w:tcPr>
-          <w:p>
-            <w:pPr>
-              <w:jc w:val="left"/>
-            </w:pPr>
-            <w:r>
-              <w:rPr>
-                <w:sz w:val="20"/>
-              </w:rPr>
-              <w:t>2025-07-28</w:t>
-            </w:r>
-          </w:p>
-        </w:tc>
-        <w:tc>
-          <w:tcPr>
-            <w:tcW w:type="dxa" w:w="1727"/>
-          </w:tcPr>
-          <w:p>
-            <w:pPr>
-              <w:jc w:val="left"/>
-            </w:pPr>
-            <w:r>
-              <w:rPr>
-                <w:sz w:val="20"/>
-              </w:rPr>
-              <w:t>Scenario Authoring – Fire scenarios (Class A–K)</w:t>
-            </w:r>
-          </w:p>
-        </w:tc>
-        <w:tc>
-          <w:tcPr>
-            <w:tcW w:type="dxa" w:w="1726"/>
-          </w:tcPr>
-          <w:p>
-            <w:pPr>
-              <w:jc w:val="left"/>
-            </w:pPr>
-            <w:r>
-              <w:rPr>
-                <w:sz w:val="20"/>
-              </w:rPr>
-              <w:t>8</w:t>
-            </w:r>
-          </w:p>
-        </w:tc>
-        <w:tc>
-          <w:tcPr>
-            <w:tcW w:type="dxa" w:w="1726"/>
-          </w:tcPr>
-          <w:p>
-            <w:pPr>
-              <w:jc w:val="left"/>
-            </w:pPr>
-            <w:r>
-              <w:rPr>
-                <w:sz w:val="20"/>
-              </w:rPr>
-              <w:t>John Hay</w:t>
-            </w:r>
-          </w:p>
-        </w:tc>
-        <w:tc>
-          <w:tcPr>
-            <w:tcW w:type="dxa" w:w="1726"/>
-          </w:tcPr>
-          <w:p>
-            <w:pPr>
-              <w:jc w:val="left"/>
-            </w:pPr>
-            <w:r>
-              <w:rPr>
-                <w:sz w:val="20"/>
-              </w:rPr>
-              <w:t>Five fire scenario JSON definitions with decision trees and failure nodes</w:t>
-            </w:r>
-          </w:p>
-        </w:tc>
-      </w:tr>
-      <w:tr>
-        <w:tc>
-          <w:tcPr>
-            <w:tcW w:type="dxa" w:w="1725"/>
-          </w:tcPr>
-          <w:p>
-            <w:pPr>
-              <w:jc w:val="left"/>
-            </w:pPr>
-            <w:r>
-              <w:rPr>
-                <w:sz w:val="20"/>
-              </w:rPr>
-              <w:t>2025-07-31</w:t>
-            </w:r>
-          </w:p>
-        </w:tc>
-        <w:tc>
-          <w:tcPr>
-            <w:tcW w:type="dxa" w:w="1727"/>
-          </w:tcPr>
-          <w:p>
-            <w:pPr>
-              <w:jc w:val="left"/>
-            </w:pPr>
-            <w:r>
-              <w:rPr>
-                <w:sz w:val="20"/>
-              </w:rPr>
-              <w:t>Admin Dashboard – real-time socket integration</w:t>
-            </w:r>
-          </w:p>
-        </w:tc>
-        <w:tc>
-          <w:tcPr>
-            <w:tcW w:type="dxa" w:w="1726"/>
-          </w:tcPr>
-          <w:p>
-            <w:pPr>
-              <w:jc w:val="left"/>
-            </w:pPr>
-            <w:r>
-              <w:rPr>
-                <w:sz w:val="20"/>
-              </w:rPr>
-              <w:t>6</w:t>
-            </w:r>
-          </w:p>
-        </w:tc>
-        <w:tc>
-          <w:tcPr>
-            <w:tcW w:type="dxa" w:w="1726"/>
-          </w:tcPr>
-          <w:p>
-            <w:pPr>
-              <w:jc w:val="left"/>
-            </w:pPr>
-            <w:r>
-              <w:rPr>
-                <w:sz w:val="20"/>
-              </w:rPr>
-              <w:t>Leo Wasiliew</w:t>
-            </w:r>
-          </w:p>
-        </w:tc>
-        <w:tc>
-          <w:tcPr>
-            <w:tcW w:type="dxa" w:w="1726"/>
-          </w:tcPr>
-          <w:p>
-            <w:pPr>
-              <w:jc w:val="left"/>
-            </w:pPr>
-            <w:r>
-              <w:rPr>
-                <w:sz w:val="20"/>
-              </w:rPr>
-              <w:t>Admin socket listeners; session state reflected in UI; trainee list panel</w:t>
-            </w:r>
-          </w:p>
-        </w:tc>
-      </w:tr>
-      <w:tr>
-        <w:tc>
-          <w:tcPr>
-            <w:tcW w:type="dxa" w:w="1725"/>
-          </w:tcPr>
-          <w:p>
-            <w:pPr>
-              <w:jc w:val="left"/>
-            </w:pPr>
-            <w:r>
-              <w:rPr>
-                <w:sz w:val="20"/>
-              </w:rPr>
-              <w:t>2025-08-04</w:t>
-            </w:r>
-          </w:p>
-        </w:tc>
-        <w:tc>
-          <w:tcPr>
-            <w:tcW w:type="dxa" w:w="1727"/>
-          </w:tcPr>
-          <w:p>
-            <w:pPr>
-              <w:jc w:val="left"/>
-            </w:pPr>
-            <w:r>
-              <w:rPr>
-                <w:sz w:val="20"/>
-              </w:rPr>
-              <w:t>Trainee Interface &amp; Actions</w:t>
-            </w:r>
-          </w:p>
-        </w:tc>
-        <w:tc>
-          <w:tcPr>
-            <w:tcW w:type="dxa" w:w="1726"/>
-          </w:tcPr>
-          <w:p>
-            <w:pPr>
-              <w:jc w:val="left"/>
-            </w:pPr>
-            <w:r>
-              <w:rPr>
-                <w:sz w:val="20"/>
-              </w:rPr>
-              <w:t>8</w:t>
-            </w:r>
-          </w:p>
-        </w:tc>
-        <w:tc>
-          <w:tcPr>
-            <w:tcW w:type="dxa" w:w="1726"/>
-          </w:tcPr>
-          <w:p>
-            <w:pPr>
-              <w:jc w:val="left"/>
-            </w:pPr>
-            <w:r>
-              <w:rPr>
-                <w:sz w:val="20"/>
-              </w:rPr>
-              <w:t>Leo Wasiliew</w:t>
-            </w:r>
-          </w:p>
-        </w:tc>
-        <w:tc>
-          <w:tcPr>
-            <w:tcW w:type="dxa" w:w="1726"/>
-          </w:tcPr>
-          <w:p>
-            <w:pPr>
-              <w:jc w:val="left"/>
-            </w:pPr>
-            <w:r>
-              <w:rPr>
-                <w:sz w:val="20"/>
-              </w:rPr>
-              <w:t>TraineeInterface component; action submission; live event log for trainees</w:t>
-            </w:r>
-          </w:p>
-        </w:tc>
-      </w:tr>
-      <w:tr>
-        <w:tc>
-          <w:tcPr>
-            <w:tcW w:type="dxa" w:w="1725"/>
-          </w:tcPr>
-          <w:p>
-            <w:pPr>
-              <w:jc w:val="left"/>
-            </w:pPr>
-            <w:r>
-              <w:rPr>
-                <w:sz w:val="20"/>
-              </w:rPr>
-              <w:t>2025-08-04</w:t>
-            </w:r>
-          </w:p>
-        </w:tc>
-        <w:tc>
-          <w:tcPr>
-            <w:tcW w:type="dxa" w:w="1727"/>
-          </w:tcPr>
-          <w:p>
-            <w:pPr>
-              <w:jc w:val="left"/>
-            </w:pPr>
-            <w:r>
-              <w:rPr>
-                <w:sz w:val="20"/>
-              </w:rPr>
-              <w:t>Scenario Authoring – Medical scenarios</w:t>
-            </w:r>
-          </w:p>
-        </w:tc>
-        <w:tc>
-          <w:tcPr>
-            <w:tcW w:type="dxa" w:w="1726"/>
-          </w:tcPr>
-          <w:p>
-            <w:pPr>
-              <w:jc w:val="left"/>
-            </w:pPr>
-            <w:r>
-              <w:rPr>
-                <w:sz w:val="20"/>
-              </w:rPr>
-              <w:t>8</w:t>
-            </w:r>
-          </w:p>
-        </w:tc>
-        <w:tc>
-          <w:tcPr>
-            <w:tcW w:type="dxa" w:w="1726"/>
-          </w:tcPr>
-          <w:p>
-            <w:pPr>
-              <w:jc w:val="left"/>
-            </w:pPr>
-            <w:r>
-              <w:rPr>
-                <w:sz w:val="20"/>
-              </w:rPr>
-              <w:t>John Hay</w:t>
-            </w:r>
-          </w:p>
-        </w:tc>
-        <w:tc>
-          <w:tcPr>
-            <w:tcW w:type="dxa" w:w="1726"/>
-          </w:tcPr>
-          <w:p>
-            <w:pPr>
-              <w:jc w:val="left"/>
-            </w:pPr>
-            <w:r>
-              <w:rPr>
-                <w:sz w:val="20"/>
-              </w:rPr>
-              <w:t>Medical emergency scenarios: Chest Pain, Stroke, Opioid Overdose, Seizure, Falls, etc.</w:t>
-            </w:r>
-          </w:p>
-        </w:tc>
-      </w:tr>
-      <w:tr>
-        <w:tc>
-          <w:tcPr>
-            <w:tcW w:type="dxa" w:w="1725"/>
-          </w:tcPr>
-          <w:p>
-            <w:pPr>
-              <w:jc w:val="left"/>
-            </w:pPr>
-            <w:r>
-              <w:rPr>
-                <w:sz w:val="20"/>
-              </w:rPr>
-              <w:t>2025-08-07</w:t>
-            </w:r>
-          </w:p>
-        </w:tc>
-        <w:tc>
-          <w:tcPr>
-            <w:tcW w:type="dxa" w:w="1727"/>
-          </w:tcPr>
-          <w:p>
-            <w:pPr>
-              <w:jc w:val="left"/>
-            </w:pPr>
-            <w:r>
-              <w:rPr>
-                <w:sz w:val="20"/>
-              </w:rPr>
-              <w:t>Trainee Interface – responsive design pass</w:t>
-            </w:r>
-          </w:p>
-        </w:tc>
-        <w:tc>
-          <w:tcPr>
-            <w:tcW w:type="dxa" w:w="1726"/>
-          </w:tcPr>
-          <w:p>
-            <w:pPr>
-              <w:jc w:val="left"/>
-            </w:pPr>
-            <w:r>
-              <w:rPr>
-                <w:sz w:val="20"/>
-              </w:rPr>
-              <w:t>5</w:t>
-            </w:r>
-          </w:p>
-        </w:tc>
-        <w:tc>
-          <w:tcPr>
-            <w:tcW w:type="dxa" w:w="1726"/>
-          </w:tcPr>
-          <w:p>
-            <w:pPr>
-              <w:jc w:val="left"/>
-            </w:pPr>
-            <w:r>
-              <w:rPr>
-                <w:sz w:val="20"/>
-              </w:rPr>
-              <w:t>Leo Wasiliew</w:t>
-            </w:r>
-          </w:p>
-        </w:tc>
-        <w:tc>
-          <w:tcPr>
-            <w:tcW w:type="dxa" w:w="1726"/>
-          </w:tcPr>
-          <w:p>
-            <w:pPr>
-              <w:jc w:val="left"/>
-            </w:pPr>
-            <w:r>
-              <w:rPr>
-                <w:sz w:val="20"/>
-              </w:rPr>
-              <w:t>Mobile-friendly layout; CSS refinements; TimelineDisplay component</w:t>
-            </w:r>
-          </w:p>
-        </w:tc>
-      </w:tr>
-      <w:tr>
-        <w:tc>
-          <w:tcPr>
-            <w:tcW w:type="dxa" w:w="1725"/>
-          </w:tcPr>
-          <w:p>
-            <w:pPr>
-              <w:jc w:val="left"/>
-            </w:pPr>
-            <w:r>
-              <w:rPr>
-                <w:sz w:val="20"/>
-              </w:rPr>
-              <w:t>2025-08-11</w:t>
-            </w:r>
-          </w:p>
-        </w:tc>
-        <w:tc>
-          <w:tcPr>
-            <w:tcW w:type="dxa" w:w="1727"/>
-          </w:tcPr>
-          <w:p>
-            <w:pPr>
-              <w:jc w:val="left"/>
-            </w:pPr>
-            <w:r>
-              <w:rPr>
-                <w:sz w:val="20"/>
-              </w:rPr>
-              <w:t>Scenario Integration &amp; Validation – initial pass</w:t>
-            </w:r>
-          </w:p>
-        </w:tc>
-        <w:tc>
-          <w:tcPr>
-            <w:tcW w:type="dxa" w:w="1726"/>
-          </w:tcPr>
-          <w:p>
-            <w:pPr>
-              <w:jc w:val="left"/>
-            </w:pPr>
-            <w:r>
-              <w:rPr>
-                <w:sz w:val="20"/>
-              </w:rPr>
-              <w:t>8</w:t>
-            </w:r>
-          </w:p>
-        </w:tc>
-        <w:tc>
-          <w:tcPr>
-            <w:tcW w:type="dxa" w:w="1726"/>
-          </w:tcPr>
-          <w:p>
-            <w:pPr>
-              <w:jc w:val="left"/>
-            </w:pPr>
-            <w:r>
-              <w:rPr>
-                <w:sz w:val="20"/>
-              </w:rPr>
-              <w:t>Tom Burchell, John Hay, Leo Wasiliew</w:t>
-            </w:r>
-          </w:p>
-        </w:tc>
-        <w:tc>
-          <w:tcPr>
-            <w:tcW w:type="dxa" w:w="1726"/>
-          </w:tcPr>
-          <w:p>
-            <w:pPr>
-              <w:jc w:val="left"/>
-            </w:pPr>
-            <w:r>
-              <w:rPr>
-                <w:sz w:val="20"/>
-              </w:rPr>
-              <w:t>End-to-end test of all 8 scenarios; socket flow verified; escalation timings checked</w:t>
-            </w:r>
-          </w:p>
-        </w:tc>
-      </w:tr>
-      <w:tr>
-        <w:tc>
-          <w:tcPr>
-            <w:tcW w:type="dxa" w:w="1725"/>
-          </w:tcPr>
-          <w:p>
-            <w:pPr>
-              <w:jc w:val="left"/>
-            </w:pPr>
-            <w:r>
-              <w:rPr>
-                <w:sz w:val="20"/>
-              </w:rPr>
-              <w:t>2025-08-14</w:t>
-            </w:r>
-          </w:p>
-        </w:tc>
-        <w:tc>
-          <w:tcPr>
-            <w:tcW w:type="dxa" w:w="1727"/>
-          </w:tcPr>
-          <w:p>
-            <w:pPr>
-              <w:jc w:val="left"/>
-            </w:pPr>
-            <w:r>
-              <w:rPr>
-                <w:sz w:val="20"/>
-              </w:rPr>
-              <w:t>Scenario Authoring – Environmental &amp; Security scenarios</w:t>
-            </w:r>
-          </w:p>
-        </w:tc>
-        <w:tc>
-          <w:tcPr>
-            <w:tcW w:type="dxa" w:w="1726"/>
-          </w:tcPr>
-          <w:p>
-            <w:pPr>
-              <w:jc w:val="left"/>
-            </w:pPr>
-            <w:r>
-              <w:rPr>
-                <w:sz w:val="20"/>
-              </w:rPr>
-              <w:t>8</w:t>
-            </w:r>
-          </w:p>
-        </w:tc>
-        <w:tc>
-          <w:tcPr>
-            <w:tcW w:type="dxa" w:w="1726"/>
-          </w:tcPr>
-          <w:p>
-            <w:pPr>
-              <w:jc w:val="left"/>
-            </w:pPr>
-            <w:r>
-              <w:rPr>
-                <w:sz w:val="20"/>
-              </w:rPr>
-              <w:t>John Hay</w:t>
-            </w:r>
-          </w:p>
-        </w:tc>
-        <w:tc>
-          <w:tcPr>
-            <w:tcW w:type="dxa" w:w="1726"/>
-          </w:tcPr>
-          <w:p>
-            <w:pPr>
-              <w:jc w:val="left"/>
-            </w:pPr>
-            <w:r>
-              <w:rPr>
-                <w:sz w:val="20"/>
-              </w:rPr>
-              <w:t>Environmental/Infrastructure and Security &amp; Threat JSON scenarios completed</w:t>
-            </w:r>
-          </w:p>
-        </w:tc>
-      </w:tr>
-      <w:tr>
-        <w:tc>
-          <w:tcPr>
-            <w:tcW w:type="dxa" w:w="1725"/>
-          </w:tcPr>
-          <w:p>
-            <w:pPr>
-              <w:jc w:val="left"/>
-            </w:pPr>
-            <w:r>
-              <w:rPr>
-                <w:sz w:val="20"/>
-              </w:rPr>
-              <w:t>2025-08-18</w:t>
-            </w:r>
-          </w:p>
-        </w:tc>
-        <w:tc>
-          <w:tcPr>
-            <w:tcW w:type="dxa" w:w="1727"/>
-          </w:tcPr>
-          <w:p>
-            <w:pPr>
-              <w:jc w:val="left"/>
-            </w:pPr>
-            <w:r>
-              <w:rPr>
-                <w:sz w:val="20"/>
-              </w:rPr>
-              <w:t>Deployment Pipeline – Docker &amp; CI</w:t>
-            </w:r>
-          </w:p>
-        </w:tc>
-        <w:tc>
-          <w:tcPr>
-            <w:tcW w:type="dxa" w:w="1726"/>
-          </w:tcPr>
-          <w:p>
-            <w:pPr>
-              <w:jc w:val="left"/>
-            </w:pPr>
-            <w:r>
-              <w:rPr>
-                <w:sz w:val="20"/>
-              </w:rPr>
-              <w:t>8</w:t>
-            </w:r>
-          </w:p>
-        </w:tc>
-        <w:tc>
-          <w:tcPr>
-            <w:tcW w:type="dxa" w:w="1726"/>
-          </w:tcPr>
-          <w:p>
-            <w:pPr>
-              <w:jc w:val="left"/>
-            </w:pPr>
-            <w:r>
-              <w:rPr>
-                <w:sz w:val="20"/>
-              </w:rPr>
-              <w:t>Tom Burchell, Kael Payette</w:t>
-            </w:r>
-          </w:p>
-        </w:tc>
-        <w:tc>
-          <w:tcPr>
-            <w:tcW w:type="dxa" w:w="1726"/>
-          </w:tcPr>
-          <w:p>
-            <w:pPr>
-              <w:jc w:val="left"/>
-            </w:pPr>
-            <w:r>
-              <w:rPr>
-                <w:sz w:val="20"/>
-              </w:rPr>
-              <w:t>Dockerfile; docker-compose; GitHub Actions CI workflow; lint and test jobs</w:t>
-            </w:r>
-          </w:p>
-        </w:tc>
-      </w:tr>
-      <w:tr>
-        <w:tc>
-          <w:tcPr>
-            <w:tcW w:type="dxa" w:w="1725"/>
-          </w:tcPr>
-          <w:p>
-            <w:pPr>
-              <w:jc w:val="left"/>
-            </w:pPr>
-            <w:r>
-              <w:rPr>
-                <w:sz w:val="20"/>
-              </w:rPr>
-              <w:t>2025-08-18</w:t>
-            </w:r>
-          </w:p>
-        </w:tc>
-        <w:tc>
-          <w:tcPr>
-            <w:tcW w:type="dxa" w:w="1727"/>
-          </w:tcPr>
-          <w:p>
-            <w:pPr>
-              <w:jc w:val="left"/>
-            </w:pPr>
-            <w:r>
-              <w:rPr>
-                <w:sz w:val="20"/>
-              </w:rPr>
-              <w:t>Scenario Integration – bug fixes &amp; re-testing</w:t>
-            </w:r>
-          </w:p>
-        </w:tc>
-        <w:tc>
-          <w:tcPr>
-            <w:tcW w:type="dxa" w:w="1726"/>
-          </w:tcPr>
-          <w:p>
-            <w:pPr>
-              <w:jc w:val="left"/>
-            </w:pPr>
-            <w:r>
-              <w:rPr>
-                <w:sz w:val="20"/>
-              </w:rPr>
-              <w:t>6</w:t>
-            </w:r>
-          </w:p>
-        </w:tc>
-        <w:tc>
-          <w:tcPr>
-            <w:tcW w:type="dxa" w:w="1726"/>
-          </w:tcPr>
-          <w:p>
-            <w:pPr>
-              <w:jc w:val="left"/>
-            </w:pPr>
-            <w:r>
-              <w:rPr>
-                <w:sz w:val="20"/>
-              </w:rPr>
-              <w:t>Tom Burchell, John Hay, Leo Wasiliew</w:t>
-            </w:r>
-          </w:p>
-        </w:tc>
-        <w:tc>
-          <w:tcPr>
-            <w:tcW w:type="dxa" w:w="1726"/>
-          </w:tcPr>
-          <w:p>
-            <w:pPr>
-              <w:jc w:val="left"/>
-            </w:pPr>
-            <w:r>
-              <w:rPr>
-                <w:sz w:val="20"/>
-              </w:rPr>
-              <w:t>Bug fixes from initial integration pass; scenario data corrections</w:t>
-            </w:r>
-          </w:p>
-        </w:tc>
-      </w:tr>
-      <w:tr>
-        <w:tc>
-          <w:tcPr>
-            <w:tcW w:type="dxa" w:w="1725"/>
-          </w:tcPr>
-          <w:p>
-            <w:pPr>
-              <w:jc w:val="left"/>
-            </w:pPr>
-            <w:r>
-              <w:rPr>
-                <w:sz w:val="20"/>
-              </w:rPr>
-              <w:t>2025-08-21</w:t>
-            </w:r>
-          </w:p>
-        </w:tc>
-        <w:tc>
-          <w:tcPr>
-            <w:tcW w:type="dxa" w:w="1727"/>
-          </w:tcPr>
-          <w:p>
-            <w:pPr>
-              <w:jc w:val="left"/>
-            </w:pPr>
-            <w:r>
-              <w:rPr>
-                <w:sz w:val="20"/>
-              </w:rPr>
-              <w:t>Deployment Pipeline – Render / Railway config</w:t>
+              <w:t>Fire &amp; Rescue Scenario Content (PRs #85–101)</w:t>
             </w:r>
           </w:p>
         </w:tc>
@@ -2135,7 +2073,7 @@
               <w:rPr>
                 <w:sz w:val="20"/>
               </w:rPr>
-              <w:t>render.yaml; railway.json; environment variable documentation; Procfile</w:t>
+              <w:t>Wildland/interface fire; structural fire; roadway/rail/air/marine fire; HazMat; vehicle/transportation fire; technical rescue; medical/EMS; search &amp; rescue; explosion; special environment; fireground complications; mass casualty; arson; fire training notional; psychological/post-incident; removed kiosk mode</w:t>
             </w:r>
           </w:p>
         </w:tc>
@@ -2153,7 +2091,7 @@
               <w:rPr>
                 <w:sz w:val="20"/>
               </w:rPr>
-              <w:t>2025-08-25</w:t>
+              <w:t>2026-04-08</w:t>
             </w:r>
           </w:p>
         </w:tc>
@@ -2169,7 +2107,7 @@
               <w:rPr>
                 <w:sz w:val="20"/>
               </w:rPr>
-              <w:t>Integration / E2E Testing</w:t>
+              <w:t>Law Enforcement – Patrol &amp; Traffic Scenarios (PRs #102–104)</w:t>
             </w:r>
           </w:p>
         </w:tc>
@@ -2185,335 +2123,7 @@
               <w:rPr>
                 <w:sz w:val="20"/>
               </w:rPr>
-              <w:t>8</w:t>
-            </w:r>
-          </w:p>
-        </w:tc>
-        <w:tc>
-          <w:tcPr>
-            <w:tcW w:type="dxa" w:w="1726"/>
-          </w:tcPr>
-          <w:p>
-            <w:pPr>
-              <w:jc w:val="left"/>
-            </w:pPr>
-            <w:r>
-              <w:rPr>
-                <w:sz w:val="20"/>
-              </w:rPr>
-              <w:t>Kael Payette, John Hay</w:t>
-            </w:r>
-          </w:p>
-        </w:tc>
-        <w:tc>
-          <w:tcPr>
-            <w:tcW w:type="dxa" w:w="1726"/>
-          </w:tcPr>
-          <w:p>
-            <w:pPr>
-              <w:jc w:val="left"/>
-            </w:pPr>
-            <w:r>
-              <w:rPr>
-                <w:sz w:val="20"/>
-              </w:rPr>
-              <w:t>Full system test suite; acceptance criteria validation; test report drafted</w:t>
-            </w:r>
-          </w:p>
-        </w:tc>
-      </w:tr>
-      <w:tr>
-        <w:tc>
-          <w:tcPr>
-            <w:tcW w:type="dxa" w:w="1725"/>
-          </w:tcPr>
-          <w:p>
-            <w:pPr>
-              <w:jc w:val="left"/>
-            </w:pPr>
-            <w:r>
-              <w:rPr>
-                <w:sz w:val="20"/>
-              </w:rPr>
-              <w:t>2025-08-25</w:t>
-            </w:r>
-          </w:p>
-        </w:tc>
-        <w:tc>
-          <w:tcPr>
-            <w:tcW w:type="dxa" w:w="1727"/>
-          </w:tcPr>
-          <w:p>
-            <w:pPr>
-              <w:jc w:val="left"/>
-            </w:pPr>
-            <w:r>
-              <w:rPr>
-                <w:sz w:val="20"/>
-              </w:rPr>
-              <w:t>Accessibility &amp; Responsive Pass</w:t>
-            </w:r>
-          </w:p>
-        </w:tc>
-        <w:tc>
-          <w:tcPr>
-            <w:tcW w:type="dxa" w:w="1726"/>
-          </w:tcPr>
-          <w:p>
-            <w:pPr>
-              <w:jc w:val="left"/>
-            </w:pPr>
-            <w:r>
-              <w:rPr>
-                <w:sz w:val="20"/>
-              </w:rPr>
-              <w:t>6</w:t>
-            </w:r>
-          </w:p>
-        </w:tc>
-        <w:tc>
-          <w:tcPr>
-            <w:tcW w:type="dxa" w:w="1726"/>
-          </w:tcPr>
-          <w:p>
-            <w:pPr>
-              <w:jc w:val="left"/>
-            </w:pPr>
-            <w:r>
-              <w:rPr>
-                <w:sz w:val="20"/>
-              </w:rPr>
-              <w:t>John Hay, Leo Wasiliew</w:t>
-            </w:r>
-          </w:p>
-        </w:tc>
-        <w:tc>
-          <w:tcPr>
-            <w:tcW w:type="dxa" w:w="1726"/>
-          </w:tcPr>
-          <w:p>
-            <w:pPr>
-              <w:jc w:val="left"/>
-            </w:pPr>
-            <w:r>
-              <w:rPr>
-                <w:sz w:val="20"/>
-              </w:rPr>
-              <w:t>WCAG 2.1 AA audit; keyboard navigation; colour contrast; ARIA labels</w:t>
-            </w:r>
-          </w:p>
-        </w:tc>
-      </w:tr>
-      <w:tr>
-        <w:tc>
-          <w:tcPr>
-            <w:tcW w:type="dxa" w:w="1725"/>
-          </w:tcPr>
-          <w:p>
-            <w:pPr>
-              <w:jc w:val="left"/>
-            </w:pPr>
-            <w:r>
-              <w:rPr>
-                <w:sz w:val="20"/>
-              </w:rPr>
-              <w:t>2025-08-25</w:t>
-            </w:r>
-          </w:p>
-        </w:tc>
-        <w:tc>
-          <w:tcPr>
-            <w:tcW w:type="dxa" w:w="1727"/>
-          </w:tcPr>
-          <w:p>
-            <w:pPr>
-              <w:jc w:val="left"/>
-            </w:pPr>
-            <w:r>
-              <w:rPr>
-                <w:sz w:val="20"/>
-              </w:rPr>
-              <w:t>Documentation Suite – README &amp; API Specification</w:t>
-            </w:r>
-          </w:p>
-        </w:tc>
-        <w:tc>
-          <w:tcPr>
-            <w:tcW w:type="dxa" w:w="1726"/>
-          </w:tcPr>
-          <w:p>
-            <w:pPr>
-              <w:jc w:val="left"/>
-            </w:pPr>
-            <w:r>
-              <w:rPr>
-                <w:sz w:val="20"/>
-              </w:rPr>
-              <w:t>6</w:t>
-            </w:r>
-          </w:p>
-        </w:tc>
-        <w:tc>
-          <w:tcPr>
-            <w:tcW w:type="dxa" w:w="1726"/>
-          </w:tcPr>
-          <w:p>
-            <w:pPr>
-              <w:jc w:val="left"/>
-            </w:pPr>
-            <w:r>
-              <w:rPr>
-                <w:sz w:val="20"/>
-              </w:rPr>
-              <w:t>Tom Burchell, Leo Wasiliew</w:t>
-            </w:r>
-          </w:p>
-        </w:tc>
-        <w:tc>
-          <w:tcPr>
-            <w:tcW w:type="dxa" w:w="1726"/>
-          </w:tcPr>
-          <w:p>
-            <w:pPr>
-              <w:jc w:val="left"/>
-            </w:pPr>
-            <w:r>
-              <w:rPr>
-                <w:sz w:val="20"/>
-              </w:rPr>
-              <w:t>Backend README; API_Specification.yaml; endpoint documentation</w:t>
-            </w:r>
-          </w:p>
-        </w:tc>
-      </w:tr>
-      <w:tr>
-        <w:tc>
-          <w:tcPr>
-            <w:tcW w:type="dxa" w:w="1725"/>
-          </w:tcPr>
-          <w:p>
-            <w:pPr>
-              <w:jc w:val="left"/>
-            </w:pPr>
-            <w:r>
-              <w:rPr>
-                <w:sz w:val="20"/>
-              </w:rPr>
-              <w:t>2025-08-28</w:t>
-            </w:r>
-          </w:p>
-        </w:tc>
-        <w:tc>
-          <w:tcPr>
-            <w:tcW w:type="dxa" w:w="1727"/>
-          </w:tcPr>
-          <w:p>
-            <w:pPr>
-              <w:jc w:val="left"/>
-            </w:pPr>
-            <w:r>
-              <w:rPr>
-                <w:sz w:val="20"/>
-              </w:rPr>
-              <w:t>Documentation Suite – Socket.IO Event Catalog &amp; Deployment Guide</w:t>
-            </w:r>
-          </w:p>
-        </w:tc>
-        <w:tc>
-          <w:tcPr>
-            <w:tcW w:type="dxa" w:w="1726"/>
-          </w:tcPr>
-          <w:p>
-            <w:pPr>
-              <w:jc w:val="left"/>
-            </w:pPr>
-            <w:r>
-              <w:rPr>
-                <w:sz w:val="20"/>
-              </w:rPr>
-              <w:t>5</w:t>
-            </w:r>
-          </w:p>
-        </w:tc>
-        <w:tc>
-          <w:tcPr>
-            <w:tcW w:type="dxa" w:w="1726"/>
-          </w:tcPr>
-          <w:p>
-            <w:pPr>
-              <w:jc w:val="left"/>
-            </w:pPr>
-            <w:r>
-              <w:rPr>
-                <w:sz w:val="20"/>
-              </w:rPr>
-              <w:t>Tom Burchell, Kael Payette</w:t>
-            </w:r>
-          </w:p>
-        </w:tc>
-        <w:tc>
-          <w:tcPr>
-            <w:tcW w:type="dxa" w:w="1726"/>
-          </w:tcPr>
-          <w:p>
-            <w:pPr>
-              <w:jc w:val="left"/>
-            </w:pPr>
-            <w:r>
-              <w:rPr>
-                <w:sz w:val="20"/>
-              </w:rPr>
-              <w:t>SocketIO_Event_Catalog.md; Deployment_Guide.md; Cloud_Deployment_Quickstart.md</w:t>
-            </w:r>
-          </w:p>
-        </w:tc>
-      </w:tr>
-      <w:tr>
-        <w:tc>
-          <w:tcPr>
-            <w:tcW w:type="dxa" w:w="1725"/>
-          </w:tcPr>
-          <w:p>
-            <w:pPr>
-              <w:jc w:val="left"/>
-            </w:pPr>
-            <w:r>
-              <w:rPr>
-                <w:sz w:val="20"/>
-              </w:rPr>
-              <w:t>2025-09-01</w:t>
-            </w:r>
-          </w:p>
-        </w:tc>
-        <w:tc>
-          <w:tcPr>
-            <w:tcW w:type="dxa" w:w="1727"/>
-          </w:tcPr>
-          <w:p>
-            <w:pPr>
-              <w:jc w:val="left"/>
-            </w:pPr>
-            <w:r>
-              <w:rPr>
-                <w:sz w:val="20"/>
-              </w:rPr>
-              <w:t>Cloud Deployment &amp; Smoke Test</w:t>
-            </w:r>
-          </w:p>
-        </w:tc>
-        <w:tc>
-          <w:tcPr>
-            <w:tcW w:type="dxa" w:w="1726"/>
-          </w:tcPr>
-          <w:p>
-            <w:pPr>
-              <w:jc w:val="left"/>
-            </w:pPr>
-            <w:r>
-              <w:rPr>
-                <w:sz w:val="20"/>
-              </w:rPr>
-              <w:t>6</w:t>
+              <w:t>3</w:t>
             </w:r>
           </w:p>
         </w:tc>
@@ -2545,7 +2155,7 @@
               <w:rPr>
                 <w:sz w:val="20"/>
               </w:rPr>
-              <w:t>Production deployment to cloud platform; smoke tests; live URL verified</w:t>
+              <w:t>12 police patrol and first-response scenarios; 12 Canada-specific traffic and roadway law enforcement scenarios; Criminal Code and major crime scenarios (Sections 2.1–2.2) created</w:t>
             </w:r>
           </w:p>
         </w:tc>
@@ -2563,7 +2173,7 @@
               <w:rPr>
                 <w:sz w:val="20"/>
               </w:rPr>
-              <w:t>2025-09-01</w:t>
+              <w:t>2026-04-09</w:t>
             </w:r>
           </w:p>
         </w:tc>
@@ -2579,499 +2189,7 @@
               <w:rPr>
                 <w:sz w:val="20"/>
               </w:rPr>
-              <w:t>Integration testing – final round</w:t>
-            </w:r>
-          </w:p>
-        </w:tc>
-        <w:tc>
-          <w:tcPr>
-            <w:tcW w:type="dxa" w:w="1726"/>
-          </w:tcPr>
-          <w:p>
-            <w:pPr>
-              <w:jc w:val="left"/>
-            </w:pPr>
-            <w:r>
-              <w:rPr>
-                <w:sz w:val="20"/>
-              </w:rPr>
-              <w:t>5</w:t>
-            </w:r>
-          </w:p>
-        </w:tc>
-        <w:tc>
-          <w:tcPr>
-            <w:tcW w:type="dxa" w:w="1726"/>
-          </w:tcPr>
-          <w:p>
-            <w:pPr>
-              <w:jc w:val="left"/>
-            </w:pPr>
-            <w:r>
-              <w:rPr>
-                <w:sz w:val="20"/>
-              </w:rPr>
-              <w:t>Kael Payette, John Hay</w:t>
-            </w:r>
-          </w:p>
-        </w:tc>
-        <w:tc>
-          <w:tcPr>
-            <w:tcW w:type="dxa" w:w="1726"/>
-          </w:tcPr>
-          <w:p>
-            <w:pPr>
-              <w:jc w:val="left"/>
-            </w:pPr>
-            <w:r>
-              <w:rPr>
-                <w:sz w:val="20"/>
-              </w:rPr>
-              <w:t>Final acceptance test run; sign-off checklist completed; issues logged</w:t>
-            </w:r>
-          </w:p>
-        </w:tc>
-      </w:tr>
-      <w:tr>
-        <w:tc>
-          <w:tcPr>
-            <w:tcW w:type="dxa" w:w="1725"/>
-          </w:tcPr>
-          <w:p>
-            <w:pPr>
-              <w:jc w:val="left"/>
-            </w:pPr>
-            <w:r>
-              <w:rPr>
-                <w:sz w:val="20"/>
-              </w:rPr>
-              <w:t>2025-09-04</w:t>
-            </w:r>
-          </w:p>
-        </w:tc>
-        <w:tc>
-          <w:tcPr>
-            <w:tcW w:type="dxa" w:w="1727"/>
-          </w:tcPr>
-          <w:p>
-            <w:pPr>
-              <w:jc w:val="left"/>
-            </w:pPr>
-            <w:r>
-              <w:rPr>
-                <w:sz w:val="20"/>
-              </w:rPr>
-              <w:t>ADR &amp; supplementary documentation</w:t>
-            </w:r>
-          </w:p>
-        </w:tc>
-        <w:tc>
-          <w:tcPr>
-            <w:tcW w:type="dxa" w:w="1726"/>
-          </w:tcPr>
-          <w:p>
-            <w:pPr>
-              <w:jc w:val="left"/>
-            </w:pPr>
-            <w:r>
-              <w:rPr>
-                <w:sz w:val="20"/>
-              </w:rPr>
-              <w:t>4</w:t>
-            </w:r>
-          </w:p>
-        </w:tc>
-        <w:tc>
-          <w:tcPr>
-            <w:tcW w:type="dxa" w:w="1726"/>
-          </w:tcPr>
-          <w:p>
-            <w:pPr>
-              <w:jc w:val="left"/>
-            </w:pPr>
-            <w:r>
-              <w:rPr>
-                <w:sz w:val="20"/>
-              </w:rPr>
-              <w:t>All Team</w:t>
-            </w:r>
-          </w:p>
-        </w:tc>
-        <w:tc>
-          <w:tcPr>
-            <w:tcW w:type="dxa" w:w="1726"/>
-          </w:tcPr>
-          <w:p>
-            <w:pPr>
-              <w:jc w:val="left"/>
-            </w:pPr>
-            <w:r>
-              <w:rPr>
-                <w:sz w:val="20"/>
-              </w:rPr>
-              <w:t>ADR-001 Stack Selection written; Kickoff Meeting Agenda finalised</w:t>
-            </w:r>
-          </w:p>
-        </w:tc>
-      </w:tr>
-      <w:tr>
-        <w:tc>
-          <w:tcPr>
-            <w:tcW w:type="dxa" w:w="1725"/>
-          </w:tcPr>
-          <w:p>
-            <w:pPr>
-              <w:jc w:val="left"/>
-            </w:pPr>
-            <w:r>
-              <w:rPr>
-                <w:sz w:val="20"/>
-              </w:rPr>
-              <w:t>2025-09-08</w:t>
-            </w:r>
-          </w:p>
-        </w:tc>
-        <w:tc>
-          <w:tcPr>
-            <w:tcW w:type="dxa" w:w="1727"/>
-          </w:tcPr>
-          <w:p>
-            <w:pPr>
-              <w:jc w:val="left"/>
-            </w:pPr>
-            <w:r>
-              <w:rPr>
-                <w:sz w:val="20"/>
-              </w:rPr>
-              <w:t>Demo Preparation</w:t>
-            </w:r>
-          </w:p>
-        </w:tc>
-        <w:tc>
-          <w:tcPr>
-            <w:tcW w:type="dxa" w:w="1726"/>
-          </w:tcPr>
-          <w:p>
-            <w:pPr>
-              <w:jc w:val="left"/>
-            </w:pPr>
-            <w:r>
-              <w:rPr>
-                <w:sz w:val="20"/>
-              </w:rPr>
-              <w:t>6</w:t>
-            </w:r>
-          </w:p>
-        </w:tc>
-        <w:tc>
-          <w:tcPr>
-            <w:tcW w:type="dxa" w:w="1726"/>
-          </w:tcPr>
-          <w:p>
-            <w:pPr>
-              <w:jc w:val="left"/>
-            </w:pPr>
-            <w:r>
-              <w:rPr>
-                <w:sz w:val="20"/>
-              </w:rPr>
-              <w:t>All Team</w:t>
-            </w:r>
-          </w:p>
-        </w:tc>
-        <w:tc>
-          <w:tcPr>
-            <w:tcW w:type="dxa" w:w="1726"/>
-          </w:tcPr>
-          <w:p>
-            <w:pPr>
-              <w:jc w:val="left"/>
-            </w:pPr>
-            <w:r>
-              <w:rPr>
-                <w:sz w:val="20"/>
-              </w:rPr>
-              <w:t>Demo script written; rehearsal run; slide deck finalised</w:t>
-            </w:r>
-          </w:p>
-        </w:tc>
-      </w:tr>
-      <w:tr>
-        <w:tc>
-          <w:tcPr>
-            <w:tcW w:type="dxa" w:w="1725"/>
-          </w:tcPr>
-          <w:p>
-            <w:pPr>
-              <w:jc w:val="left"/>
-            </w:pPr>
-            <w:r>
-              <w:rPr>
-                <w:sz w:val="20"/>
-              </w:rPr>
-              <w:t>2025-09-11</w:t>
-            </w:r>
-          </w:p>
-        </w:tc>
-        <w:tc>
-          <w:tcPr>
-            <w:tcW w:type="dxa" w:w="1727"/>
-          </w:tcPr>
-          <w:p>
-            <w:pPr>
-              <w:jc w:val="left"/>
-            </w:pPr>
-            <w:r>
-              <w:rPr>
-                <w:sz w:val="20"/>
-              </w:rPr>
-              <w:t>Final Presentation &amp; Project Submission</w:t>
-            </w:r>
-          </w:p>
-        </w:tc>
-        <w:tc>
-          <w:tcPr>
-            <w:tcW w:type="dxa" w:w="1726"/>
-          </w:tcPr>
-          <w:p>
-            <w:pPr>
-              <w:jc w:val="left"/>
-            </w:pPr>
-            <w:r>
-              <w:rPr>
-                <w:sz w:val="20"/>
-              </w:rPr>
-              <w:t>5</w:t>
-            </w:r>
-          </w:p>
-        </w:tc>
-        <w:tc>
-          <w:tcPr>
-            <w:tcW w:type="dxa" w:w="1726"/>
-          </w:tcPr>
-          <w:p>
-            <w:pPr>
-              <w:jc w:val="left"/>
-            </w:pPr>
-            <w:r>
-              <w:rPr>
-                <w:sz w:val="20"/>
-              </w:rPr>
-              <w:t>All Team</w:t>
-            </w:r>
-          </w:p>
-        </w:tc>
-        <w:tc>
-          <w:tcPr>
-            <w:tcW w:type="dxa" w:w="1726"/>
-          </w:tcPr>
-          <w:p>
-            <w:pPr>
-              <w:jc w:val="left"/>
-            </w:pPr>
-            <w:r>
-              <w:rPr>
-                <w:sz w:val="20"/>
-              </w:rPr>
-              <w:t>Live demo delivered to instructor; project artefacts submitted</w:t>
-            </w:r>
-          </w:p>
-        </w:tc>
-      </w:tr>
-      <w:tr>
-        <w:tc>
-          <w:tcPr>
-            <w:tcW w:type="dxa" w:w="1725"/>
-          </w:tcPr>
-          <w:p>
-            <w:pPr>
-              <w:jc w:val="left"/>
-            </w:pPr>
-            <w:r>
-              <w:rPr>
-                <w:sz w:val="20"/>
-              </w:rPr>
-              <w:t>2025-09-14</w:t>
-            </w:r>
-          </w:p>
-        </w:tc>
-        <w:tc>
-          <w:tcPr>
-            <w:tcW w:type="dxa" w:w="1727"/>
-          </w:tcPr>
-          <w:p>
-            <w:pPr>
-              <w:jc w:val="left"/>
-            </w:pPr>
-            <w:r>
-              <w:rPr>
-                <w:sz w:val="20"/>
-              </w:rPr>
-              <w:t>Post-delivery retrospective</w:t>
-            </w:r>
-          </w:p>
-        </w:tc>
-        <w:tc>
-          <w:tcPr>
-            <w:tcW w:type="dxa" w:w="1726"/>
-          </w:tcPr>
-          <w:p>
-            <w:pPr>
-              <w:jc w:val="left"/>
-            </w:pPr>
-            <w:r>
-              <w:rPr>
-                <w:sz w:val="20"/>
-              </w:rPr>
-              <w:t>2</w:t>
-            </w:r>
-          </w:p>
-        </w:tc>
-        <w:tc>
-          <w:tcPr>
-            <w:tcW w:type="dxa" w:w="1726"/>
-          </w:tcPr>
-          <w:p>
-            <w:pPr>
-              <w:jc w:val="left"/>
-            </w:pPr>
-            <w:r>
-              <w:rPr>
-                <w:sz w:val="20"/>
-              </w:rPr>
-              <w:t>All Team (Lead: Kael Payette)</w:t>
-            </w:r>
-          </w:p>
-        </w:tc>
-        <w:tc>
-          <w:tcPr>
-            <w:tcW w:type="dxa" w:w="1726"/>
-          </w:tcPr>
-          <w:p>
-            <w:pPr>
-              <w:jc w:val="left"/>
-            </w:pPr>
-            <w:r>
-              <w:rPr>
-                <w:sz w:val="20"/>
-              </w:rPr>
-              <w:t>Lessons-learned session; backlog of enhancements documented</w:t>
-            </w:r>
-          </w:p>
-        </w:tc>
-      </w:tr>
-      <w:tr>
-        <w:tc>
-          <w:tcPr>
-            <w:tcW w:type="dxa" w:w="1725"/>
-          </w:tcPr>
-          <w:p>
-            <w:pPr>
-              <w:jc w:val="left"/>
-            </w:pPr>
-            <w:r>
-              <w:rPr>
-                <w:sz w:val="20"/>
-              </w:rPr>
-              <w:t>2025-10-02</w:t>
-            </w:r>
-          </w:p>
-        </w:tc>
-        <w:tc>
-          <w:tcPr>
-            <w:tcW w:type="dxa" w:w="1727"/>
-          </w:tcPr>
-          <w:p>
-            <w:pPr>
-              <w:jc w:val="left"/>
-            </w:pPr>
-            <w:r>
-              <w:rPr>
-                <w:sz w:val="20"/>
-              </w:rPr>
-              <w:t>Post-delivery: scenario content expansion – JSON docs</w:t>
-            </w:r>
-          </w:p>
-        </w:tc>
-        <w:tc>
-          <w:tcPr>
-            <w:tcW w:type="dxa" w:w="1726"/>
-          </w:tcPr>
-          <w:p>
-            <w:pPr>
-              <w:jc w:val="left"/>
-            </w:pPr>
-            <w:r>
-              <w:rPr>
-                <w:sz w:val="20"/>
-              </w:rPr>
-              <w:t>6</w:t>
-            </w:r>
-          </w:p>
-        </w:tc>
-        <w:tc>
-          <w:tcPr>
-            <w:tcW w:type="dxa" w:w="1726"/>
-          </w:tcPr>
-          <w:p>
-            <w:pPr>
-              <w:jc w:val="left"/>
-            </w:pPr>
-            <w:r>
-              <w:rPr>
-                <w:sz w:val="20"/>
-              </w:rPr>
-              <w:t>John Hay</w:t>
-            </w:r>
-          </w:p>
-        </w:tc>
-        <w:tc>
-          <w:tcPr>
-            <w:tcW w:type="dxa" w:w="1726"/>
-          </w:tcPr>
-          <w:p>
-            <w:pPr>
-              <w:jc w:val="left"/>
-            </w:pPr>
-            <w:r>
-              <w:rPr>
-                <w:sz w:val="20"/>
-              </w:rPr>
-              <w:t>Expanded and refined scenario decision-tree documents for JSON directory</w:t>
-            </w:r>
-          </w:p>
-        </w:tc>
-      </w:tr>
-      <w:tr>
-        <w:tc>
-          <w:tcPr>
-            <w:tcW w:type="dxa" w:w="1725"/>
-          </w:tcPr>
-          <w:p>
-            <w:pPr>
-              <w:jc w:val="left"/>
-            </w:pPr>
-            <w:r>
-              <w:rPr>
-                <w:sz w:val="20"/>
-              </w:rPr>
-              <w:t>2025-10-15</w:t>
-            </w:r>
-          </w:p>
-        </w:tc>
-        <w:tc>
-          <w:tcPr>
-            <w:tcW w:type="dxa" w:w="1727"/>
-          </w:tcPr>
-          <w:p>
-            <w:pPr>
-              <w:jc w:val="left"/>
-            </w:pPr>
-            <w:r>
-              <w:rPr>
-                <w:sz w:val="20"/>
-              </w:rPr>
-              <w:t>Post-delivery: backend security hardening</w:t>
+              <w:t>Law Enforcement Expansion &amp; Answer Randomization (PRs #105–112, #106, #114)</w:t>
             </w:r>
           </w:p>
         </w:tc>
@@ -3119,7 +2237,7 @@
               <w:rPr>
                 <w:sz w:val="20"/>
               </w:rPr>
-              <w:t>Auth middleware review; rate limiting; security config tightening</w:t>
+              <w:t>Mental health/crisis intervention; Indigenous/remote policing; public disorder; drugs/organized crime; search/arrest; Charter/legal; domestic/family; youth/school/cybercrime; emergency/disaster; officer safety; post-incident/investigative; education scenarios; answer order randomized on each node</w:t>
             </w:r>
           </w:p>
         </w:tc>
@@ -3137,7 +2255,7 @@
               <w:rPr>
                 <w:sz w:val="20"/>
               </w:rPr>
-              <w:t>2025-11-10</w:t>
+              <w:t>2026-04-10</w:t>
             </w:r>
           </w:p>
         </w:tc>
@@ -3153,335 +2271,7 @@
               <w:rPr>
                 <w:sz w:val="20"/>
               </w:rPr>
-              <w:t>Post-delivery: frontend UI polish</w:t>
-            </w:r>
-          </w:p>
-        </w:tc>
-        <w:tc>
-          <w:tcPr>
-            <w:tcW w:type="dxa" w:w="1726"/>
-          </w:tcPr>
-          <w:p>
-            <w:pPr>
-              <w:jc w:val="left"/>
-            </w:pPr>
-            <w:r>
-              <w:rPr>
-                <w:sz w:val="20"/>
-              </w:rPr>
-              <w:t>4</w:t>
-            </w:r>
-          </w:p>
-        </w:tc>
-        <w:tc>
-          <w:tcPr>
-            <w:tcW w:type="dxa" w:w="1726"/>
-          </w:tcPr>
-          <w:p>
-            <w:pPr>
-              <w:jc w:val="left"/>
-            </w:pPr>
-            <w:r>
-              <w:rPr>
-                <w:sz w:val="20"/>
-              </w:rPr>
-              <w:t>Leo Wasiliew</w:t>
-            </w:r>
-          </w:p>
-        </w:tc>
-        <w:tc>
-          <w:tcPr>
-            <w:tcW w:type="dxa" w:w="1726"/>
-          </w:tcPr>
-          <w:p>
-            <w:pPr>
-              <w:jc w:val="left"/>
-            </w:pPr>
-            <w:r>
-              <w:rPr>
-                <w:sz w:val="20"/>
-              </w:rPr>
-              <w:t>UI refinements; component accessibility improvements; CSS clean-up</w:t>
-            </w:r>
-          </w:p>
-        </w:tc>
-      </w:tr>
-      <w:tr>
-        <w:tc>
-          <w:tcPr>
-            <w:tcW w:type="dxa" w:w="1725"/>
-          </w:tcPr>
-          <w:p>
-            <w:pPr>
-              <w:jc w:val="left"/>
-            </w:pPr>
-            <w:r>
-              <w:rPr>
-                <w:sz w:val="20"/>
-              </w:rPr>
-              <w:t>2025-12-05</w:t>
-            </w:r>
-          </w:p>
-        </w:tc>
-        <w:tc>
-          <w:tcPr>
-            <w:tcW w:type="dxa" w:w="1727"/>
-          </w:tcPr>
-          <w:p>
-            <w:pPr>
-              <w:jc w:val="left"/>
-            </w:pPr>
-            <w:r>
-              <w:rPr>
-                <w:sz w:val="20"/>
-              </w:rPr>
-              <w:t>Post-delivery: additional scenario JSON content</w:t>
-            </w:r>
-          </w:p>
-        </w:tc>
-        <w:tc>
-          <w:tcPr>
-            <w:tcW w:type="dxa" w:w="1726"/>
-          </w:tcPr>
-          <w:p>
-            <w:pPr>
-              <w:jc w:val="left"/>
-            </w:pPr>
-            <w:r>
-              <w:rPr>
-                <w:sz w:val="20"/>
-              </w:rPr>
-              <w:t>8</w:t>
-            </w:r>
-          </w:p>
-        </w:tc>
-        <w:tc>
-          <w:tcPr>
-            <w:tcW w:type="dxa" w:w="1726"/>
-          </w:tcPr>
-          <w:p>
-            <w:pPr>
-              <w:jc w:val="left"/>
-            </w:pPr>
-            <w:r>
-              <w:rPr>
-                <w:sz w:val="20"/>
-              </w:rPr>
-              <w:t>John Hay</w:t>
-            </w:r>
-          </w:p>
-        </w:tc>
-        <w:tc>
-          <w:tcPr>
-            <w:tcW w:type="dxa" w:w="1726"/>
-          </w:tcPr>
-          <w:p>
-            <w:pPr>
-              <w:jc w:val="left"/>
-            </w:pPr>
-            <w:r>
-              <w:rPr>
-                <w:sz w:val="20"/>
-              </w:rPr>
-              <w:t>Additional Medical, Fire, Environmental and Security scenario documents added</w:t>
-            </w:r>
-          </w:p>
-        </w:tc>
-      </w:tr>
-      <w:tr>
-        <w:tc>
-          <w:tcPr>
-            <w:tcW w:type="dxa" w:w="1725"/>
-          </w:tcPr>
-          <w:p>
-            <w:pPr>
-              <w:jc w:val="left"/>
-            </w:pPr>
-            <w:r>
-              <w:rPr>
-                <w:sz w:val="20"/>
-              </w:rPr>
-              <w:t>2026-01-20</w:t>
-            </w:r>
-          </w:p>
-        </w:tc>
-        <w:tc>
-          <w:tcPr>
-            <w:tcW w:type="dxa" w:w="1727"/>
-          </w:tcPr>
-          <w:p>
-            <w:pPr>
-              <w:jc w:val="left"/>
-            </w:pPr>
-            <w:r>
-              <w:rPr>
-                <w:sz w:val="20"/>
-              </w:rPr>
-              <w:t>Repository clean-up &amp; asset organisation</w:t>
-            </w:r>
-          </w:p>
-        </w:tc>
-        <w:tc>
-          <w:tcPr>
-            <w:tcW w:type="dxa" w:w="1726"/>
-          </w:tcPr>
-          <w:p>
-            <w:pPr>
-              <w:jc w:val="left"/>
-            </w:pPr>
-            <w:r>
-              <w:rPr>
-                <w:sz w:val="20"/>
-              </w:rPr>
-              <w:t>3</w:t>
-            </w:r>
-          </w:p>
-        </w:tc>
-        <w:tc>
-          <w:tcPr>
-            <w:tcW w:type="dxa" w:w="1726"/>
-          </w:tcPr>
-          <w:p>
-            <w:pPr>
-              <w:jc w:val="left"/>
-            </w:pPr>
-            <w:r>
-              <w:rPr>
-                <w:sz w:val="20"/>
-              </w:rPr>
-              <w:t>Kael Payette</w:t>
-            </w:r>
-          </w:p>
-        </w:tc>
-        <w:tc>
-          <w:tcPr>
-            <w:tcW w:type="dxa" w:w="1726"/>
-          </w:tcPr>
-          <w:p>
-            <w:pPr>
-              <w:jc w:val="left"/>
-            </w:pPr>
-            <w:r>
-              <w:rPr>
-                <w:sz w:val="20"/>
-              </w:rPr>
-              <w:t>Images and assets organised; repo structure tidied; .gitignore reviewed</w:t>
-            </w:r>
-          </w:p>
-        </w:tc>
-      </w:tr>
-      <w:tr>
-        <w:tc>
-          <w:tcPr>
-            <w:tcW w:type="dxa" w:w="1725"/>
-          </w:tcPr>
-          <w:p>
-            <w:pPr>
-              <w:jc w:val="left"/>
-            </w:pPr>
-            <w:r>
-              <w:rPr>
-                <w:sz w:val="20"/>
-              </w:rPr>
-              <w:t>2026-02-14</w:t>
-            </w:r>
-          </w:p>
-        </w:tc>
-        <w:tc>
-          <w:tcPr>
-            <w:tcW w:type="dxa" w:w="1727"/>
-          </w:tcPr>
-          <w:p>
-            <w:pPr>
-              <w:jc w:val="left"/>
-            </w:pPr>
-            <w:r>
-              <w:rPr>
-                <w:sz w:val="20"/>
-              </w:rPr>
-              <w:t>Documentation review &amp; updates</w:t>
-            </w:r>
-          </w:p>
-        </w:tc>
-        <w:tc>
-          <w:tcPr>
-            <w:tcW w:type="dxa" w:w="1726"/>
-          </w:tcPr>
-          <w:p>
-            <w:pPr>
-              <w:jc w:val="left"/>
-            </w:pPr>
-            <w:r>
-              <w:rPr>
-                <w:sz w:val="20"/>
-              </w:rPr>
-              <w:t>4</w:t>
-            </w:r>
-          </w:p>
-        </w:tc>
-        <w:tc>
-          <w:tcPr>
-            <w:tcW w:type="dxa" w:w="1726"/>
-          </w:tcPr>
-          <w:p>
-            <w:pPr>
-              <w:jc w:val="left"/>
-            </w:pPr>
-            <w:r>
-              <w:rPr>
-                <w:sz w:val="20"/>
-              </w:rPr>
-              <w:t>All Team</w:t>
-            </w:r>
-          </w:p>
-        </w:tc>
-        <w:tc>
-          <w:tcPr>
-            <w:tcW w:type="dxa" w:w="1726"/>
-          </w:tcPr>
-          <w:p>
-            <w:pPr>
-              <w:jc w:val="left"/>
-            </w:pPr>
-            <w:r>
-              <w:rPr>
-                <w:sz w:val="20"/>
-              </w:rPr>
-              <w:t>Reviewed and updated all documentation to reflect post-delivery changes</w:t>
-            </w:r>
-          </w:p>
-        </w:tc>
-      </w:tr>
-      <w:tr>
-        <w:tc>
-          <w:tcPr>
-            <w:tcW w:type="dxa" w:w="1725"/>
-          </w:tcPr>
-          <w:p>
-            <w:pPr>
-              <w:jc w:val="left"/>
-            </w:pPr>
-            <w:r>
-              <w:rPr>
-                <w:sz w:val="20"/>
-              </w:rPr>
-              <w:t>2026-03-15</w:t>
-            </w:r>
-          </w:p>
-        </w:tc>
-        <w:tc>
-          <w:tcPr>
-            <w:tcW w:type="dxa" w:w="1727"/>
-          </w:tcPr>
-          <w:p>
-            <w:pPr>
-              <w:jc w:val="left"/>
-            </w:pPr>
-            <w:r>
-              <w:rPr>
-                <w:sz w:val="20"/>
-              </w:rPr>
-              <w:t>Project time log compilation &amp; submission</w:t>
+              <w:t>Final Self-Reflection Report – Create &amp; Correct (PRs #116–117)</w:t>
             </w:r>
           </w:p>
         </w:tc>
@@ -3513,7 +2303,7 @@
               <w:rPr>
                 <w:sz w:val="20"/>
               </w:rPr>
-              <w:t>All Team</w:t>
+              <w:t>Tom Burchell</w:t>
             </w:r>
           </w:p>
         </w:tc>
@@ -3529,7 +2319,7 @@
               <w:rPr>
                 <w:sz w:val="20"/>
               </w:rPr>
-              <w:t>Project time logs compiled from Gantt and project records; template filled and submitted</w:t>
+              <w:t>SIRE_FinalSelfReflection_TomBurchell.docx created; factual inaccuracies corrected in Socket.IO event names, session creation flow, trainee join flow, and scoring description</w:t>
             </w:r>
           </w:p>
         </w:tc>

</xml_diff>